<commit_message>
chore: Modification du rapport de chat avec Copilot
</commit_message>
<xml_diff>
--- a/Rapport du travail avec Copilot.docx
+++ b/Rapport du travail avec Copilot.docx
@@ -18,6 +18,58 @@
     </w:p>
     <w:p>
       <w:pPr>
+        <w:rPr>
+          <w:b/>
+          <w:bCs/>
+        </w:rPr>
+      </w:pPr>
+    </w:p>
+    <w:p>
+      <w:pPr>
+        <w:rPr>
+          <w:i/>
+          <w:iCs/>
+        </w:rPr>
+      </w:pPr>
+      <w:r>
+        <w:rPr>
+          <w:b/>
+          <w:bCs/>
+        </w:rPr>
+        <w:t>Titre</w:t>
+      </w:r>
+      <w:r>
+        <w:t xml:space="preserve"> : </w:t>
+      </w:r>
+      <w:r>
+        <w:rPr>
+          <w:i/>
+          <w:iCs/>
+        </w:rPr>
+        <w:t>Découpler fonctionnalités Google selon SOLID</w:t>
+      </w:r>
+    </w:p>
+    <w:p>
+      <w:r>
+        <w:rPr>
+          <w:b/>
+          <w:bCs/>
+        </w:rPr>
+        <w:t>Projet</w:t>
+      </w:r>
+      <w:r>
+        <w:t xml:space="preserve"> : </w:t>
+      </w:r>
+      <w:r>
+        <w:rPr>
+          <w:u w:val="single"/>
+        </w:rPr>
+        <w:t>C:\Users\Gardien\Documents\WSL\Ubuntu-base-23\http-server\www\ytb-deluxe-client-server\mvp-v1.5\ytb-deluxe-1.5-node-js</w:t>
+      </w:r>
+    </w:p>
+    <w:p/>
+    <w:p>
+      <w:pPr>
         <w:pStyle w:val="Titre1"/>
         <w:numPr>
           <w:ilvl w:val="0"/>
@@ -25,10 +77,7 @@
         </w:numPr>
       </w:pPr>
       <w:r>
-        <w:t>D</w:t>
-      </w:r>
-      <w:r>
-        <w:t>écoupler les fonctionnalités google dans un module séparé, selon les bonnes pratiques SOLID</w:t>
+        <w:t>Découpler les fonctionnalités google dans un module séparé, selon les bonnes pratiques SOLID</w:t>
       </w:r>
     </w:p>
     <w:p/>
@@ -37,12 +86,10 @@
         <w:pStyle w:val="Titre4"/>
       </w:pPr>
       <w:proofErr w:type="spellStart"/>
-      <w:proofErr w:type="gramStart"/>
       <w:r>
         <w:t>Peux tu</w:t>
       </w:r>
       <w:proofErr w:type="spellEnd"/>
-      <w:proofErr w:type="gramEnd"/>
       <w:r>
         <w:t>, dans un dossier judicieux selon la normalisation concernant ce type de bibliothèque ?</w:t>
       </w:r>
@@ -169,6 +216,7 @@
           <w:b/>
           <w:bCs/>
         </w:rPr>
+        <w:lastRenderedPageBreak/>
         <w:t>Ce qui a été séparé</w:t>
       </w:r>
     </w:p>
@@ -179,13 +227,8 @@
           <w:numId w:val="2"/>
         </w:numPr>
       </w:pPr>
-      <w:proofErr w:type="gramStart"/>
-      <w:r>
-        <w:t>initialisation</w:t>
-      </w:r>
-      <w:proofErr w:type="gramEnd"/>
-      <w:r>
-        <w:t xml:space="preserve"> du client OAuth2</w:t>
+      <w:r>
+        <w:t>initialisation du client OAuth2</w:t>
       </w:r>
     </w:p>
     <w:p>
@@ -195,13 +238,8 @@
           <w:numId w:val="2"/>
         </w:numPr>
       </w:pPr>
-      <w:proofErr w:type="gramStart"/>
-      <w:r>
-        <w:t>génération</w:t>
-      </w:r>
-      <w:proofErr w:type="gramEnd"/>
-      <w:r>
-        <w:t xml:space="preserve"> de l’URL d’autorisation</w:t>
+      <w:r>
+        <w:t>génération de l’URL d’autorisation</w:t>
       </w:r>
     </w:p>
     <w:p>
@@ -211,13 +249,8 @@
           <w:numId w:val="2"/>
         </w:numPr>
       </w:pPr>
-      <w:proofErr w:type="gramStart"/>
-      <w:r>
-        <w:t>traitement</w:t>
-      </w:r>
-      <w:proofErr w:type="gramEnd"/>
-      <w:r>
-        <w:t xml:space="preserve"> du callback OAuth</w:t>
+      <w:r>
+        <w:t>traitement du callback OAuth</w:t>
       </w:r>
     </w:p>
     <w:p>
@@ -227,13 +260,8 @@
           <w:numId w:val="2"/>
         </w:numPr>
       </w:pPr>
-      <w:proofErr w:type="gramStart"/>
-      <w:r>
-        <w:t>échange</w:t>
-      </w:r>
-      <w:proofErr w:type="gramEnd"/>
-      <w:r>
-        <w:t xml:space="preserve"> du code contre des </w:t>
+      <w:r>
+        <w:t xml:space="preserve">échange du code contre des </w:t>
       </w:r>
       <w:proofErr w:type="spellStart"/>
       <w:r>
@@ -248,14 +276,8 @@
           <w:numId w:val="2"/>
         </w:numPr>
       </w:pPr>
-      <w:proofErr w:type="gramStart"/>
-      <w:r>
-        <w:lastRenderedPageBreak/>
-        <w:t>révocation</w:t>
-      </w:r>
-      <w:proofErr w:type="gramEnd"/>
-      <w:r>
-        <w:t xml:space="preserve"> du </w:t>
+      <w:r>
+        <w:t xml:space="preserve">révocation du </w:t>
       </w:r>
       <w:proofErr w:type="spellStart"/>
       <w:r>
@@ -270,13 +292,8 @@
           <w:numId w:val="2"/>
         </w:numPr>
       </w:pPr>
-      <w:proofErr w:type="gramStart"/>
-      <w:r>
-        <w:t>appel</w:t>
-      </w:r>
-      <w:proofErr w:type="gramEnd"/>
-      <w:r>
-        <w:t xml:space="preserve"> YouTube playlist</w:t>
+      <w:r>
+        <w:t>appel YouTube playlist</w:t>
       </w:r>
     </w:p>
     <w:p>
@@ -471,7 +488,6 @@
         </w:rPr>
       </w:pPr>
       <w:proofErr w:type="spellStart"/>
-      <w:proofErr w:type="gramStart"/>
       <w:r>
         <w:rPr>
           <w:rFonts w:ascii="MesloLGM Nerd Font Mono" w:eastAsia="Times New Roman" w:hAnsi="MesloLGM Nerd Font Mono" w:cs="MesloLGM Nerd Font Mono"/>
@@ -485,7 +501,6 @@
         <w:t>const</w:t>
       </w:r>
       <w:proofErr w:type="spellEnd"/>
-      <w:proofErr w:type="gramEnd"/>
       <w:r>
         <w:rPr>
           <w:rFonts w:ascii="MesloLGM Nerd Font Mono" w:eastAsia="Times New Roman" w:hAnsi="MesloLGM Nerd Font Mono" w:cs="MesloLGM Nerd Font Mono"/>
@@ -496,9 +511,22 @@
           <w:lang w:eastAsia="fr-FR"/>
           <w14:ligatures w14:val="none"/>
         </w:rPr>
-        <w:t xml:space="preserve"> </w:t>
-      </w:r>
-      <w:proofErr w:type="gramStart"/>
+        <w:t xml:space="preserve"> { </w:t>
+      </w:r>
+      <w:proofErr w:type="spellStart"/>
+      <w:r>
+        <w:rPr>
+          <w:rFonts w:ascii="MesloLGM Nerd Font Mono" w:eastAsia="Times New Roman" w:hAnsi="MesloLGM Nerd Font Mono" w:cs="MesloLGM Nerd Font Mono"/>
+          <w:color w:val="4FC1FF"/>
+          <w:kern w:val="0"/>
+          <w:sz w:val="21"/>
+          <w:szCs w:val="21"/>
+          <w:lang w:eastAsia="fr-FR"/>
+          <w14:ligatures w14:val="none"/>
+        </w:rPr>
+        <w:t>GoogleService</w:t>
+      </w:r>
+      <w:proofErr w:type="spellEnd"/>
       <w:r>
         <w:rPr>
           <w:rFonts w:ascii="MesloLGM Nerd Font Mono" w:eastAsia="Times New Roman" w:hAnsi="MesloLGM Nerd Font Mono" w:cs="MesloLGM Nerd Font Mono"/>
@@ -509,7 +537,129 @@
           <w:lang w:eastAsia="fr-FR"/>
           <w14:ligatures w14:val="none"/>
         </w:rPr>
-        <w:t xml:space="preserve">{ </w:t>
+        <w:t xml:space="preserve"> } = </w:t>
+      </w:r>
+      <w:proofErr w:type="spellStart"/>
+      <w:r>
+        <w:rPr>
+          <w:rFonts w:ascii="MesloLGM Nerd Font Mono" w:eastAsia="Times New Roman" w:hAnsi="MesloLGM Nerd Font Mono" w:cs="MesloLGM Nerd Font Mono"/>
+          <w:color w:val="DCDCAA"/>
+          <w:kern w:val="0"/>
+          <w:sz w:val="21"/>
+          <w:szCs w:val="21"/>
+          <w:lang w:eastAsia="fr-FR"/>
+          <w14:ligatures w14:val="none"/>
+        </w:rPr>
+        <w:t>require</w:t>
+      </w:r>
+      <w:proofErr w:type="spellEnd"/>
+      <w:r>
+        <w:rPr>
+          <w:rFonts w:ascii="MesloLGM Nerd Font Mono" w:eastAsia="Times New Roman" w:hAnsi="MesloLGM Nerd Font Mono" w:cs="MesloLGM Nerd Font Mono"/>
+          <w:color w:val="D4D4D4"/>
+          <w:kern w:val="0"/>
+          <w:sz w:val="21"/>
+          <w:szCs w:val="21"/>
+          <w:lang w:eastAsia="fr-FR"/>
+          <w14:ligatures w14:val="none"/>
+        </w:rPr>
+        <w:t>(</w:t>
+      </w:r>
+      <w:r>
+        <w:rPr>
+          <w:rFonts w:ascii="MesloLGM Nerd Font Mono" w:eastAsia="Times New Roman" w:hAnsi="MesloLGM Nerd Font Mono" w:cs="MesloLGM Nerd Font Mono"/>
+          <w:color w:val="CE9178"/>
+          <w:kern w:val="0"/>
+          <w:sz w:val="21"/>
+          <w:szCs w:val="21"/>
+          <w:lang w:eastAsia="fr-FR"/>
+          <w14:ligatures w14:val="none"/>
+        </w:rPr>
+        <w:t>'../services/</w:t>
+      </w:r>
+      <w:proofErr w:type="spellStart"/>
+      <w:r>
+        <w:rPr>
+          <w:rFonts w:ascii="MesloLGM Nerd Font Mono" w:eastAsia="Times New Roman" w:hAnsi="MesloLGM Nerd Font Mono" w:cs="MesloLGM Nerd Font Mono"/>
+          <w:color w:val="CE9178"/>
+          <w:kern w:val="0"/>
+          <w:sz w:val="21"/>
+          <w:szCs w:val="21"/>
+          <w:lang w:eastAsia="fr-FR"/>
+          <w14:ligatures w14:val="none"/>
+        </w:rPr>
+        <w:t>google.service</w:t>
+      </w:r>
+      <w:proofErr w:type="spellEnd"/>
+      <w:r>
+        <w:rPr>
+          <w:rFonts w:ascii="MesloLGM Nerd Font Mono" w:eastAsia="Times New Roman" w:hAnsi="MesloLGM Nerd Font Mono" w:cs="MesloLGM Nerd Font Mono"/>
+          <w:color w:val="CE9178"/>
+          <w:kern w:val="0"/>
+          <w:sz w:val="21"/>
+          <w:szCs w:val="21"/>
+          <w:lang w:eastAsia="fr-FR"/>
+          <w14:ligatures w14:val="none"/>
+        </w:rPr>
+        <w:t>'</w:t>
+      </w:r>
+      <w:r>
+        <w:rPr>
+          <w:rFonts w:ascii="MesloLGM Nerd Font Mono" w:eastAsia="Times New Roman" w:hAnsi="MesloLGM Nerd Font Mono" w:cs="MesloLGM Nerd Font Mono"/>
+          <w:color w:val="D4D4D4"/>
+          <w:kern w:val="0"/>
+          <w:sz w:val="21"/>
+          <w:szCs w:val="21"/>
+          <w:lang w:eastAsia="fr-FR"/>
+          <w14:ligatures w14:val="none"/>
+        </w:rPr>
+        <w:t>);</w:t>
+      </w:r>
+    </w:p>
+    <w:p>
+      <w:pPr>
+        <w:pStyle w:val="Paragraphedeliste"/>
+        <w:numPr>
+          <w:ilvl w:val="0"/>
+          <w:numId w:val="6"/>
+        </w:numPr>
+        <w:shd w:val="clear" w:color="auto" w:fill="1E1E1E"/>
+        <w:spacing w:after="0" w:line="300" w:lineRule="atLeast"/>
+        <w:rPr>
+          <w:rFonts w:ascii="MesloLGM Nerd Font Mono" w:eastAsia="Times New Roman" w:hAnsi="MesloLGM Nerd Font Mono" w:cs="MesloLGM Nerd Font Mono"/>
+          <w:color w:val="D4D4D4"/>
+          <w:kern w:val="0"/>
+          <w:sz w:val="21"/>
+          <w:szCs w:val="21"/>
+          <w:lang w:eastAsia="fr-FR"/>
+          <w14:ligatures w14:val="none"/>
+        </w:rPr>
+      </w:pPr>
+      <w:proofErr w:type="spellStart"/>
+      <w:r>
+        <w:rPr>
+          <w:rFonts w:ascii="MesloLGM Nerd Font Mono" w:eastAsia="Times New Roman" w:hAnsi="MesloLGM Nerd Font Mono" w:cs="MesloLGM Nerd Font Mono"/>
+          <w:color w:val="569CD6"/>
+          <w:kern w:val="0"/>
+          <w:sz w:val="21"/>
+          <w:szCs w:val="21"/>
+          <w:lang w:eastAsia="fr-FR"/>
+          <w14:ligatures w14:val="none"/>
+        </w:rPr>
+        <w:t>const</w:t>
+      </w:r>
+      <w:proofErr w:type="spellEnd"/>
+      <w:r>
+        <w:rPr>
+          <w:rFonts w:ascii="MesloLGM Nerd Font Mono" w:eastAsia="Times New Roman" w:hAnsi="MesloLGM Nerd Font Mono" w:cs="MesloLGM Nerd Font Mono"/>
+          <w:color w:val="D4D4D4"/>
+          <w:kern w:val="0"/>
+          <w:sz w:val="21"/>
+          <w:szCs w:val="21"/>
+          <w:lang w:eastAsia="fr-FR"/>
+          <w14:ligatures w14:val="none"/>
+        </w:rPr>
+        <w:t xml:space="preserve"> </w:t>
       </w:r>
       <w:proofErr w:type="spellStart"/>
       <w:r>
@@ -522,10 +672,9 @@
           <w:lang w:eastAsia="fr-FR"/>
           <w14:ligatures w14:val="none"/>
         </w:rPr>
-        <w:t>GoogleService</w:t>
+        <w:t>googleService</w:t>
       </w:r>
       <w:proofErr w:type="spellEnd"/>
-      <w:proofErr w:type="gramEnd"/>
       <w:r>
         <w:rPr>
           <w:rFonts w:ascii="MesloLGM Nerd Font Mono" w:eastAsia="Times New Roman" w:hAnsi="MesloLGM Nerd Font Mono" w:cs="MesloLGM Nerd Font Mono"/>
@@ -536,7 +685,31 @@
           <w:lang w:eastAsia="fr-FR"/>
           <w14:ligatures w14:val="none"/>
         </w:rPr>
-        <w:t xml:space="preserve"> } = </w:t>
+        <w:t xml:space="preserve"> = </w:t>
+      </w:r>
+      <w:r>
+        <w:rPr>
+          <w:rFonts w:ascii="MesloLGM Nerd Font Mono" w:eastAsia="Times New Roman" w:hAnsi="MesloLGM Nerd Font Mono" w:cs="MesloLGM Nerd Font Mono"/>
+          <w:color w:val="569CD6"/>
+          <w:kern w:val="0"/>
+          <w:sz w:val="21"/>
+          <w:szCs w:val="21"/>
+          <w:lang w:eastAsia="fr-FR"/>
+          <w14:ligatures w14:val="none"/>
+        </w:rPr>
+        <w:t>new</w:t>
+      </w:r>
+      <w:r>
+        <w:rPr>
+          <w:rFonts w:ascii="MesloLGM Nerd Font Mono" w:eastAsia="Times New Roman" w:hAnsi="MesloLGM Nerd Font Mono" w:cs="MesloLGM Nerd Font Mono"/>
+          <w:color w:val="D4D4D4"/>
+          <w:kern w:val="0"/>
+          <w:sz w:val="21"/>
+          <w:szCs w:val="21"/>
+          <w:lang w:eastAsia="fr-FR"/>
+          <w14:ligatures w14:val="none"/>
+        </w:rPr>
+        <w:t xml:space="preserve"> </w:t>
       </w:r>
       <w:proofErr w:type="spellStart"/>
       <w:r>
@@ -549,7 +722,7 @@
           <w:lang w:eastAsia="fr-FR"/>
           <w14:ligatures w14:val="none"/>
         </w:rPr>
-        <w:t>require</w:t>
+        <w:t>GoogleService</w:t>
       </w:r>
       <w:proofErr w:type="spellEnd"/>
       <w:r>
@@ -562,47 +735,405 @@
           <w:lang w:eastAsia="fr-FR"/>
           <w14:ligatures w14:val="none"/>
         </w:rPr>
-        <w:t>(</w:t>
-      </w:r>
-      <w:r>
+        <w:t>();</w:t>
+      </w:r>
+    </w:p>
+    <w:p>
+      <w:pPr>
+        <w:rPr>
+          <w:b/>
+          <w:bCs/>
+        </w:rPr>
+      </w:pPr>
+      <w:r>
+        <w:rPr>
+          <w:b/>
+          <w:bCs/>
+        </w:rPr>
+        <w:t>2. Initialiser le client OAuth</w:t>
+      </w:r>
+    </w:p>
+    <w:p>
+      <w:r>
+        <w:lastRenderedPageBreak/>
+        <w:t>Avant d’utiliser les routes Google, il faut initialiser le client :</w:t>
+      </w:r>
+    </w:p>
+    <w:p>
+      <w:pPr>
+        <w:pStyle w:val="Paragraphedeliste"/>
+        <w:numPr>
+          <w:ilvl w:val="0"/>
+          <w:numId w:val="7"/>
+        </w:numPr>
+        <w:shd w:val="clear" w:color="auto" w:fill="1E1E1E"/>
+        <w:spacing w:after="0" w:line="300" w:lineRule="atLeast"/>
         <w:rPr>
           <w:rFonts w:ascii="MesloLGM Nerd Font Mono" w:eastAsia="Times New Roman" w:hAnsi="MesloLGM Nerd Font Mono" w:cs="MesloLGM Nerd Font Mono"/>
-          <w:color w:val="CE9178"/>
+          <w:color w:val="D4D4D4"/>
           <w:kern w:val="0"/>
           <w:sz w:val="21"/>
           <w:szCs w:val="21"/>
-          <w:lang w:eastAsia="fr-FR"/>
+          <w:lang w:val="en-US" w:eastAsia="fr-FR"/>
           <w14:ligatures w14:val="none"/>
         </w:rPr>
-        <w:t>'../services/</w:t>
-      </w:r>
-      <w:proofErr w:type="spellStart"/>
+      </w:pPr>
       <w:r>
         <w:rPr>
           <w:rFonts w:ascii="MesloLGM Nerd Font Mono" w:eastAsia="Times New Roman" w:hAnsi="MesloLGM Nerd Font Mono" w:cs="MesloLGM Nerd Font Mono"/>
-          <w:color w:val="CE9178"/>
+          <w:color w:val="9CDCFE"/>
           <w:kern w:val="0"/>
           <w:sz w:val="21"/>
           <w:szCs w:val="21"/>
-          <w:lang w:eastAsia="fr-FR"/>
+          <w:lang w:val="en-US" w:eastAsia="fr-FR"/>
           <w14:ligatures w14:val="none"/>
         </w:rPr>
-        <w:t>google.service</w:t>
-      </w:r>
-      <w:proofErr w:type="spellEnd"/>
+        <w:t>googleService</w:t>
+      </w:r>
       <w:r>
         <w:rPr>
           <w:rFonts w:ascii="MesloLGM Nerd Font Mono" w:eastAsia="Times New Roman" w:hAnsi="MesloLGM Nerd Font Mono" w:cs="MesloLGM Nerd Font Mono"/>
-          <w:color w:val="CE9178"/>
+          <w:color w:val="D4D4D4"/>
           <w:kern w:val="0"/>
           <w:sz w:val="21"/>
           <w:szCs w:val="21"/>
-          <w:lang w:eastAsia="fr-FR"/>
+          <w:lang w:val="en-US" w:eastAsia="fr-FR"/>
           <w14:ligatures w14:val="none"/>
         </w:rPr>
-        <w:t>'</w:t>
-      </w:r>
-      <w:proofErr w:type="gramStart"/>
+        <w:t>.</w:t>
+      </w:r>
+      <w:r>
+        <w:rPr>
+          <w:rFonts w:ascii="MesloLGM Nerd Font Mono" w:eastAsia="Times New Roman" w:hAnsi="MesloLGM Nerd Font Mono" w:cs="MesloLGM Nerd Font Mono"/>
+          <w:color w:val="DCDCAA"/>
+          <w:kern w:val="0"/>
+          <w:sz w:val="21"/>
+          <w:szCs w:val="21"/>
+          <w:lang w:val="en-US" w:eastAsia="fr-FR"/>
+          <w14:ligatures w14:val="none"/>
+        </w:rPr>
+        <w:t>initOAuth2Client</w:t>
+      </w:r>
+      <w:r>
+        <w:rPr>
+          <w:rFonts w:ascii="MesloLGM Nerd Font Mono" w:eastAsia="Times New Roman" w:hAnsi="MesloLGM Nerd Font Mono" w:cs="MesloLGM Nerd Font Mono"/>
+          <w:color w:val="D4D4D4"/>
+          <w:kern w:val="0"/>
+          <w:sz w:val="21"/>
+          <w:szCs w:val="21"/>
+          <w:lang w:val="en-US" w:eastAsia="fr-FR"/>
+          <w14:ligatures w14:val="none"/>
+        </w:rPr>
+        <w:t>(</w:t>
+      </w:r>
+      <w:r>
+        <w:rPr>
+          <w:rFonts w:ascii="MesloLGM Nerd Font Mono" w:eastAsia="Times New Roman" w:hAnsi="MesloLGM Nerd Font Mono" w:cs="MesloLGM Nerd Font Mono"/>
+          <w:color w:val="4FC1FF"/>
+          <w:kern w:val="0"/>
+          <w:sz w:val="21"/>
+          <w:szCs w:val="21"/>
+          <w:lang w:val="en-US" w:eastAsia="fr-FR"/>
+          <w14:ligatures w14:val="none"/>
+        </w:rPr>
+        <w:t>LISTENING_PORT</w:t>
+      </w:r>
+      <w:r>
+        <w:rPr>
+          <w:rFonts w:ascii="MesloLGM Nerd Font Mono" w:eastAsia="Times New Roman" w:hAnsi="MesloLGM Nerd Font Mono" w:cs="MesloLGM Nerd Font Mono"/>
+          <w:color w:val="D4D4D4"/>
+          <w:kern w:val="0"/>
+          <w:sz w:val="21"/>
+          <w:szCs w:val="21"/>
+          <w:lang w:val="en-US" w:eastAsia="fr-FR"/>
+          <w14:ligatures w14:val="none"/>
+        </w:rPr>
+        <w:t xml:space="preserve">, </w:t>
+      </w:r>
+      <w:r>
+        <w:rPr>
+          <w:rFonts w:ascii="MesloLGM Nerd Font Mono" w:eastAsia="Times New Roman" w:hAnsi="MesloLGM Nerd Font Mono" w:cs="MesloLGM Nerd Font Mono"/>
+          <w:color w:val="4FC1FF"/>
+          <w:kern w:val="0"/>
+          <w:sz w:val="21"/>
+          <w:szCs w:val="21"/>
+          <w:lang w:val="en-US" w:eastAsia="fr-FR"/>
+          <w14:ligatures w14:val="none"/>
+        </w:rPr>
+        <w:t>REDIRECT_URL_END</w:t>
+      </w:r>
+      <w:r>
+        <w:rPr>
+          <w:rFonts w:ascii="MesloLGM Nerd Font Mono" w:eastAsia="Times New Roman" w:hAnsi="MesloLGM Nerd Font Mono" w:cs="MesloLGM Nerd Font Mono"/>
+          <w:color w:val="D4D4D4"/>
+          <w:kern w:val="0"/>
+          <w:sz w:val="21"/>
+          <w:szCs w:val="21"/>
+          <w:lang w:val="en-US" w:eastAsia="fr-FR"/>
+          <w14:ligatures w14:val="none"/>
+        </w:rPr>
+        <w:t>);</w:t>
+      </w:r>
+    </w:p>
+    <w:p>
+      <w:r>
+        <w:t>C’est ce que fait maintenant le module de routes via :</w:t>
+      </w:r>
+    </w:p>
+    <w:p>
+      <w:pPr>
+        <w:pStyle w:val="Paragraphedeliste"/>
+        <w:numPr>
+          <w:ilvl w:val="0"/>
+          <w:numId w:val="8"/>
+        </w:numPr>
+        <w:shd w:val="clear" w:color="auto" w:fill="1E1E1E"/>
+        <w:spacing w:after="0" w:line="300" w:lineRule="atLeast"/>
+        <w:rPr>
+          <w:rFonts w:ascii="MesloLGM Nerd Font Mono" w:eastAsia="Times New Roman" w:hAnsi="MesloLGM Nerd Font Mono" w:cs="MesloLGM Nerd Font Mono"/>
+          <w:color w:val="D4D4D4"/>
+          <w:kern w:val="0"/>
+          <w:sz w:val="21"/>
+          <w:szCs w:val="21"/>
+          <w:lang w:val="en-US" w:eastAsia="fr-FR"/>
+          <w14:ligatures w14:val="none"/>
+        </w:rPr>
+      </w:pPr>
+      <w:r>
+        <w:rPr>
+          <w:rFonts w:ascii="MesloLGM Nerd Font Mono" w:eastAsia="Times New Roman" w:hAnsi="MesloLGM Nerd Font Mono" w:cs="MesloLGM Nerd Font Mono"/>
+          <w:color w:val="569CD6"/>
+          <w:kern w:val="0"/>
+          <w:sz w:val="21"/>
+          <w:szCs w:val="21"/>
+          <w:lang w:val="en-US" w:eastAsia="fr-FR"/>
+          <w14:ligatures w14:val="none"/>
+        </w:rPr>
+        <w:t>function</w:t>
+      </w:r>
+      <w:r>
+        <w:rPr>
+          <w:rFonts w:ascii="MesloLGM Nerd Font Mono" w:eastAsia="Times New Roman" w:hAnsi="MesloLGM Nerd Font Mono" w:cs="MesloLGM Nerd Font Mono"/>
+          <w:color w:val="D4D4D4"/>
+          <w:kern w:val="0"/>
+          <w:sz w:val="21"/>
+          <w:szCs w:val="21"/>
+          <w:lang w:val="en-US" w:eastAsia="fr-FR"/>
+          <w14:ligatures w14:val="none"/>
+        </w:rPr>
+        <w:t xml:space="preserve"> </w:t>
+      </w:r>
+      <w:r>
+        <w:rPr>
+          <w:rFonts w:ascii="MesloLGM Nerd Font Mono" w:eastAsia="Times New Roman" w:hAnsi="MesloLGM Nerd Font Mono" w:cs="MesloLGM Nerd Font Mono"/>
+          <w:color w:val="DCDCAA"/>
+          <w:kern w:val="0"/>
+          <w:sz w:val="21"/>
+          <w:szCs w:val="21"/>
+          <w:lang w:val="en-US" w:eastAsia="fr-FR"/>
+          <w14:ligatures w14:val="none"/>
+        </w:rPr>
+        <w:t>initOAuth2Client</w:t>
+      </w:r>
+      <w:r>
+        <w:rPr>
+          <w:rFonts w:ascii="MesloLGM Nerd Font Mono" w:eastAsia="Times New Roman" w:hAnsi="MesloLGM Nerd Font Mono" w:cs="MesloLGM Nerd Font Mono"/>
+          <w:color w:val="D4D4D4"/>
+          <w:kern w:val="0"/>
+          <w:sz w:val="21"/>
+          <w:szCs w:val="21"/>
+          <w:lang w:val="en-US" w:eastAsia="fr-FR"/>
+          <w14:ligatures w14:val="none"/>
+        </w:rPr>
+        <w:t>(</w:t>
+      </w:r>
+      <w:r>
+        <w:rPr>
+          <w:rFonts w:ascii="MesloLGM Nerd Font Mono" w:eastAsia="Times New Roman" w:hAnsi="MesloLGM Nerd Font Mono" w:cs="MesloLGM Nerd Font Mono"/>
+          <w:color w:val="9CDCFE"/>
+          <w:kern w:val="0"/>
+          <w:sz w:val="21"/>
+          <w:szCs w:val="21"/>
+          <w:lang w:val="en-US" w:eastAsia="fr-FR"/>
+          <w14:ligatures w14:val="none"/>
+        </w:rPr>
+        <w:t>LISTENING_PORT</w:t>
+      </w:r>
+      <w:r>
+        <w:rPr>
+          <w:rFonts w:ascii="MesloLGM Nerd Font Mono" w:eastAsia="Times New Roman" w:hAnsi="MesloLGM Nerd Font Mono" w:cs="MesloLGM Nerd Font Mono"/>
+          <w:color w:val="D4D4D4"/>
+          <w:kern w:val="0"/>
+          <w:sz w:val="21"/>
+          <w:szCs w:val="21"/>
+          <w:lang w:val="en-US" w:eastAsia="fr-FR"/>
+          <w14:ligatures w14:val="none"/>
+        </w:rPr>
+        <w:t xml:space="preserve">, </w:t>
+      </w:r>
+      <w:r>
+        <w:rPr>
+          <w:rFonts w:ascii="MesloLGM Nerd Font Mono" w:eastAsia="Times New Roman" w:hAnsi="MesloLGM Nerd Font Mono" w:cs="MesloLGM Nerd Font Mono"/>
+          <w:color w:val="9CDCFE"/>
+          <w:kern w:val="0"/>
+          <w:sz w:val="21"/>
+          <w:szCs w:val="21"/>
+          <w:lang w:val="en-US" w:eastAsia="fr-FR"/>
+          <w14:ligatures w14:val="none"/>
+        </w:rPr>
+        <w:t>REDIRECT_URL_END</w:t>
+      </w:r>
+      <w:r>
+        <w:rPr>
+          <w:rFonts w:ascii="MesloLGM Nerd Font Mono" w:eastAsia="Times New Roman" w:hAnsi="MesloLGM Nerd Font Mono" w:cs="MesloLGM Nerd Font Mono"/>
+          <w:color w:val="D4D4D4"/>
+          <w:kern w:val="0"/>
+          <w:sz w:val="21"/>
+          <w:szCs w:val="21"/>
+          <w:lang w:val="en-US" w:eastAsia="fr-FR"/>
+          <w14:ligatures w14:val="none"/>
+        </w:rPr>
+        <w:t>) {</w:t>
+      </w:r>
+    </w:p>
+    <w:p>
+      <w:pPr>
+        <w:pStyle w:val="Paragraphedeliste"/>
+        <w:numPr>
+          <w:ilvl w:val="0"/>
+          <w:numId w:val="8"/>
+        </w:numPr>
+        <w:shd w:val="clear" w:color="auto" w:fill="1E1E1E"/>
+        <w:spacing w:after="0" w:line="300" w:lineRule="atLeast"/>
+        <w:rPr>
+          <w:rFonts w:ascii="MesloLGM Nerd Font Mono" w:eastAsia="Times New Roman" w:hAnsi="MesloLGM Nerd Font Mono" w:cs="MesloLGM Nerd Font Mono"/>
+          <w:color w:val="D4D4D4"/>
+          <w:kern w:val="0"/>
+          <w:sz w:val="21"/>
+          <w:szCs w:val="21"/>
+          <w:lang w:val="en-US" w:eastAsia="fr-FR"/>
+          <w14:ligatures w14:val="none"/>
+        </w:rPr>
+      </w:pPr>
+      <w:r>
+        <w:rPr>
+          <w:rFonts w:ascii="MesloLGM Nerd Font Mono" w:eastAsia="Times New Roman" w:hAnsi="MesloLGM Nerd Font Mono" w:cs="MesloLGM Nerd Font Mono"/>
+          <w:color w:val="D4D4D4"/>
+          <w:kern w:val="0"/>
+          <w:sz w:val="21"/>
+          <w:szCs w:val="21"/>
+          <w:lang w:val="en-US" w:eastAsia="fr-FR"/>
+          <w14:ligatures w14:val="none"/>
+        </w:rPr>
+        <w:t xml:space="preserve">  </w:t>
+      </w:r>
+      <w:r>
+        <w:rPr>
+          <w:rFonts w:ascii="MesloLGM Nerd Font Mono" w:eastAsia="Times New Roman" w:hAnsi="MesloLGM Nerd Font Mono" w:cs="MesloLGM Nerd Font Mono"/>
+          <w:color w:val="9CDCFE"/>
+          <w:kern w:val="0"/>
+          <w:sz w:val="21"/>
+          <w:szCs w:val="21"/>
+          <w:lang w:val="en-US" w:eastAsia="fr-FR"/>
+          <w14:ligatures w14:val="none"/>
+        </w:rPr>
+        <w:t>googleService</w:t>
+      </w:r>
+      <w:r>
+        <w:rPr>
+          <w:rFonts w:ascii="MesloLGM Nerd Font Mono" w:eastAsia="Times New Roman" w:hAnsi="MesloLGM Nerd Font Mono" w:cs="MesloLGM Nerd Font Mono"/>
+          <w:color w:val="D4D4D4"/>
+          <w:kern w:val="0"/>
+          <w:sz w:val="21"/>
+          <w:szCs w:val="21"/>
+          <w:lang w:val="en-US" w:eastAsia="fr-FR"/>
+          <w14:ligatures w14:val="none"/>
+        </w:rPr>
+        <w:t>.</w:t>
+      </w:r>
+      <w:r>
+        <w:rPr>
+          <w:rFonts w:ascii="MesloLGM Nerd Font Mono" w:eastAsia="Times New Roman" w:hAnsi="MesloLGM Nerd Font Mono" w:cs="MesloLGM Nerd Font Mono"/>
+          <w:color w:val="DCDCAA"/>
+          <w:kern w:val="0"/>
+          <w:sz w:val="21"/>
+          <w:szCs w:val="21"/>
+          <w:lang w:val="en-US" w:eastAsia="fr-FR"/>
+          <w14:ligatures w14:val="none"/>
+        </w:rPr>
+        <w:t>initOAuth2Client</w:t>
+      </w:r>
+      <w:r>
+        <w:rPr>
+          <w:rFonts w:ascii="MesloLGM Nerd Font Mono" w:eastAsia="Times New Roman" w:hAnsi="MesloLGM Nerd Font Mono" w:cs="MesloLGM Nerd Font Mono"/>
+          <w:color w:val="D4D4D4"/>
+          <w:kern w:val="0"/>
+          <w:sz w:val="21"/>
+          <w:szCs w:val="21"/>
+          <w:lang w:val="en-US" w:eastAsia="fr-FR"/>
+          <w14:ligatures w14:val="none"/>
+        </w:rPr>
+        <w:t>(</w:t>
+      </w:r>
+      <w:r>
+        <w:rPr>
+          <w:rFonts w:ascii="MesloLGM Nerd Font Mono" w:eastAsia="Times New Roman" w:hAnsi="MesloLGM Nerd Font Mono" w:cs="MesloLGM Nerd Font Mono"/>
+          <w:color w:val="4FC1FF"/>
+          <w:kern w:val="0"/>
+          <w:sz w:val="21"/>
+          <w:szCs w:val="21"/>
+          <w:lang w:val="en-US" w:eastAsia="fr-FR"/>
+          <w14:ligatures w14:val="none"/>
+        </w:rPr>
+        <w:t>LISTENING_PORT</w:t>
+      </w:r>
+      <w:r>
+        <w:rPr>
+          <w:rFonts w:ascii="MesloLGM Nerd Font Mono" w:eastAsia="Times New Roman" w:hAnsi="MesloLGM Nerd Font Mono" w:cs="MesloLGM Nerd Font Mono"/>
+          <w:color w:val="D4D4D4"/>
+          <w:kern w:val="0"/>
+          <w:sz w:val="21"/>
+          <w:szCs w:val="21"/>
+          <w:lang w:val="en-US" w:eastAsia="fr-FR"/>
+          <w14:ligatures w14:val="none"/>
+        </w:rPr>
+        <w:t xml:space="preserve">, </w:t>
+      </w:r>
+      <w:r>
+        <w:rPr>
+          <w:rFonts w:ascii="MesloLGM Nerd Font Mono" w:eastAsia="Times New Roman" w:hAnsi="MesloLGM Nerd Font Mono" w:cs="MesloLGM Nerd Font Mono"/>
+          <w:color w:val="4FC1FF"/>
+          <w:kern w:val="0"/>
+          <w:sz w:val="21"/>
+          <w:szCs w:val="21"/>
+          <w:lang w:val="en-US" w:eastAsia="fr-FR"/>
+          <w14:ligatures w14:val="none"/>
+        </w:rPr>
+        <w:t>REDIRECT_URL_END</w:t>
+      </w:r>
+      <w:r>
+        <w:rPr>
+          <w:rFonts w:ascii="MesloLGM Nerd Font Mono" w:eastAsia="Times New Roman" w:hAnsi="MesloLGM Nerd Font Mono" w:cs="MesloLGM Nerd Font Mono"/>
+          <w:color w:val="D4D4D4"/>
+          <w:kern w:val="0"/>
+          <w:sz w:val="21"/>
+          <w:szCs w:val="21"/>
+          <w:lang w:val="en-US" w:eastAsia="fr-FR"/>
+          <w14:ligatures w14:val="none"/>
+        </w:rPr>
+        <w:t>);</w:t>
+      </w:r>
+    </w:p>
+    <w:p>
+      <w:pPr>
+        <w:pStyle w:val="Paragraphedeliste"/>
+        <w:numPr>
+          <w:ilvl w:val="0"/>
+          <w:numId w:val="8"/>
+        </w:numPr>
+        <w:shd w:val="clear" w:color="auto" w:fill="002060"/>
+        <w:spacing w:after="0" w:line="300" w:lineRule="atLeast"/>
+      </w:pPr>
       <w:r>
         <w:rPr>
           <w:rFonts w:ascii="MesloLGM Nerd Font Mono" w:eastAsia="Times New Roman" w:hAnsi="MesloLGM Nerd Font Mono" w:cs="MesloLGM Nerd Font Mono"/>
@@ -613,16 +1144,35 @@
           <w:lang w:eastAsia="fr-FR"/>
           <w14:ligatures w14:val="none"/>
         </w:rPr>
-        <w:t>);</w:t>
-      </w:r>
-      <w:proofErr w:type="gramEnd"/>
+        <w:t>}</w:t>
+      </w:r>
+    </w:p>
+    <w:p>
+      <w:pPr>
+        <w:rPr>
+          <w:b/>
+          <w:bCs/>
+        </w:rPr>
+      </w:pPr>
+      <w:r>
+        <w:rPr>
+          <w:b/>
+          <w:bCs/>
+        </w:rPr>
+        <w:t>3. Enregistrer les routes</w:t>
+      </w:r>
+    </w:p>
+    <w:p>
+      <w:r>
+        <w:t>Pour brancher les routes OAuth à Express :</w:t>
+      </w:r>
     </w:p>
     <w:p>
       <w:pPr>
         <w:pStyle w:val="Paragraphedeliste"/>
         <w:numPr>
           <w:ilvl w:val="0"/>
-          <w:numId w:val="6"/>
+          <w:numId w:val="8"/>
         </w:numPr>
         <w:shd w:val="clear" w:color="auto" w:fill="1E1E1E"/>
         <w:spacing w:after="0" w:line="300" w:lineRule="atLeast"/>
@@ -637,21 +1187,18 @@
         </w:rPr>
       </w:pPr>
       <w:proofErr w:type="spellStart"/>
-      <w:proofErr w:type="gramStart"/>
       <w:r>
         <w:rPr>
           <w:rFonts w:ascii="MesloLGM Nerd Font Mono" w:eastAsia="Times New Roman" w:hAnsi="MesloLGM Nerd Font Mono" w:cs="MesloLGM Nerd Font Mono"/>
-          <w:color w:val="569CD6"/>
+          <w:color w:val="9CDCFE"/>
           <w:kern w:val="0"/>
           <w:sz w:val="21"/>
           <w:szCs w:val="21"/>
           <w:lang w:eastAsia="fr-FR"/>
           <w14:ligatures w14:val="none"/>
         </w:rPr>
-        <w:t>const</w:t>
-      </w:r>
-      <w:proofErr w:type="spellEnd"/>
-      <w:proofErr w:type="gramEnd"/>
+        <w:t>googleService</w:t>
+      </w:r>
       <w:r>
         <w:rPr>
           <w:rFonts w:ascii="MesloLGM Nerd Font Mono" w:eastAsia="Times New Roman" w:hAnsi="MesloLGM Nerd Font Mono" w:cs="MesloLGM Nerd Font Mono"/>
@@ -662,9 +1209,57 @@
           <w:lang w:eastAsia="fr-FR"/>
           <w14:ligatures w14:val="none"/>
         </w:rPr>
-        <w:t xml:space="preserve"> </w:t>
-      </w:r>
-      <w:proofErr w:type="spellStart"/>
+        <w:t>.</w:t>
+      </w:r>
+      <w:r>
+        <w:rPr>
+          <w:rFonts w:ascii="MesloLGM Nerd Font Mono" w:eastAsia="Times New Roman" w:hAnsi="MesloLGM Nerd Font Mono" w:cs="MesloLGM Nerd Font Mono"/>
+          <w:color w:val="DCDCAA"/>
+          <w:kern w:val="0"/>
+          <w:sz w:val="21"/>
+          <w:szCs w:val="21"/>
+          <w:lang w:eastAsia="fr-FR"/>
+          <w14:ligatures w14:val="none"/>
+        </w:rPr>
+        <w:t>registerRoutes</w:t>
+      </w:r>
+      <w:proofErr w:type="spellEnd"/>
+      <w:r>
+        <w:rPr>
+          <w:rFonts w:ascii="MesloLGM Nerd Font Mono" w:eastAsia="Times New Roman" w:hAnsi="MesloLGM Nerd Font Mono" w:cs="MesloLGM Nerd Font Mono"/>
+          <w:color w:val="D4D4D4"/>
+          <w:kern w:val="0"/>
+          <w:sz w:val="21"/>
+          <w:szCs w:val="21"/>
+          <w:lang w:eastAsia="fr-FR"/>
+          <w14:ligatures w14:val="none"/>
+        </w:rPr>
+        <w:t>(</w:t>
+      </w:r>
+      <w:r>
+        <w:rPr>
+          <w:rFonts w:ascii="MesloLGM Nerd Font Mono" w:eastAsia="Times New Roman" w:hAnsi="MesloLGM Nerd Font Mono" w:cs="MesloLGM Nerd Font Mono"/>
+          <w:color w:val="9CDCFE"/>
+          <w:kern w:val="0"/>
+          <w:sz w:val="21"/>
+          <w:szCs w:val="21"/>
+          <w:lang w:eastAsia="fr-FR"/>
+          <w14:ligatures w14:val="none"/>
+        </w:rPr>
+        <w:t>app</w:t>
+      </w:r>
+      <w:r>
+        <w:rPr>
+          <w:rFonts w:ascii="MesloLGM Nerd Font Mono" w:eastAsia="Times New Roman" w:hAnsi="MesloLGM Nerd Font Mono" w:cs="MesloLGM Nerd Font Mono"/>
+          <w:color w:val="D4D4D4"/>
+          <w:kern w:val="0"/>
+          <w:sz w:val="21"/>
+          <w:szCs w:val="21"/>
+          <w:lang w:eastAsia="fr-FR"/>
+          <w14:ligatures w14:val="none"/>
+        </w:rPr>
+        <w:t xml:space="preserve">, </w:t>
+      </w:r>
       <w:r>
         <w:rPr>
           <w:rFonts w:ascii="MesloLGM Nerd Font Mono" w:eastAsia="Times New Roman" w:hAnsi="MesloLGM Nerd Font Mono" w:cs="MesloLGM Nerd Font Mono"/>
@@ -675,9 +1270,8 @@
           <w:lang w:eastAsia="fr-FR"/>
           <w14:ligatures w14:val="none"/>
         </w:rPr>
-        <w:t>googleService</w:t>
-      </w:r>
-      <w:proofErr w:type="spellEnd"/>
+        <w:t>LISTENING_PORT</w:t>
+      </w:r>
       <w:r>
         <w:rPr>
           <w:rFonts w:ascii="MesloLGM Nerd Font Mono" w:eastAsia="Times New Roman" w:hAnsi="MesloLGM Nerd Font Mono" w:cs="MesloLGM Nerd Font Mono"/>
@@ -688,60 +1282,51 @@
           <w:lang w:eastAsia="fr-FR"/>
           <w14:ligatures w14:val="none"/>
         </w:rPr>
-        <w:t xml:space="preserve"> = </w:t>
-      </w:r>
-      <w:r>
-        <w:rPr>
-          <w:rFonts w:ascii="MesloLGM Nerd Font Mono" w:eastAsia="Times New Roman" w:hAnsi="MesloLGM Nerd Font Mono" w:cs="MesloLGM Nerd Font Mono"/>
-          <w:color w:val="569CD6"/>
-          <w:kern w:val="0"/>
-          <w:sz w:val="21"/>
-          <w:szCs w:val="21"/>
-          <w:lang w:eastAsia="fr-FR"/>
-          <w14:ligatures w14:val="none"/>
-        </w:rPr>
-        <w:t>new</w:t>
-      </w:r>
-      <w:r>
-        <w:rPr>
-          <w:rFonts w:ascii="MesloLGM Nerd Font Mono" w:eastAsia="Times New Roman" w:hAnsi="MesloLGM Nerd Font Mono" w:cs="MesloLGM Nerd Font Mono"/>
-          <w:color w:val="D4D4D4"/>
-          <w:kern w:val="0"/>
-          <w:sz w:val="21"/>
-          <w:szCs w:val="21"/>
-          <w:lang w:eastAsia="fr-FR"/>
-          <w14:ligatures w14:val="none"/>
-        </w:rPr>
-        <w:t xml:space="preserve"> </w:t>
+        <w:t>);</w:t>
+      </w:r>
+    </w:p>
+    <w:p>
+      <w:r>
+        <w:t>C’est la méthode centrale qui ajoute :</w:t>
+      </w:r>
+    </w:p>
+    <w:p>
+      <w:pPr>
+        <w:numPr>
+          <w:ilvl w:val="0"/>
+          <w:numId w:val="9"/>
+        </w:numPr>
+      </w:pPr>
+      <w:r>
+        <w:t>la route /</w:t>
+      </w:r>
+    </w:p>
+    <w:p>
+      <w:pPr>
+        <w:numPr>
+          <w:ilvl w:val="0"/>
+          <w:numId w:val="9"/>
+        </w:numPr>
+      </w:pPr>
+      <w:r>
+        <w:t>la route /oauth2callback</w:t>
+      </w:r>
+    </w:p>
+    <w:p>
+      <w:pPr>
+        <w:numPr>
+          <w:ilvl w:val="0"/>
+          <w:numId w:val="9"/>
+        </w:numPr>
+      </w:pPr>
+      <w:r>
+        <w:t>la route /</w:t>
       </w:r>
       <w:proofErr w:type="spellStart"/>
-      <w:proofErr w:type="gramStart"/>
-      <w:r>
-        <w:rPr>
-          <w:rFonts w:ascii="MesloLGM Nerd Font Mono" w:eastAsia="Times New Roman" w:hAnsi="MesloLGM Nerd Font Mono" w:cs="MesloLGM Nerd Font Mono"/>
-          <w:color w:val="DCDCAA"/>
-          <w:kern w:val="0"/>
-          <w:sz w:val="21"/>
-          <w:szCs w:val="21"/>
-          <w:lang w:eastAsia="fr-FR"/>
-          <w14:ligatures w14:val="none"/>
-        </w:rPr>
-        <w:t>GoogleService</w:t>
+      <w:r>
+        <w:t>revoke</w:t>
       </w:r>
       <w:proofErr w:type="spellEnd"/>
-      <w:r>
-        <w:rPr>
-          <w:rFonts w:ascii="MesloLGM Nerd Font Mono" w:eastAsia="Times New Roman" w:hAnsi="MesloLGM Nerd Font Mono" w:cs="MesloLGM Nerd Font Mono"/>
-          <w:color w:val="D4D4D4"/>
-          <w:kern w:val="0"/>
-          <w:sz w:val="21"/>
-          <w:szCs w:val="21"/>
-          <w:lang w:eastAsia="fr-FR"/>
-          <w14:ligatures w14:val="none"/>
-        </w:rPr>
-        <w:t>();</w:t>
-      </w:r>
-      <w:proofErr w:type="gramEnd"/>
     </w:p>
     <w:p>
       <w:pPr>
@@ -755,655 +1340,6 @@
           <w:b/>
           <w:bCs/>
         </w:rPr>
-        <w:t>2. Initialiser le client OAuth</w:t>
-      </w:r>
-    </w:p>
-    <w:p>
-      <w:r>
-        <w:t>Avant d’utiliser les routes Google, il faut initialiser le client :</w:t>
-      </w:r>
-    </w:p>
-    <w:p>
-      <w:pPr>
-        <w:pStyle w:val="Paragraphedeliste"/>
-        <w:numPr>
-          <w:ilvl w:val="0"/>
-          <w:numId w:val="7"/>
-        </w:numPr>
-        <w:shd w:val="clear" w:color="auto" w:fill="1E1E1E"/>
-        <w:spacing w:after="0" w:line="300" w:lineRule="atLeast"/>
-        <w:rPr>
-          <w:rFonts w:ascii="MesloLGM Nerd Font Mono" w:eastAsia="Times New Roman" w:hAnsi="MesloLGM Nerd Font Mono" w:cs="MesloLGM Nerd Font Mono"/>
-          <w:color w:val="D4D4D4"/>
-          <w:kern w:val="0"/>
-          <w:sz w:val="21"/>
-          <w:szCs w:val="21"/>
-          <w:lang w:val="en-US" w:eastAsia="fr-FR"/>
-          <w14:ligatures w14:val="none"/>
-        </w:rPr>
-      </w:pPr>
-      <w:r>
-        <w:rPr>
-          <w:rFonts w:ascii="MesloLGM Nerd Font Mono" w:eastAsia="Times New Roman" w:hAnsi="MesloLGM Nerd Font Mono" w:cs="MesloLGM Nerd Font Mono"/>
-          <w:color w:val="9CDCFE"/>
-          <w:kern w:val="0"/>
-          <w:sz w:val="21"/>
-          <w:szCs w:val="21"/>
-          <w:lang w:val="en-US" w:eastAsia="fr-FR"/>
-          <w14:ligatures w14:val="none"/>
-        </w:rPr>
-        <w:t>googleService</w:t>
-      </w:r>
-      <w:r>
-        <w:rPr>
-          <w:rFonts w:ascii="MesloLGM Nerd Font Mono" w:eastAsia="Times New Roman" w:hAnsi="MesloLGM Nerd Font Mono" w:cs="MesloLGM Nerd Font Mono"/>
-          <w:color w:val="D4D4D4"/>
-          <w:kern w:val="0"/>
-          <w:sz w:val="21"/>
-          <w:szCs w:val="21"/>
-          <w:lang w:val="en-US" w:eastAsia="fr-FR"/>
-          <w14:ligatures w14:val="none"/>
-        </w:rPr>
-        <w:t>.</w:t>
-      </w:r>
-      <w:r>
-        <w:rPr>
-          <w:rFonts w:ascii="MesloLGM Nerd Font Mono" w:eastAsia="Times New Roman" w:hAnsi="MesloLGM Nerd Font Mono" w:cs="MesloLGM Nerd Font Mono"/>
-          <w:color w:val="DCDCAA"/>
-          <w:kern w:val="0"/>
-          <w:sz w:val="21"/>
-          <w:szCs w:val="21"/>
-          <w:lang w:val="en-US" w:eastAsia="fr-FR"/>
-          <w14:ligatures w14:val="none"/>
-        </w:rPr>
-        <w:t>initOAuth2</w:t>
-      </w:r>
-      <w:proofErr w:type="gramStart"/>
-      <w:r>
-        <w:rPr>
-          <w:rFonts w:ascii="MesloLGM Nerd Font Mono" w:eastAsia="Times New Roman" w:hAnsi="MesloLGM Nerd Font Mono" w:cs="MesloLGM Nerd Font Mono"/>
-          <w:color w:val="DCDCAA"/>
-          <w:kern w:val="0"/>
-          <w:sz w:val="21"/>
-          <w:szCs w:val="21"/>
-          <w:lang w:val="en-US" w:eastAsia="fr-FR"/>
-          <w14:ligatures w14:val="none"/>
-        </w:rPr>
-        <w:t>Client</w:t>
-      </w:r>
-      <w:r>
-        <w:rPr>
-          <w:rFonts w:ascii="MesloLGM Nerd Font Mono" w:eastAsia="Times New Roman" w:hAnsi="MesloLGM Nerd Font Mono" w:cs="MesloLGM Nerd Font Mono"/>
-          <w:color w:val="D4D4D4"/>
-          <w:kern w:val="0"/>
-          <w:sz w:val="21"/>
-          <w:szCs w:val="21"/>
-          <w:lang w:val="en-US" w:eastAsia="fr-FR"/>
-          <w14:ligatures w14:val="none"/>
-        </w:rPr>
-        <w:t>(</w:t>
-      </w:r>
-      <w:proofErr w:type="gramEnd"/>
-      <w:r>
-        <w:rPr>
-          <w:rFonts w:ascii="MesloLGM Nerd Font Mono" w:eastAsia="Times New Roman" w:hAnsi="MesloLGM Nerd Font Mono" w:cs="MesloLGM Nerd Font Mono"/>
-          <w:color w:val="4FC1FF"/>
-          <w:kern w:val="0"/>
-          <w:sz w:val="21"/>
-          <w:szCs w:val="21"/>
-          <w:lang w:val="en-US" w:eastAsia="fr-FR"/>
-          <w14:ligatures w14:val="none"/>
-        </w:rPr>
-        <w:t>LISTENING_PORT</w:t>
-      </w:r>
-      <w:r>
-        <w:rPr>
-          <w:rFonts w:ascii="MesloLGM Nerd Font Mono" w:eastAsia="Times New Roman" w:hAnsi="MesloLGM Nerd Font Mono" w:cs="MesloLGM Nerd Font Mono"/>
-          <w:color w:val="D4D4D4"/>
-          <w:kern w:val="0"/>
-          <w:sz w:val="21"/>
-          <w:szCs w:val="21"/>
-          <w:lang w:val="en-US" w:eastAsia="fr-FR"/>
-          <w14:ligatures w14:val="none"/>
-        </w:rPr>
-        <w:t xml:space="preserve">, </w:t>
-      </w:r>
-      <w:r>
-        <w:rPr>
-          <w:rFonts w:ascii="MesloLGM Nerd Font Mono" w:eastAsia="Times New Roman" w:hAnsi="MesloLGM Nerd Font Mono" w:cs="MesloLGM Nerd Font Mono"/>
-          <w:color w:val="4FC1FF"/>
-          <w:kern w:val="0"/>
-          <w:sz w:val="21"/>
-          <w:szCs w:val="21"/>
-          <w:lang w:val="en-US" w:eastAsia="fr-FR"/>
-          <w14:ligatures w14:val="none"/>
-        </w:rPr>
-        <w:t>REDIRECT_URL_END</w:t>
-      </w:r>
-      <w:r>
-        <w:rPr>
-          <w:rFonts w:ascii="MesloLGM Nerd Font Mono" w:eastAsia="Times New Roman" w:hAnsi="MesloLGM Nerd Font Mono" w:cs="MesloLGM Nerd Font Mono"/>
-          <w:color w:val="D4D4D4"/>
-          <w:kern w:val="0"/>
-          <w:sz w:val="21"/>
-          <w:szCs w:val="21"/>
-          <w:lang w:val="en-US" w:eastAsia="fr-FR"/>
-          <w14:ligatures w14:val="none"/>
-        </w:rPr>
-        <w:t>);</w:t>
-      </w:r>
-    </w:p>
-    <w:p>
-      <w:r>
-        <w:t>C’est ce que fait maintenant le module de routes via :</w:t>
-      </w:r>
-    </w:p>
-    <w:p>
-      <w:pPr>
-        <w:pStyle w:val="Paragraphedeliste"/>
-        <w:numPr>
-          <w:ilvl w:val="0"/>
-          <w:numId w:val="8"/>
-        </w:numPr>
-        <w:shd w:val="clear" w:color="auto" w:fill="1E1E1E"/>
-        <w:spacing w:after="0" w:line="300" w:lineRule="atLeast"/>
-        <w:rPr>
-          <w:rFonts w:ascii="MesloLGM Nerd Font Mono" w:eastAsia="Times New Roman" w:hAnsi="MesloLGM Nerd Font Mono" w:cs="MesloLGM Nerd Font Mono"/>
-          <w:color w:val="D4D4D4"/>
-          <w:kern w:val="0"/>
-          <w:sz w:val="21"/>
-          <w:szCs w:val="21"/>
-          <w:lang w:val="en-US" w:eastAsia="fr-FR"/>
-          <w14:ligatures w14:val="none"/>
-        </w:rPr>
-      </w:pPr>
-      <w:r>
-        <w:rPr>
-          <w:rFonts w:ascii="MesloLGM Nerd Font Mono" w:eastAsia="Times New Roman" w:hAnsi="MesloLGM Nerd Font Mono" w:cs="MesloLGM Nerd Font Mono"/>
-          <w:color w:val="569CD6"/>
-          <w:kern w:val="0"/>
-          <w:sz w:val="21"/>
-          <w:szCs w:val="21"/>
-          <w:lang w:val="en-US" w:eastAsia="fr-FR"/>
-          <w14:ligatures w14:val="none"/>
-        </w:rPr>
-        <w:t>function</w:t>
-      </w:r>
-      <w:r>
-        <w:rPr>
-          <w:rFonts w:ascii="MesloLGM Nerd Font Mono" w:eastAsia="Times New Roman" w:hAnsi="MesloLGM Nerd Font Mono" w:cs="MesloLGM Nerd Font Mono"/>
-          <w:color w:val="D4D4D4"/>
-          <w:kern w:val="0"/>
-          <w:sz w:val="21"/>
-          <w:szCs w:val="21"/>
-          <w:lang w:val="en-US" w:eastAsia="fr-FR"/>
-          <w14:ligatures w14:val="none"/>
-        </w:rPr>
-        <w:t xml:space="preserve"> </w:t>
-      </w:r>
-      <w:r>
-        <w:rPr>
-          <w:rFonts w:ascii="MesloLGM Nerd Font Mono" w:eastAsia="Times New Roman" w:hAnsi="MesloLGM Nerd Font Mono" w:cs="MesloLGM Nerd Font Mono"/>
-          <w:color w:val="DCDCAA"/>
-          <w:kern w:val="0"/>
-          <w:sz w:val="21"/>
-          <w:szCs w:val="21"/>
-          <w:lang w:val="en-US" w:eastAsia="fr-FR"/>
-          <w14:ligatures w14:val="none"/>
-        </w:rPr>
-        <w:t>initOAuth2</w:t>
-      </w:r>
-      <w:proofErr w:type="gramStart"/>
-      <w:r>
-        <w:rPr>
-          <w:rFonts w:ascii="MesloLGM Nerd Font Mono" w:eastAsia="Times New Roman" w:hAnsi="MesloLGM Nerd Font Mono" w:cs="MesloLGM Nerd Font Mono"/>
-          <w:color w:val="DCDCAA"/>
-          <w:kern w:val="0"/>
-          <w:sz w:val="21"/>
-          <w:szCs w:val="21"/>
-          <w:lang w:val="en-US" w:eastAsia="fr-FR"/>
-          <w14:ligatures w14:val="none"/>
-        </w:rPr>
-        <w:t>Client</w:t>
-      </w:r>
-      <w:r>
-        <w:rPr>
-          <w:rFonts w:ascii="MesloLGM Nerd Font Mono" w:eastAsia="Times New Roman" w:hAnsi="MesloLGM Nerd Font Mono" w:cs="MesloLGM Nerd Font Mono"/>
-          <w:color w:val="D4D4D4"/>
-          <w:kern w:val="0"/>
-          <w:sz w:val="21"/>
-          <w:szCs w:val="21"/>
-          <w:lang w:val="en-US" w:eastAsia="fr-FR"/>
-          <w14:ligatures w14:val="none"/>
-        </w:rPr>
-        <w:t>(</w:t>
-      </w:r>
-      <w:proofErr w:type="gramEnd"/>
-      <w:r>
-        <w:rPr>
-          <w:rFonts w:ascii="MesloLGM Nerd Font Mono" w:eastAsia="Times New Roman" w:hAnsi="MesloLGM Nerd Font Mono" w:cs="MesloLGM Nerd Font Mono"/>
-          <w:color w:val="9CDCFE"/>
-          <w:kern w:val="0"/>
-          <w:sz w:val="21"/>
-          <w:szCs w:val="21"/>
-          <w:lang w:val="en-US" w:eastAsia="fr-FR"/>
-          <w14:ligatures w14:val="none"/>
-        </w:rPr>
-        <w:t>LISTENING_PORT</w:t>
-      </w:r>
-      <w:r>
-        <w:rPr>
-          <w:rFonts w:ascii="MesloLGM Nerd Font Mono" w:eastAsia="Times New Roman" w:hAnsi="MesloLGM Nerd Font Mono" w:cs="MesloLGM Nerd Font Mono"/>
-          <w:color w:val="D4D4D4"/>
-          <w:kern w:val="0"/>
-          <w:sz w:val="21"/>
-          <w:szCs w:val="21"/>
-          <w:lang w:val="en-US" w:eastAsia="fr-FR"/>
-          <w14:ligatures w14:val="none"/>
-        </w:rPr>
-        <w:t xml:space="preserve">, </w:t>
-      </w:r>
-      <w:r>
-        <w:rPr>
-          <w:rFonts w:ascii="MesloLGM Nerd Font Mono" w:eastAsia="Times New Roman" w:hAnsi="MesloLGM Nerd Font Mono" w:cs="MesloLGM Nerd Font Mono"/>
-          <w:color w:val="9CDCFE"/>
-          <w:kern w:val="0"/>
-          <w:sz w:val="21"/>
-          <w:szCs w:val="21"/>
-          <w:lang w:val="en-US" w:eastAsia="fr-FR"/>
-          <w14:ligatures w14:val="none"/>
-        </w:rPr>
-        <w:t>REDIRECT_URL_END</w:t>
-      </w:r>
-      <w:r>
-        <w:rPr>
-          <w:rFonts w:ascii="MesloLGM Nerd Font Mono" w:eastAsia="Times New Roman" w:hAnsi="MesloLGM Nerd Font Mono" w:cs="MesloLGM Nerd Font Mono"/>
-          <w:color w:val="D4D4D4"/>
-          <w:kern w:val="0"/>
-          <w:sz w:val="21"/>
-          <w:szCs w:val="21"/>
-          <w:lang w:val="en-US" w:eastAsia="fr-FR"/>
-          <w14:ligatures w14:val="none"/>
-        </w:rPr>
-        <w:t>) {</w:t>
-      </w:r>
-    </w:p>
-    <w:p>
-      <w:pPr>
-        <w:pStyle w:val="Paragraphedeliste"/>
-        <w:numPr>
-          <w:ilvl w:val="0"/>
-          <w:numId w:val="8"/>
-        </w:numPr>
-        <w:shd w:val="clear" w:color="auto" w:fill="1E1E1E"/>
-        <w:spacing w:after="0" w:line="300" w:lineRule="atLeast"/>
-        <w:rPr>
-          <w:rFonts w:ascii="MesloLGM Nerd Font Mono" w:eastAsia="Times New Roman" w:hAnsi="MesloLGM Nerd Font Mono" w:cs="MesloLGM Nerd Font Mono"/>
-          <w:color w:val="D4D4D4"/>
-          <w:kern w:val="0"/>
-          <w:sz w:val="21"/>
-          <w:szCs w:val="21"/>
-          <w:lang w:val="en-US" w:eastAsia="fr-FR"/>
-          <w14:ligatures w14:val="none"/>
-        </w:rPr>
-      </w:pPr>
-      <w:r>
-        <w:rPr>
-          <w:rFonts w:ascii="MesloLGM Nerd Font Mono" w:eastAsia="Times New Roman" w:hAnsi="MesloLGM Nerd Font Mono" w:cs="MesloLGM Nerd Font Mono"/>
-          <w:color w:val="D4D4D4"/>
-          <w:kern w:val="0"/>
-          <w:sz w:val="21"/>
-          <w:szCs w:val="21"/>
-          <w:lang w:val="en-US" w:eastAsia="fr-FR"/>
-          <w14:ligatures w14:val="none"/>
-        </w:rPr>
-        <w:t xml:space="preserve">  </w:t>
-      </w:r>
-      <w:r>
-        <w:rPr>
-          <w:rFonts w:ascii="MesloLGM Nerd Font Mono" w:eastAsia="Times New Roman" w:hAnsi="MesloLGM Nerd Font Mono" w:cs="MesloLGM Nerd Font Mono"/>
-          <w:color w:val="9CDCFE"/>
-          <w:kern w:val="0"/>
-          <w:sz w:val="21"/>
-          <w:szCs w:val="21"/>
-          <w:lang w:val="en-US" w:eastAsia="fr-FR"/>
-          <w14:ligatures w14:val="none"/>
-        </w:rPr>
-        <w:t>googleService</w:t>
-      </w:r>
-      <w:r>
-        <w:rPr>
-          <w:rFonts w:ascii="MesloLGM Nerd Font Mono" w:eastAsia="Times New Roman" w:hAnsi="MesloLGM Nerd Font Mono" w:cs="MesloLGM Nerd Font Mono"/>
-          <w:color w:val="D4D4D4"/>
-          <w:kern w:val="0"/>
-          <w:sz w:val="21"/>
-          <w:szCs w:val="21"/>
-          <w:lang w:val="en-US" w:eastAsia="fr-FR"/>
-          <w14:ligatures w14:val="none"/>
-        </w:rPr>
-        <w:t>.</w:t>
-      </w:r>
-      <w:r>
-        <w:rPr>
-          <w:rFonts w:ascii="MesloLGM Nerd Font Mono" w:eastAsia="Times New Roman" w:hAnsi="MesloLGM Nerd Font Mono" w:cs="MesloLGM Nerd Font Mono"/>
-          <w:color w:val="DCDCAA"/>
-          <w:kern w:val="0"/>
-          <w:sz w:val="21"/>
-          <w:szCs w:val="21"/>
-          <w:lang w:val="en-US" w:eastAsia="fr-FR"/>
-          <w14:ligatures w14:val="none"/>
-        </w:rPr>
-        <w:t>initOAuth2</w:t>
-      </w:r>
-      <w:proofErr w:type="gramStart"/>
-      <w:r>
-        <w:rPr>
-          <w:rFonts w:ascii="MesloLGM Nerd Font Mono" w:eastAsia="Times New Roman" w:hAnsi="MesloLGM Nerd Font Mono" w:cs="MesloLGM Nerd Font Mono"/>
-          <w:color w:val="DCDCAA"/>
-          <w:kern w:val="0"/>
-          <w:sz w:val="21"/>
-          <w:szCs w:val="21"/>
-          <w:lang w:val="en-US" w:eastAsia="fr-FR"/>
-          <w14:ligatures w14:val="none"/>
-        </w:rPr>
-        <w:t>Client</w:t>
-      </w:r>
-      <w:r>
-        <w:rPr>
-          <w:rFonts w:ascii="MesloLGM Nerd Font Mono" w:eastAsia="Times New Roman" w:hAnsi="MesloLGM Nerd Font Mono" w:cs="MesloLGM Nerd Font Mono"/>
-          <w:color w:val="D4D4D4"/>
-          <w:kern w:val="0"/>
-          <w:sz w:val="21"/>
-          <w:szCs w:val="21"/>
-          <w:lang w:val="en-US" w:eastAsia="fr-FR"/>
-          <w14:ligatures w14:val="none"/>
-        </w:rPr>
-        <w:t>(</w:t>
-      </w:r>
-      <w:proofErr w:type="gramEnd"/>
-      <w:r>
-        <w:rPr>
-          <w:rFonts w:ascii="MesloLGM Nerd Font Mono" w:eastAsia="Times New Roman" w:hAnsi="MesloLGM Nerd Font Mono" w:cs="MesloLGM Nerd Font Mono"/>
-          <w:color w:val="4FC1FF"/>
-          <w:kern w:val="0"/>
-          <w:sz w:val="21"/>
-          <w:szCs w:val="21"/>
-          <w:lang w:val="en-US" w:eastAsia="fr-FR"/>
-          <w14:ligatures w14:val="none"/>
-        </w:rPr>
-        <w:t>LISTENING_PORT</w:t>
-      </w:r>
-      <w:r>
-        <w:rPr>
-          <w:rFonts w:ascii="MesloLGM Nerd Font Mono" w:eastAsia="Times New Roman" w:hAnsi="MesloLGM Nerd Font Mono" w:cs="MesloLGM Nerd Font Mono"/>
-          <w:color w:val="D4D4D4"/>
-          <w:kern w:val="0"/>
-          <w:sz w:val="21"/>
-          <w:szCs w:val="21"/>
-          <w:lang w:val="en-US" w:eastAsia="fr-FR"/>
-          <w14:ligatures w14:val="none"/>
-        </w:rPr>
-        <w:t xml:space="preserve">, </w:t>
-      </w:r>
-      <w:r>
-        <w:rPr>
-          <w:rFonts w:ascii="MesloLGM Nerd Font Mono" w:eastAsia="Times New Roman" w:hAnsi="MesloLGM Nerd Font Mono" w:cs="MesloLGM Nerd Font Mono"/>
-          <w:color w:val="4FC1FF"/>
-          <w:kern w:val="0"/>
-          <w:sz w:val="21"/>
-          <w:szCs w:val="21"/>
-          <w:lang w:val="en-US" w:eastAsia="fr-FR"/>
-          <w14:ligatures w14:val="none"/>
-        </w:rPr>
-        <w:t>REDIRECT_URL_END</w:t>
-      </w:r>
-      <w:r>
-        <w:rPr>
-          <w:rFonts w:ascii="MesloLGM Nerd Font Mono" w:eastAsia="Times New Roman" w:hAnsi="MesloLGM Nerd Font Mono" w:cs="MesloLGM Nerd Font Mono"/>
-          <w:color w:val="D4D4D4"/>
-          <w:kern w:val="0"/>
-          <w:sz w:val="21"/>
-          <w:szCs w:val="21"/>
-          <w:lang w:val="en-US" w:eastAsia="fr-FR"/>
-          <w14:ligatures w14:val="none"/>
-        </w:rPr>
-        <w:t>);</w:t>
-      </w:r>
-    </w:p>
-    <w:p>
-      <w:pPr>
-        <w:pStyle w:val="Paragraphedeliste"/>
-        <w:numPr>
-          <w:ilvl w:val="0"/>
-          <w:numId w:val="8"/>
-        </w:numPr>
-        <w:shd w:val="clear" w:color="auto" w:fill="002060"/>
-        <w:spacing w:after="0" w:line="300" w:lineRule="atLeast"/>
-      </w:pPr>
-      <w:r>
-        <w:rPr>
-          <w:rFonts w:ascii="MesloLGM Nerd Font Mono" w:eastAsia="Times New Roman" w:hAnsi="MesloLGM Nerd Font Mono" w:cs="MesloLGM Nerd Font Mono"/>
-          <w:color w:val="D4D4D4"/>
-          <w:kern w:val="0"/>
-          <w:sz w:val="21"/>
-          <w:szCs w:val="21"/>
-          <w:lang w:eastAsia="fr-FR"/>
-          <w14:ligatures w14:val="none"/>
-        </w:rPr>
-        <w:t>}</w:t>
-      </w:r>
-    </w:p>
-    <w:p>
-      <w:pPr>
-        <w:rPr>
-          <w:b/>
-          <w:bCs/>
-        </w:rPr>
-      </w:pPr>
-      <w:r>
-        <w:rPr>
-          <w:b/>
-          <w:bCs/>
-        </w:rPr>
-        <w:lastRenderedPageBreak/>
-        <w:t>3. Enregistrer les routes</w:t>
-      </w:r>
-    </w:p>
-    <w:p>
-      <w:r>
-        <w:t>Pour brancher les routes OAuth à Express :</w:t>
-      </w:r>
-    </w:p>
-    <w:p>
-      <w:pPr>
-        <w:pStyle w:val="Paragraphedeliste"/>
-        <w:numPr>
-          <w:ilvl w:val="0"/>
-          <w:numId w:val="8"/>
-        </w:numPr>
-        <w:shd w:val="clear" w:color="auto" w:fill="1E1E1E"/>
-        <w:spacing w:after="0" w:line="300" w:lineRule="atLeast"/>
-        <w:rPr>
-          <w:rFonts w:ascii="MesloLGM Nerd Font Mono" w:eastAsia="Times New Roman" w:hAnsi="MesloLGM Nerd Font Mono" w:cs="MesloLGM Nerd Font Mono"/>
-          <w:color w:val="D4D4D4"/>
-          <w:kern w:val="0"/>
-          <w:sz w:val="21"/>
-          <w:szCs w:val="21"/>
-          <w:lang w:eastAsia="fr-FR"/>
-          <w14:ligatures w14:val="none"/>
-        </w:rPr>
-      </w:pPr>
-      <w:proofErr w:type="spellStart"/>
-      <w:r>
-        <w:rPr>
-          <w:rFonts w:ascii="MesloLGM Nerd Font Mono" w:eastAsia="Times New Roman" w:hAnsi="MesloLGM Nerd Font Mono" w:cs="MesloLGM Nerd Font Mono"/>
-          <w:color w:val="9CDCFE"/>
-          <w:kern w:val="0"/>
-          <w:sz w:val="21"/>
-          <w:szCs w:val="21"/>
-          <w:lang w:eastAsia="fr-FR"/>
-          <w14:ligatures w14:val="none"/>
-        </w:rPr>
-        <w:t>googleService</w:t>
-      </w:r>
-      <w:r>
-        <w:rPr>
-          <w:rFonts w:ascii="MesloLGM Nerd Font Mono" w:eastAsia="Times New Roman" w:hAnsi="MesloLGM Nerd Font Mono" w:cs="MesloLGM Nerd Font Mono"/>
-          <w:color w:val="D4D4D4"/>
-          <w:kern w:val="0"/>
-          <w:sz w:val="21"/>
-          <w:szCs w:val="21"/>
-          <w:lang w:eastAsia="fr-FR"/>
-          <w14:ligatures w14:val="none"/>
-        </w:rPr>
-        <w:t>.</w:t>
-      </w:r>
-      <w:r>
-        <w:rPr>
-          <w:rFonts w:ascii="MesloLGM Nerd Font Mono" w:eastAsia="Times New Roman" w:hAnsi="MesloLGM Nerd Font Mono" w:cs="MesloLGM Nerd Font Mono"/>
-          <w:color w:val="DCDCAA"/>
-          <w:kern w:val="0"/>
-          <w:sz w:val="21"/>
-          <w:szCs w:val="21"/>
-          <w:lang w:eastAsia="fr-FR"/>
-          <w14:ligatures w14:val="none"/>
-        </w:rPr>
-        <w:t>registerRoutes</w:t>
-      </w:r>
-      <w:proofErr w:type="spellEnd"/>
-      <w:r>
-        <w:rPr>
-          <w:rFonts w:ascii="MesloLGM Nerd Font Mono" w:eastAsia="Times New Roman" w:hAnsi="MesloLGM Nerd Font Mono" w:cs="MesloLGM Nerd Font Mono"/>
-          <w:color w:val="D4D4D4"/>
-          <w:kern w:val="0"/>
-          <w:sz w:val="21"/>
-          <w:szCs w:val="21"/>
-          <w:lang w:eastAsia="fr-FR"/>
-          <w14:ligatures w14:val="none"/>
-        </w:rPr>
-        <w:t>(</w:t>
-      </w:r>
-      <w:r>
-        <w:rPr>
-          <w:rFonts w:ascii="MesloLGM Nerd Font Mono" w:eastAsia="Times New Roman" w:hAnsi="MesloLGM Nerd Font Mono" w:cs="MesloLGM Nerd Font Mono"/>
-          <w:color w:val="9CDCFE"/>
-          <w:kern w:val="0"/>
-          <w:sz w:val="21"/>
-          <w:szCs w:val="21"/>
-          <w:lang w:eastAsia="fr-FR"/>
-          <w14:ligatures w14:val="none"/>
-        </w:rPr>
-        <w:t>app</w:t>
-      </w:r>
-      <w:r>
-        <w:rPr>
-          <w:rFonts w:ascii="MesloLGM Nerd Font Mono" w:eastAsia="Times New Roman" w:hAnsi="MesloLGM Nerd Font Mono" w:cs="MesloLGM Nerd Font Mono"/>
-          <w:color w:val="D4D4D4"/>
-          <w:kern w:val="0"/>
-          <w:sz w:val="21"/>
-          <w:szCs w:val="21"/>
-          <w:lang w:eastAsia="fr-FR"/>
-          <w14:ligatures w14:val="none"/>
-        </w:rPr>
-        <w:t xml:space="preserve">, </w:t>
-      </w:r>
-      <w:r>
-        <w:rPr>
-          <w:rFonts w:ascii="MesloLGM Nerd Font Mono" w:eastAsia="Times New Roman" w:hAnsi="MesloLGM Nerd Font Mono" w:cs="MesloLGM Nerd Font Mono"/>
-          <w:color w:val="4FC1FF"/>
-          <w:kern w:val="0"/>
-          <w:sz w:val="21"/>
-          <w:szCs w:val="21"/>
-          <w:lang w:eastAsia="fr-FR"/>
-          <w14:ligatures w14:val="none"/>
-        </w:rPr>
-        <w:t>LISTENING_PORT</w:t>
-      </w:r>
-      <w:proofErr w:type="gramStart"/>
-      <w:r>
-        <w:rPr>
-          <w:rFonts w:ascii="MesloLGM Nerd Font Mono" w:eastAsia="Times New Roman" w:hAnsi="MesloLGM Nerd Font Mono" w:cs="MesloLGM Nerd Font Mono"/>
-          <w:color w:val="D4D4D4"/>
-          <w:kern w:val="0"/>
-          <w:sz w:val="21"/>
-          <w:szCs w:val="21"/>
-          <w:lang w:eastAsia="fr-FR"/>
-          <w14:ligatures w14:val="none"/>
-        </w:rPr>
-        <w:t>);</w:t>
-      </w:r>
-      <w:proofErr w:type="gramEnd"/>
-    </w:p>
-    <w:p>
-      <w:r>
-        <w:t>C’est la méthode centrale qui ajoute :</w:t>
-      </w:r>
-    </w:p>
-    <w:p>
-      <w:pPr>
-        <w:numPr>
-          <w:ilvl w:val="0"/>
-          <w:numId w:val="9"/>
-        </w:numPr>
-      </w:pPr>
-      <w:proofErr w:type="gramStart"/>
-      <w:r>
-        <w:t>la</w:t>
-      </w:r>
-      <w:proofErr w:type="gramEnd"/>
-      <w:r>
-        <w:t xml:space="preserve"> route /</w:t>
-      </w:r>
-    </w:p>
-    <w:p>
-      <w:pPr>
-        <w:numPr>
-          <w:ilvl w:val="0"/>
-          <w:numId w:val="9"/>
-        </w:numPr>
-      </w:pPr>
-      <w:proofErr w:type="gramStart"/>
-      <w:r>
-        <w:t>la</w:t>
-      </w:r>
-      <w:proofErr w:type="gramEnd"/>
-      <w:r>
-        <w:t xml:space="preserve"> route /oauth2callback</w:t>
-      </w:r>
-    </w:p>
-    <w:p>
-      <w:pPr>
-        <w:numPr>
-          <w:ilvl w:val="0"/>
-          <w:numId w:val="9"/>
-        </w:numPr>
-      </w:pPr>
-      <w:proofErr w:type="gramStart"/>
-      <w:r>
-        <w:t>la</w:t>
-      </w:r>
-      <w:proofErr w:type="gramEnd"/>
-      <w:r>
-        <w:t xml:space="preserve"> route /</w:t>
-      </w:r>
-      <w:proofErr w:type="spellStart"/>
-      <w:r>
-        <w:t>revoke</w:t>
-      </w:r>
-      <w:proofErr w:type="spellEnd"/>
-    </w:p>
-    <w:p>
-      <w:pPr>
-        <w:rPr>
-          <w:b/>
-          <w:bCs/>
-        </w:rPr>
-      </w:pPr>
-      <w:r>
-        <w:rPr>
-          <w:b/>
-          <w:bCs/>
-        </w:rPr>
         <w:t>4. Ce que la classe fait pour toi</w:t>
       </w:r>
     </w:p>
@@ -1419,13 +1355,8 @@
           <w:numId w:val="10"/>
         </w:numPr>
       </w:pPr>
-      <w:proofErr w:type="gramStart"/>
-      <w:r>
-        <w:t>création</w:t>
-      </w:r>
-      <w:proofErr w:type="gramEnd"/>
-      <w:r>
-        <w:t xml:space="preserve"> du client OAuth2</w:t>
+      <w:r>
+        <w:t>création du client OAuth2</w:t>
       </w:r>
     </w:p>
     <w:p>
@@ -1435,13 +1366,8 @@
           <w:numId w:val="10"/>
         </w:numPr>
       </w:pPr>
-      <w:proofErr w:type="gramStart"/>
-      <w:r>
-        <w:t>génération</w:t>
-      </w:r>
-      <w:proofErr w:type="gramEnd"/>
-      <w:r>
-        <w:t xml:space="preserve"> de l’URL de connexion</w:t>
+      <w:r>
+        <w:t>génération de l’URL de connexion</w:t>
       </w:r>
     </w:p>
     <w:p>
@@ -1451,13 +1377,8 @@
           <w:numId w:val="10"/>
         </w:numPr>
       </w:pPr>
-      <w:proofErr w:type="gramStart"/>
-      <w:r>
-        <w:t>traitement</w:t>
-      </w:r>
-      <w:proofErr w:type="gramEnd"/>
-      <w:r>
-        <w:t xml:space="preserve"> du callback Google</w:t>
+      <w:r>
+        <w:t>traitement du callback Google</w:t>
       </w:r>
     </w:p>
     <w:p>
@@ -1467,13 +1388,8 @@
           <w:numId w:val="10"/>
         </w:numPr>
       </w:pPr>
-      <w:proofErr w:type="gramStart"/>
-      <w:r>
-        <w:t>récupération</w:t>
-      </w:r>
-      <w:proofErr w:type="gramEnd"/>
-      <w:r>
-        <w:t xml:space="preserve"> des </w:t>
+      <w:r>
+        <w:t xml:space="preserve">récupération des </w:t>
       </w:r>
       <w:proofErr w:type="spellStart"/>
       <w:r>
@@ -1488,13 +1404,8 @@
           <w:numId w:val="10"/>
         </w:numPr>
       </w:pPr>
-      <w:proofErr w:type="gramStart"/>
-      <w:r>
-        <w:t>appel</w:t>
-      </w:r>
-      <w:proofErr w:type="gramEnd"/>
-      <w:r>
-        <w:t xml:space="preserve"> à l’API YouTube</w:t>
+      <w:r>
+        <w:t>appel à l’API YouTube</w:t>
       </w:r>
     </w:p>
     <w:p>
@@ -1504,13 +1415,8 @@
           <w:numId w:val="10"/>
         </w:numPr>
       </w:pPr>
-      <w:proofErr w:type="gramStart"/>
-      <w:r>
-        <w:t>révocation</w:t>
-      </w:r>
-      <w:proofErr w:type="gramEnd"/>
-      <w:r>
-        <w:t xml:space="preserve"> du </w:t>
+      <w:r>
+        <w:t xml:space="preserve">révocation du </w:t>
       </w:r>
       <w:proofErr w:type="spellStart"/>
       <w:r>
@@ -1568,7 +1474,6 @@
           <w14:ligatures w14:val="none"/>
         </w:rPr>
       </w:pPr>
-      <w:proofErr w:type="gramStart"/>
       <w:r>
         <w:rPr>
           <w:rFonts w:ascii="MesloLGM Nerd Font Mono" w:eastAsia="Times New Roman" w:hAnsi="MesloLGM Nerd Font Mono" w:cs="MesloLGM Nerd Font Mono"/>
@@ -1603,33 +1508,7 @@
           <w:lang w:val="en-US" w:eastAsia="fr-FR"/>
           <w14:ligatures w14:val="none"/>
         </w:rPr>
-        <w:t>initOAuth</w:t>
-      </w:r>
-      <w:proofErr w:type="gramEnd"/>
-      <w:r>
-        <w:rPr>
-          <w:rFonts w:ascii="MesloLGM Nerd Font Mono" w:eastAsia="Times New Roman" w:hAnsi="MesloLGM Nerd Font Mono" w:cs="MesloLGM Nerd Font Mono"/>
-          <w:color w:val="DCDCAA"/>
-          <w:kern w:val="0"/>
-          <w:sz w:val="21"/>
-          <w:szCs w:val="21"/>
-          <w:lang w:val="en-US" w:eastAsia="fr-FR"/>
-          <w14:ligatures w14:val="none"/>
-        </w:rPr>
-        <w:t>2</w:t>
-      </w:r>
-      <w:proofErr w:type="gramStart"/>
-      <w:r>
-        <w:rPr>
-          <w:rFonts w:ascii="MesloLGM Nerd Font Mono" w:eastAsia="Times New Roman" w:hAnsi="MesloLGM Nerd Font Mono" w:cs="MesloLGM Nerd Font Mono"/>
-          <w:color w:val="DCDCAA"/>
-          <w:kern w:val="0"/>
-          <w:sz w:val="21"/>
-          <w:szCs w:val="21"/>
-          <w:lang w:val="en-US" w:eastAsia="fr-FR"/>
-          <w14:ligatures w14:val="none"/>
-        </w:rPr>
-        <w:t>Client</w:t>
+        <w:t>initOAuth2Client</w:t>
       </w:r>
       <w:r>
         <w:rPr>
@@ -1643,7 +1522,6 @@
         </w:rPr>
         <w:t>(</w:t>
       </w:r>
-      <w:proofErr w:type="gramEnd"/>
       <w:r>
         <w:rPr>
           <w:rFonts w:ascii="MesloLGM Nerd Font Mono" w:eastAsia="Times New Roman" w:hAnsi="MesloLGM Nerd Font Mono" w:cs="MesloLGM Nerd Font Mono"/>
@@ -1704,7 +1582,6 @@
         <w:spacing w:after="0" w:line="300" w:lineRule="atLeast"/>
       </w:pPr>
       <w:proofErr w:type="spellStart"/>
-      <w:proofErr w:type="gramStart"/>
       <w:r>
         <w:rPr>
           <w:rFonts w:ascii="MesloLGM Nerd Font Mono" w:eastAsia="Times New Roman" w:hAnsi="MesloLGM Nerd Font Mono" w:cs="MesloLGM Nerd Font Mono"/>
@@ -1742,7 +1619,6 @@
         <w:t>loadRoutes</w:t>
       </w:r>
       <w:proofErr w:type="spellEnd"/>
-      <w:proofErr w:type="gramEnd"/>
       <w:r>
         <w:rPr>
           <w:rFonts w:ascii="MesloLGM Nerd Font Mono" w:eastAsia="Times New Roman" w:hAnsi="MesloLGM Nerd Font Mono" w:cs="MesloLGM Nerd Font Mono"/>
@@ -1791,7 +1667,6 @@
         </w:rPr>
         <w:t>LISTENING_PORT</w:t>
       </w:r>
-      <w:proofErr w:type="gramStart"/>
       <w:r>
         <w:rPr>
           <w:rFonts w:ascii="MesloLGM Nerd Font Mono" w:eastAsia="Times New Roman" w:hAnsi="MesloLGM Nerd Font Mono" w:cs="MesloLGM Nerd Font Mono"/>
@@ -1804,7 +1679,6 @@
         </w:rPr>
         <w:t>);</w:t>
       </w:r>
-      <w:proofErr w:type="gramEnd"/>
     </w:p>
     <w:p>
       <w:r>
@@ -1862,7 +1736,6 @@
         </w:rPr>
       </w:pPr>
       <w:proofErr w:type="spellStart"/>
-      <w:proofErr w:type="gramStart"/>
       <w:r>
         <w:rPr>
           <w:rFonts w:ascii="MesloLGM Nerd Font Mono" w:eastAsia="Times New Roman" w:hAnsi="MesloLGM Nerd Font Mono" w:cs="MesloLGM Nerd Font Mono"/>
@@ -1876,7 +1749,6 @@
         <w:t>const</w:t>
       </w:r>
       <w:proofErr w:type="spellEnd"/>
-      <w:proofErr w:type="gramEnd"/>
       <w:r>
         <w:rPr>
           <w:rFonts w:ascii="MesloLGM Nerd Font Mono" w:eastAsia="Times New Roman" w:hAnsi="MesloLGM Nerd Font Mono" w:cs="MesloLGM Nerd Font Mono"/>
@@ -1887,9 +1759,22 @@
           <w:lang w:eastAsia="fr-FR"/>
           <w14:ligatures w14:val="none"/>
         </w:rPr>
-        <w:t xml:space="preserve"> </w:t>
-      </w:r>
-      <w:proofErr w:type="gramStart"/>
+        <w:t xml:space="preserve"> { </w:t>
+      </w:r>
+      <w:proofErr w:type="spellStart"/>
+      <w:r>
+        <w:rPr>
+          <w:rFonts w:ascii="MesloLGM Nerd Font Mono" w:eastAsia="Times New Roman" w:hAnsi="MesloLGM Nerd Font Mono" w:cs="MesloLGM Nerd Font Mono"/>
+          <w:color w:val="4FC1FF"/>
+          <w:kern w:val="0"/>
+          <w:sz w:val="21"/>
+          <w:szCs w:val="21"/>
+          <w:lang w:eastAsia="fr-FR"/>
+          <w14:ligatures w14:val="none"/>
+        </w:rPr>
+        <w:t>GoogleService</w:t>
+      </w:r>
+      <w:proofErr w:type="spellEnd"/>
       <w:r>
         <w:rPr>
           <w:rFonts w:ascii="MesloLGM Nerd Font Mono" w:eastAsia="Times New Roman" w:hAnsi="MesloLGM Nerd Font Mono" w:cs="MesloLGM Nerd Font Mono"/>
@@ -1900,9 +1785,121 @@
           <w:lang w:eastAsia="fr-FR"/>
           <w14:ligatures w14:val="none"/>
         </w:rPr>
-        <w:t xml:space="preserve">{ </w:t>
+        <w:t xml:space="preserve"> } = </w:t>
       </w:r>
       <w:proofErr w:type="spellStart"/>
+      <w:r>
+        <w:rPr>
+          <w:rFonts w:ascii="MesloLGM Nerd Font Mono" w:eastAsia="Times New Roman" w:hAnsi="MesloLGM Nerd Font Mono" w:cs="MesloLGM Nerd Font Mono"/>
+          <w:color w:val="DCDCAA"/>
+          <w:kern w:val="0"/>
+          <w:sz w:val="21"/>
+          <w:szCs w:val="21"/>
+          <w:lang w:eastAsia="fr-FR"/>
+          <w14:ligatures w14:val="none"/>
+        </w:rPr>
+        <w:t>require</w:t>
+      </w:r>
+      <w:proofErr w:type="spellEnd"/>
+      <w:r>
+        <w:rPr>
+          <w:rFonts w:ascii="MesloLGM Nerd Font Mono" w:eastAsia="Times New Roman" w:hAnsi="MesloLGM Nerd Font Mono" w:cs="MesloLGM Nerd Font Mono"/>
+          <w:color w:val="D4D4D4"/>
+          <w:kern w:val="0"/>
+          <w:sz w:val="21"/>
+          <w:szCs w:val="21"/>
+          <w:lang w:eastAsia="fr-FR"/>
+          <w14:ligatures w14:val="none"/>
+        </w:rPr>
+        <w:t>(</w:t>
+      </w:r>
+      <w:r>
+        <w:rPr>
+          <w:rFonts w:ascii="MesloLGM Nerd Font Mono" w:eastAsia="Times New Roman" w:hAnsi="MesloLGM Nerd Font Mono" w:cs="MesloLGM Nerd Font Mono"/>
+          <w:color w:val="CE9178"/>
+          <w:kern w:val="0"/>
+          <w:sz w:val="21"/>
+          <w:szCs w:val="21"/>
+          <w:lang w:eastAsia="fr-FR"/>
+          <w14:ligatures w14:val="none"/>
+        </w:rPr>
+        <w:t>'./services/</w:t>
+      </w:r>
+      <w:proofErr w:type="spellStart"/>
+      <w:r>
+        <w:rPr>
+          <w:rFonts w:ascii="MesloLGM Nerd Font Mono" w:eastAsia="Times New Roman" w:hAnsi="MesloLGM Nerd Font Mono" w:cs="MesloLGM Nerd Font Mono"/>
+          <w:color w:val="CE9178"/>
+          <w:kern w:val="0"/>
+          <w:sz w:val="21"/>
+          <w:szCs w:val="21"/>
+          <w:lang w:eastAsia="fr-FR"/>
+          <w14:ligatures w14:val="none"/>
+        </w:rPr>
+        <w:t>google.service</w:t>
+      </w:r>
+      <w:proofErr w:type="spellEnd"/>
+      <w:r>
+        <w:rPr>
+          <w:rFonts w:ascii="MesloLGM Nerd Font Mono" w:eastAsia="Times New Roman" w:hAnsi="MesloLGM Nerd Font Mono" w:cs="MesloLGM Nerd Font Mono"/>
+          <w:color w:val="CE9178"/>
+          <w:kern w:val="0"/>
+          <w:sz w:val="21"/>
+          <w:szCs w:val="21"/>
+          <w:lang w:eastAsia="fr-FR"/>
+          <w14:ligatures w14:val="none"/>
+        </w:rPr>
+        <w:t>'</w:t>
+      </w:r>
+      <w:r>
+        <w:rPr>
+          <w:rFonts w:ascii="MesloLGM Nerd Font Mono" w:eastAsia="Times New Roman" w:hAnsi="MesloLGM Nerd Font Mono" w:cs="MesloLGM Nerd Font Mono"/>
+          <w:color w:val="D4D4D4"/>
+          <w:kern w:val="0"/>
+          <w:sz w:val="21"/>
+          <w:szCs w:val="21"/>
+          <w:lang w:eastAsia="fr-FR"/>
+          <w14:ligatures w14:val="none"/>
+        </w:rPr>
+        <w:t>);</w:t>
+      </w:r>
+    </w:p>
+    <w:p>
+      <w:pPr>
+        <w:pStyle w:val="Paragraphedeliste"/>
+        <w:numPr>
+          <w:ilvl w:val="0"/>
+          <w:numId w:val="12"/>
+        </w:numPr>
+        <w:shd w:val="clear" w:color="auto" w:fill="002060"/>
+        <w:spacing w:after="0" w:line="300" w:lineRule="atLeast"/>
+      </w:pPr>
+      <w:proofErr w:type="spellStart"/>
+      <w:r>
+        <w:rPr>
+          <w:rFonts w:ascii="MesloLGM Nerd Font Mono" w:eastAsia="Times New Roman" w:hAnsi="MesloLGM Nerd Font Mono" w:cs="MesloLGM Nerd Font Mono"/>
+          <w:color w:val="569CD6"/>
+          <w:kern w:val="0"/>
+          <w:sz w:val="21"/>
+          <w:szCs w:val="21"/>
+          <w:lang w:eastAsia="fr-FR"/>
+          <w14:ligatures w14:val="none"/>
+        </w:rPr>
+        <w:t>const</w:t>
+      </w:r>
+      <w:proofErr w:type="spellEnd"/>
+      <w:r>
+        <w:rPr>
+          <w:rFonts w:ascii="MesloLGM Nerd Font Mono" w:eastAsia="Times New Roman" w:hAnsi="MesloLGM Nerd Font Mono" w:cs="MesloLGM Nerd Font Mono"/>
+          <w:color w:val="D4D4D4"/>
+          <w:kern w:val="0"/>
+          <w:sz w:val="21"/>
+          <w:szCs w:val="21"/>
+          <w:lang w:eastAsia="fr-FR"/>
+          <w14:ligatures w14:val="none"/>
+        </w:rPr>
+        <w:t xml:space="preserve"> </w:t>
+      </w:r>
       <w:r>
         <w:rPr>
           <w:rFonts w:ascii="MesloLGM Nerd Font Mono" w:eastAsia="Times New Roman" w:hAnsi="MesloLGM Nerd Font Mono" w:cs="MesloLGM Nerd Font Mono"/>
@@ -1913,10 +1910,8 @@
           <w:lang w:eastAsia="fr-FR"/>
           <w14:ligatures w14:val="none"/>
         </w:rPr>
-        <w:t>GoogleService</w:t>
-      </w:r>
-      <w:proofErr w:type="spellEnd"/>
-      <w:proofErr w:type="gramEnd"/>
+        <w:t>google</w:t>
+      </w:r>
       <w:r>
         <w:rPr>
           <w:rFonts w:ascii="MesloLGM Nerd Font Mono" w:eastAsia="Times New Roman" w:hAnsi="MesloLGM Nerd Font Mono" w:cs="MesloLGM Nerd Font Mono"/>
@@ -1927,7 +1922,31 @@
           <w:lang w:eastAsia="fr-FR"/>
           <w14:ligatures w14:val="none"/>
         </w:rPr>
-        <w:t xml:space="preserve"> } = </w:t>
+        <w:t xml:space="preserve"> = </w:t>
+      </w:r>
+      <w:r>
+        <w:rPr>
+          <w:rFonts w:ascii="MesloLGM Nerd Font Mono" w:eastAsia="Times New Roman" w:hAnsi="MesloLGM Nerd Font Mono" w:cs="MesloLGM Nerd Font Mono"/>
+          <w:color w:val="569CD6"/>
+          <w:kern w:val="0"/>
+          <w:sz w:val="21"/>
+          <w:szCs w:val="21"/>
+          <w:lang w:eastAsia="fr-FR"/>
+          <w14:ligatures w14:val="none"/>
+        </w:rPr>
+        <w:t>new</w:t>
+      </w:r>
+      <w:r>
+        <w:rPr>
+          <w:rFonts w:ascii="MesloLGM Nerd Font Mono" w:eastAsia="Times New Roman" w:hAnsi="MesloLGM Nerd Font Mono" w:cs="MesloLGM Nerd Font Mono"/>
+          <w:color w:val="D4D4D4"/>
+          <w:kern w:val="0"/>
+          <w:sz w:val="21"/>
+          <w:szCs w:val="21"/>
+          <w:lang w:eastAsia="fr-FR"/>
+          <w14:ligatures w14:val="none"/>
+        </w:rPr>
+        <w:t xml:space="preserve"> </w:t>
       </w:r>
       <w:proofErr w:type="spellStart"/>
       <w:r>
@@ -1940,7 +1959,7 @@
           <w:lang w:eastAsia="fr-FR"/>
           <w14:ligatures w14:val="none"/>
         </w:rPr>
-        <w:t>require</w:t>
+        <w:t>GoogleService</w:t>
       </w:r>
       <w:proofErr w:type="spellEnd"/>
       <w:r>
@@ -1953,7 +1972,105 @@
           <w:lang w:eastAsia="fr-FR"/>
           <w14:ligatures w14:val="none"/>
         </w:rPr>
+        <w:t>();</w:t>
+      </w:r>
+    </w:p>
+    <w:p>
+      <w:r>
+        <w:lastRenderedPageBreak/>
+        <w:t>Puis appeler :</w:t>
+      </w:r>
+    </w:p>
+    <w:p>
+      <w:pPr>
+        <w:pStyle w:val="Paragraphedeliste"/>
+        <w:numPr>
+          <w:ilvl w:val="0"/>
+          <w:numId w:val="12"/>
+        </w:numPr>
+        <w:shd w:val="clear" w:color="auto" w:fill="1E1E1E"/>
+        <w:spacing w:after="0" w:line="300" w:lineRule="atLeast"/>
+        <w:rPr>
+          <w:rFonts w:ascii="MesloLGM Nerd Font Mono" w:eastAsia="Times New Roman" w:hAnsi="MesloLGM Nerd Font Mono" w:cs="MesloLGM Nerd Font Mono"/>
+          <w:color w:val="D4D4D4"/>
+          <w:kern w:val="0"/>
+          <w:sz w:val="21"/>
+          <w:szCs w:val="21"/>
+          <w:lang w:eastAsia="fr-FR"/>
+          <w14:ligatures w14:val="none"/>
+        </w:rPr>
+      </w:pPr>
+      <w:r>
+        <w:rPr>
+          <w:rFonts w:ascii="MesloLGM Nerd Font Mono" w:eastAsia="Times New Roman" w:hAnsi="MesloLGM Nerd Font Mono" w:cs="MesloLGM Nerd Font Mono"/>
+          <w:color w:val="9CDCFE"/>
+          <w:kern w:val="0"/>
+          <w:sz w:val="21"/>
+          <w:szCs w:val="21"/>
+          <w:lang w:eastAsia="fr-FR"/>
+          <w14:ligatures w14:val="none"/>
+        </w:rPr>
+        <w:t>google</w:t>
+      </w:r>
+      <w:r>
+        <w:rPr>
+          <w:rFonts w:ascii="MesloLGM Nerd Font Mono" w:eastAsia="Times New Roman" w:hAnsi="MesloLGM Nerd Font Mono" w:cs="MesloLGM Nerd Font Mono"/>
+          <w:color w:val="D4D4D4"/>
+          <w:kern w:val="0"/>
+          <w:sz w:val="21"/>
+          <w:szCs w:val="21"/>
+          <w:lang w:eastAsia="fr-FR"/>
+          <w14:ligatures w14:val="none"/>
+        </w:rPr>
+        <w:t>.</w:t>
+      </w:r>
+      <w:r>
+        <w:rPr>
+          <w:rFonts w:ascii="MesloLGM Nerd Font Mono" w:eastAsia="Times New Roman" w:hAnsi="MesloLGM Nerd Font Mono" w:cs="MesloLGM Nerd Font Mono"/>
+          <w:color w:val="DCDCAA"/>
+          <w:kern w:val="0"/>
+          <w:sz w:val="21"/>
+          <w:szCs w:val="21"/>
+          <w:lang w:eastAsia="fr-FR"/>
+          <w14:ligatures w14:val="none"/>
+        </w:rPr>
+        <w:t>initOAuth2Client</w:t>
+      </w:r>
+      <w:r>
+        <w:rPr>
+          <w:rFonts w:ascii="MesloLGM Nerd Font Mono" w:eastAsia="Times New Roman" w:hAnsi="MesloLGM Nerd Font Mono" w:cs="MesloLGM Nerd Font Mono"/>
+          <w:color w:val="D4D4D4"/>
+          <w:kern w:val="0"/>
+          <w:sz w:val="21"/>
+          <w:szCs w:val="21"/>
+          <w:lang w:eastAsia="fr-FR"/>
+          <w14:ligatures w14:val="none"/>
+        </w:rPr>
         <w:t>(</w:t>
+      </w:r>
+      <w:r>
+        <w:rPr>
+          <w:rFonts w:ascii="MesloLGM Nerd Font Mono" w:eastAsia="Times New Roman" w:hAnsi="MesloLGM Nerd Font Mono" w:cs="MesloLGM Nerd Font Mono"/>
+          <w:color w:val="B5CEA8"/>
+          <w:kern w:val="0"/>
+          <w:sz w:val="21"/>
+          <w:szCs w:val="21"/>
+          <w:lang w:eastAsia="fr-FR"/>
+          <w14:ligatures w14:val="none"/>
+        </w:rPr>
+        <w:t>8080</w:t>
+      </w:r>
+      <w:r>
+        <w:rPr>
+          <w:rFonts w:ascii="MesloLGM Nerd Font Mono" w:eastAsia="Times New Roman" w:hAnsi="MesloLGM Nerd Font Mono" w:cs="MesloLGM Nerd Font Mono"/>
+          <w:color w:val="D4D4D4"/>
+          <w:kern w:val="0"/>
+          <w:sz w:val="21"/>
+          <w:szCs w:val="21"/>
+          <w:lang w:eastAsia="fr-FR"/>
+          <w14:ligatures w14:val="none"/>
+        </w:rPr>
+        <w:t xml:space="preserve">, </w:t>
       </w:r>
       <w:r>
         <w:rPr>
@@ -1965,35 +2082,8 @@
           <w:lang w:eastAsia="fr-FR"/>
           <w14:ligatures w14:val="none"/>
         </w:rPr>
-        <w:t>'./services/</w:t>
-      </w:r>
-      <w:proofErr w:type="spellStart"/>
-      <w:r>
-        <w:rPr>
-          <w:rFonts w:ascii="MesloLGM Nerd Font Mono" w:eastAsia="Times New Roman" w:hAnsi="MesloLGM Nerd Font Mono" w:cs="MesloLGM Nerd Font Mono"/>
-          <w:color w:val="CE9178"/>
-          <w:kern w:val="0"/>
-          <w:sz w:val="21"/>
-          <w:szCs w:val="21"/>
-          <w:lang w:eastAsia="fr-FR"/>
-          <w14:ligatures w14:val="none"/>
-        </w:rPr>
-        <w:t>google.service</w:t>
-      </w:r>
-      <w:proofErr w:type="spellEnd"/>
-      <w:r>
-        <w:rPr>
-          <w:rFonts w:ascii="MesloLGM Nerd Font Mono" w:eastAsia="Times New Roman" w:hAnsi="MesloLGM Nerd Font Mono" w:cs="MesloLGM Nerd Font Mono"/>
-          <w:color w:val="CE9178"/>
-          <w:kern w:val="0"/>
-          <w:sz w:val="21"/>
-          <w:szCs w:val="21"/>
-          <w:lang w:eastAsia="fr-FR"/>
-          <w14:ligatures w14:val="none"/>
-        </w:rPr>
-        <w:t>'</w:t>
-      </w:r>
-      <w:proofErr w:type="gramStart"/>
+        <w:t>'oauth2callback'</w:t>
+      </w:r>
       <w:r>
         <w:rPr>
           <w:rFonts w:ascii="MesloLGM Nerd Font Mono" w:eastAsia="Times New Roman" w:hAnsi="MesloLGM Nerd Font Mono" w:cs="MesloLGM Nerd Font Mono"/>
@@ -2006,7 +2096,6 @@
         </w:rPr>
         <w:t>);</w:t>
       </w:r>
-      <w:proofErr w:type="gramEnd"/>
     </w:p>
     <w:p>
       <w:pPr>
@@ -2015,26 +2104,8 @@
           <w:ilvl w:val="0"/>
           <w:numId w:val="12"/>
         </w:numPr>
-        <w:shd w:val="clear" w:color="auto" w:fill="002060"/>
+        <w:shd w:val="clear" w:color="auto" w:fill="1E1E1E"/>
         <w:spacing w:after="0" w:line="300" w:lineRule="atLeast"/>
-      </w:pPr>
-      <w:proofErr w:type="spellStart"/>
-      <w:proofErr w:type="gramStart"/>
-      <w:r>
-        <w:rPr>
-          <w:rFonts w:ascii="MesloLGM Nerd Font Mono" w:eastAsia="Times New Roman" w:hAnsi="MesloLGM Nerd Font Mono" w:cs="MesloLGM Nerd Font Mono"/>
-          <w:color w:val="569CD6"/>
-          <w:kern w:val="0"/>
-          <w:sz w:val="21"/>
-          <w:szCs w:val="21"/>
-          <w:lang w:eastAsia="fr-FR"/>
-          <w14:ligatures w14:val="none"/>
-        </w:rPr>
-        <w:t>const</w:t>
-      </w:r>
-      <w:proofErr w:type="spellEnd"/>
-      <w:proofErr w:type="gramEnd"/>
-      <w:r>
         <w:rPr>
           <w:rFonts w:ascii="MesloLGM Nerd Font Mono" w:eastAsia="Times New Roman" w:hAnsi="MesloLGM Nerd Font Mono" w:cs="MesloLGM Nerd Font Mono"/>
           <w:color w:val="D4D4D4"/>
@@ -2044,12 +2115,12 @@
           <w:lang w:eastAsia="fr-FR"/>
           <w14:ligatures w14:val="none"/>
         </w:rPr>
-        <w:t xml:space="preserve"> </w:t>
-      </w:r>
+      </w:pPr>
+      <w:proofErr w:type="spellStart"/>
       <w:r>
         <w:rPr>
           <w:rFonts w:ascii="MesloLGM Nerd Font Mono" w:eastAsia="Times New Roman" w:hAnsi="MesloLGM Nerd Font Mono" w:cs="MesloLGM Nerd Font Mono"/>
-          <w:color w:val="4FC1FF"/>
+          <w:color w:val="9CDCFE"/>
           <w:kern w:val="0"/>
           <w:sz w:val="21"/>
           <w:szCs w:val="21"/>
@@ -2068,20 +2139,21 @@
           <w:lang w:eastAsia="fr-FR"/>
           <w14:ligatures w14:val="none"/>
         </w:rPr>
-        <w:t xml:space="preserve"> = </w:t>
+        <w:t>.</w:t>
       </w:r>
       <w:r>
         <w:rPr>
           <w:rFonts w:ascii="MesloLGM Nerd Font Mono" w:eastAsia="Times New Roman" w:hAnsi="MesloLGM Nerd Font Mono" w:cs="MesloLGM Nerd Font Mono"/>
-          <w:color w:val="569CD6"/>
+          <w:color w:val="DCDCAA"/>
           <w:kern w:val="0"/>
           <w:sz w:val="21"/>
           <w:szCs w:val="21"/>
           <w:lang w:eastAsia="fr-FR"/>
           <w14:ligatures w14:val="none"/>
         </w:rPr>
-        <w:t>new</w:t>
-      </w:r>
+        <w:t>registerRoutes</w:t>
+      </w:r>
+      <w:proofErr w:type="spellEnd"/>
       <w:r>
         <w:rPr>
           <w:rFonts w:ascii="MesloLGM Nerd Font Mono" w:eastAsia="Times New Roman" w:hAnsi="MesloLGM Nerd Font Mono" w:cs="MesloLGM Nerd Font Mono"/>
@@ -2092,23 +2164,20 @@
           <w:lang w:eastAsia="fr-FR"/>
           <w14:ligatures w14:val="none"/>
         </w:rPr>
-        <w:t xml:space="preserve"> </w:t>
-      </w:r>
-      <w:proofErr w:type="spellStart"/>
-      <w:proofErr w:type="gramStart"/>
+        <w:t>(</w:t>
+      </w:r>
       <w:r>
         <w:rPr>
           <w:rFonts w:ascii="MesloLGM Nerd Font Mono" w:eastAsia="Times New Roman" w:hAnsi="MesloLGM Nerd Font Mono" w:cs="MesloLGM Nerd Font Mono"/>
-          <w:color w:val="DCDCAA"/>
+          <w:color w:val="9CDCFE"/>
           <w:kern w:val="0"/>
           <w:sz w:val="21"/>
           <w:szCs w:val="21"/>
           <w:lang w:eastAsia="fr-FR"/>
           <w14:ligatures w14:val="none"/>
         </w:rPr>
-        <w:t>GoogleService</w:t>
-      </w:r>
-      <w:proofErr w:type="spellEnd"/>
+        <w:t>app</w:t>
+      </w:r>
       <w:r>
         <w:rPr>
           <w:rFonts w:ascii="MesloLGM Nerd Font Mono" w:eastAsia="Times New Roman" w:hAnsi="MesloLGM Nerd Font Mono" w:cs="MesloLGM Nerd Font Mono"/>
@@ -2119,24 +2188,21 @@
           <w:lang w:eastAsia="fr-FR"/>
           <w14:ligatures w14:val="none"/>
         </w:rPr>
-        <w:t>();</w:t>
-      </w:r>
-      <w:proofErr w:type="gramEnd"/>
-    </w:p>
-    <w:p>
-      <w:r>
-        <w:t>Puis appeler :</w:t>
-      </w:r>
-    </w:p>
-    <w:p>
-      <w:pPr>
-        <w:pStyle w:val="Paragraphedeliste"/>
-        <w:numPr>
-          <w:ilvl w:val="0"/>
-          <w:numId w:val="12"/>
-        </w:numPr>
-        <w:shd w:val="clear" w:color="auto" w:fill="1E1E1E"/>
-        <w:spacing w:after="0" w:line="300" w:lineRule="atLeast"/>
+        <w:t xml:space="preserve">, </w:t>
+      </w:r>
+      <w:r>
+        <w:rPr>
+          <w:rFonts w:ascii="MesloLGM Nerd Font Mono" w:eastAsia="Times New Roman" w:hAnsi="MesloLGM Nerd Font Mono" w:cs="MesloLGM Nerd Font Mono"/>
+          <w:color w:val="B5CEA8"/>
+          <w:kern w:val="0"/>
+          <w:sz w:val="21"/>
+          <w:szCs w:val="21"/>
+          <w:lang w:eastAsia="fr-FR"/>
+          <w14:ligatures w14:val="none"/>
+        </w:rPr>
+        <w:t>8080</w:t>
+      </w:r>
+      <w:r>
         <w:rPr>
           <w:rFonts w:ascii="MesloLGM Nerd Font Mono" w:eastAsia="Times New Roman" w:hAnsi="MesloLGM Nerd Font Mono" w:cs="MesloLGM Nerd Font Mono"/>
           <w:color w:val="D4D4D4"/>
@@ -2146,255 +2212,8 @@
           <w:lang w:eastAsia="fr-FR"/>
           <w14:ligatures w14:val="none"/>
         </w:rPr>
-      </w:pPr>
-      <w:proofErr w:type="gramStart"/>
-      <w:r>
-        <w:rPr>
-          <w:rFonts w:ascii="MesloLGM Nerd Font Mono" w:eastAsia="Times New Roman" w:hAnsi="MesloLGM Nerd Font Mono" w:cs="MesloLGM Nerd Font Mono"/>
-          <w:color w:val="9CDCFE"/>
-          <w:kern w:val="0"/>
-          <w:sz w:val="21"/>
-          <w:szCs w:val="21"/>
-          <w:lang w:eastAsia="fr-FR"/>
-          <w14:ligatures w14:val="none"/>
-        </w:rPr>
-        <w:t>google</w:t>
-      </w:r>
-      <w:r>
-        <w:rPr>
-          <w:rFonts w:ascii="MesloLGM Nerd Font Mono" w:eastAsia="Times New Roman" w:hAnsi="MesloLGM Nerd Font Mono" w:cs="MesloLGM Nerd Font Mono"/>
-          <w:color w:val="D4D4D4"/>
-          <w:kern w:val="0"/>
-          <w:sz w:val="21"/>
-          <w:szCs w:val="21"/>
-          <w:lang w:eastAsia="fr-FR"/>
-          <w14:ligatures w14:val="none"/>
-        </w:rPr>
-        <w:t>.</w:t>
-      </w:r>
-      <w:r>
-        <w:rPr>
-          <w:rFonts w:ascii="MesloLGM Nerd Font Mono" w:eastAsia="Times New Roman" w:hAnsi="MesloLGM Nerd Font Mono" w:cs="MesloLGM Nerd Font Mono"/>
-          <w:color w:val="DCDCAA"/>
-          <w:kern w:val="0"/>
-          <w:sz w:val="21"/>
-          <w:szCs w:val="21"/>
-          <w:lang w:eastAsia="fr-FR"/>
-          <w14:ligatures w14:val="none"/>
-        </w:rPr>
-        <w:t>initOAuth</w:t>
-      </w:r>
-      <w:proofErr w:type="gramEnd"/>
-      <w:r>
-        <w:rPr>
-          <w:rFonts w:ascii="MesloLGM Nerd Font Mono" w:eastAsia="Times New Roman" w:hAnsi="MesloLGM Nerd Font Mono" w:cs="MesloLGM Nerd Font Mono"/>
-          <w:color w:val="DCDCAA"/>
-          <w:kern w:val="0"/>
-          <w:sz w:val="21"/>
-          <w:szCs w:val="21"/>
-          <w:lang w:eastAsia="fr-FR"/>
-          <w14:ligatures w14:val="none"/>
-        </w:rPr>
-        <w:t>2</w:t>
-      </w:r>
-      <w:proofErr w:type="gramStart"/>
-      <w:r>
-        <w:rPr>
-          <w:rFonts w:ascii="MesloLGM Nerd Font Mono" w:eastAsia="Times New Roman" w:hAnsi="MesloLGM Nerd Font Mono" w:cs="MesloLGM Nerd Font Mono"/>
-          <w:color w:val="DCDCAA"/>
-          <w:kern w:val="0"/>
-          <w:sz w:val="21"/>
-          <w:szCs w:val="21"/>
-          <w:lang w:eastAsia="fr-FR"/>
-          <w14:ligatures w14:val="none"/>
-        </w:rPr>
-        <w:t>Client</w:t>
-      </w:r>
-      <w:r>
-        <w:rPr>
-          <w:rFonts w:ascii="MesloLGM Nerd Font Mono" w:eastAsia="Times New Roman" w:hAnsi="MesloLGM Nerd Font Mono" w:cs="MesloLGM Nerd Font Mono"/>
-          <w:color w:val="D4D4D4"/>
-          <w:kern w:val="0"/>
-          <w:sz w:val="21"/>
-          <w:szCs w:val="21"/>
-          <w:lang w:eastAsia="fr-FR"/>
-          <w14:ligatures w14:val="none"/>
-        </w:rPr>
-        <w:t>(</w:t>
-      </w:r>
-      <w:proofErr w:type="gramEnd"/>
-      <w:r>
-        <w:rPr>
-          <w:rFonts w:ascii="MesloLGM Nerd Font Mono" w:eastAsia="Times New Roman" w:hAnsi="MesloLGM Nerd Font Mono" w:cs="MesloLGM Nerd Font Mono"/>
-          <w:color w:val="B5CEA8"/>
-          <w:kern w:val="0"/>
-          <w:sz w:val="21"/>
-          <w:szCs w:val="21"/>
-          <w:lang w:eastAsia="fr-FR"/>
-          <w14:ligatures w14:val="none"/>
-        </w:rPr>
-        <w:t>8080</w:t>
-      </w:r>
-      <w:r>
-        <w:rPr>
-          <w:rFonts w:ascii="MesloLGM Nerd Font Mono" w:eastAsia="Times New Roman" w:hAnsi="MesloLGM Nerd Font Mono" w:cs="MesloLGM Nerd Font Mono"/>
-          <w:color w:val="D4D4D4"/>
-          <w:kern w:val="0"/>
-          <w:sz w:val="21"/>
-          <w:szCs w:val="21"/>
-          <w:lang w:eastAsia="fr-FR"/>
-          <w14:ligatures w14:val="none"/>
-        </w:rPr>
-        <w:t xml:space="preserve">, </w:t>
-      </w:r>
-      <w:r>
-        <w:rPr>
-          <w:rFonts w:ascii="MesloLGM Nerd Font Mono" w:eastAsia="Times New Roman" w:hAnsi="MesloLGM Nerd Font Mono" w:cs="MesloLGM Nerd Font Mono"/>
-          <w:color w:val="CE9178"/>
-          <w:kern w:val="0"/>
-          <w:sz w:val="21"/>
-          <w:szCs w:val="21"/>
-          <w:lang w:eastAsia="fr-FR"/>
-          <w14:ligatures w14:val="none"/>
-        </w:rPr>
-        <w:t>'oauth2callback'</w:t>
-      </w:r>
-      <w:proofErr w:type="gramStart"/>
-      <w:r>
-        <w:rPr>
-          <w:rFonts w:ascii="MesloLGM Nerd Font Mono" w:eastAsia="Times New Roman" w:hAnsi="MesloLGM Nerd Font Mono" w:cs="MesloLGM Nerd Font Mono"/>
-          <w:color w:val="D4D4D4"/>
-          <w:kern w:val="0"/>
-          <w:sz w:val="21"/>
-          <w:szCs w:val="21"/>
-          <w:lang w:eastAsia="fr-FR"/>
-          <w14:ligatures w14:val="none"/>
-        </w:rPr>
         <w:t>);</w:t>
       </w:r>
-      <w:proofErr w:type="gramEnd"/>
-    </w:p>
-    <w:p>
-      <w:pPr>
-        <w:pStyle w:val="Paragraphedeliste"/>
-        <w:numPr>
-          <w:ilvl w:val="0"/>
-          <w:numId w:val="12"/>
-        </w:numPr>
-        <w:shd w:val="clear" w:color="auto" w:fill="1E1E1E"/>
-        <w:spacing w:after="0" w:line="300" w:lineRule="atLeast"/>
-        <w:rPr>
-          <w:rFonts w:ascii="MesloLGM Nerd Font Mono" w:eastAsia="Times New Roman" w:hAnsi="MesloLGM Nerd Font Mono" w:cs="MesloLGM Nerd Font Mono"/>
-          <w:color w:val="D4D4D4"/>
-          <w:kern w:val="0"/>
-          <w:sz w:val="21"/>
-          <w:szCs w:val="21"/>
-          <w:lang w:eastAsia="fr-FR"/>
-          <w14:ligatures w14:val="none"/>
-        </w:rPr>
-      </w:pPr>
-      <w:proofErr w:type="spellStart"/>
-      <w:proofErr w:type="gramStart"/>
-      <w:r>
-        <w:rPr>
-          <w:rFonts w:ascii="MesloLGM Nerd Font Mono" w:eastAsia="Times New Roman" w:hAnsi="MesloLGM Nerd Font Mono" w:cs="MesloLGM Nerd Font Mono"/>
-          <w:color w:val="9CDCFE"/>
-          <w:kern w:val="0"/>
-          <w:sz w:val="21"/>
-          <w:szCs w:val="21"/>
-          <w:lang w:eastAsia="fr-FR"/>
-          <w14:ligatures w14:val="none"/>
-        </w:rPr>
-        <w:t>google</w:t>
-      </w:r>
-      <w:r>
-        <w:rPr>
-          <w:rFonts w:ascii="MesloLGM Nerd Font Mono" w:eastAsia="Times New Roman" w:hAnsi="MesloLGM Nerd Font Mono" w:cs="MesloLGM Nerd Font Mono"/>
-          <w:color w:val="D4D4D4"/>
-          <w:kern w:val="0"/>
-          <w:sz w:val="21"/>
-          <w:szCs w:val="21"/>
-          <w:lang w:eastAsia="fr-FR"/>
-          <w14:ligatures w14:val="none"/>
-        </w:rPr>
-        <w:t>.</w:t>
-      </w:r>
-      <w:r>
-        <w:rPr>
-          <w:rFonts w:ascii="MesloLGM Nerd Font Mono" w:eastAsia="Times New Roman" w:hAnsi="MesloLGM Nerd Font Mono" w:cs="MesloLGM Nerd Font Mono"/>
-          <w:color w:val="DCDCAA"/>
-          <w:kern w:val="0"/>
-          <w:sz w:val="21"/>
-          <w:szCs w:val="21"/>
-          <w:lang w:eastAsia="fr-FR"/>
-          <w14:ligatures w14:val="none"/>
-        </w:rPr>
-        <w:t>registerRoutes</w:t>
-      </w:r>
-      <w:proofErr w:type="spellEnd"/>
-      <w:proofErr w:type="gramEnd"/>
-      <w:r>
-        <w:rPr>
-          <w:rFonts w:ascii="MesloLGM Nerd Font Mono" w:eastAsia="Times New Roman" w:hAnsi="MesloLGM Nerd Font Mono" w:cs="MesloLGM Nerd Font Mono"/>
-          <w:color w:val="D4D4D4"/>
-          <w:kern w:val="0"/>
-          <w:sz w:val="21"/>
-          <w:szCs w:val="21"/>
-          <w:lang w:eastAsia="fr-FR"/>
-          <w14:ligatures w14:val="none"/>
-        </w:rPr>
-        <w:t>(</w:t>
-      </w:r>
-      <w:r>
-        <w:rPr>
-          <w:rFonts w:ascii="MesloLGM Nerd Font Mono" w:eastAsia="Times New Roman" w:hAnsi="MesloLGM Nerd Font Mono" w:cs="MesloLGM Nerd Font Mono"/>
-          <w:color w:val="9CDCFE"/>
-          <w:kern w:val="0"/>
-          <w:sz w:val="21"/>
-          <w:szCs w:val="21"/>
-          <w:lang w:eastAsia="fr-FR"/>
-          <w14:ligatures w14:val="none"/>
-        </w:rPr>
-        <w:t>app</w:t>
-      </w:r>
-      <w:r>
-        <w:rPr>
-          <w:rFonts w:ascii="MesloLGM Nerd Font Mono" w:eastAsia="Times New Roman" w:hAnsi="MesloLGM Nerd Font Mono" w:cs="MesloLGM Nerd Font Mono"/>
-          <w:color w:val="D4D4D4"/>
-          <w:kern w:val="0"/>
-          <w:sz w:val="21"/>
-          <w:szCs w:val="21"/>
-          <w:lang w:eastAsia="fr-FR"/>
-          <w14:ligatures w14:val="none"/>
-        </w:rPr>
-        <w:t xml:space="preserve">, </w:t>
-      </w:r>
-      <w:r>
-        <w:rPr>
-          <w:rFonts w:ascii="MesloLGM Nerd Font Mono" w:eastAsia="Times New Roman" w:hAnsi="MesloLGM Nerd Font Mono" w:cs="MesloLGM Nerd Font Mono"/>
-          <w:color w:val="B5CEA8"/>
-          <w:kern w:val="0"/>
-          <w:sz w:val="21"/>
-          <w:szCs w:val="21"/>
-          <w:lang w:eastAsia="fr-FR"/>
-          <w14:ligatures w14:val="none"/>
-        </w:rPr>
-        <w:t>8080</w:t>
-      </w:r>
-      <w:proofErr w:type="gramStart"/>
-      <w:r>
-        <w:rPr>
-          <w:rFonts w:ascii="MesloLGM Nerd Font Mono" w:eastAsia="Times New Roman" w:hAnsi="MesloLGM Nerd Font Mono" w:cs="MesloLGM Nerd Font Mono"/>
-          <w:color w:val="D4D4D4"/>
-          <w:kern w:val="0"/>
-          <w:sz w:val="21"/>
-          <w:szCs w:val="21"/>
-          <w:lang w:eastAsia="fr-FR"/>
-          <w14:ligatures w14:val="none"/>
-        </w:rPr>
-        <w:t>);</w:t>
-      </w:r>
-      <w:proofErr w:type="gramEnd"/>
     </w:p>
     <w:p>
       <w:pPr>
@@ -2430,14 +2249,8 @@
           <w:numId w:val="13"/>
         </w:numPr>
       </w:pPr>
-      <w:proofErr w:type="gramStart"/>
-      <w:r>
-        <w:lastRenderedPageBreak/>
-        <w:t>routes</w:t>
-      </w:r>
-      <w:proofErr w:type="gramEnd"/>
-      <w:r>
-        <w:t xml:space="preserve"> = réception des requêtes HTTP</w:t>
+      <w:r>
+        <w:t>routes = réception des requêtes HTTP</w:t>
       </w:r>
     </w:p>
     <w:p>
@@ -2447,13 +2260,8 @@
           <w:numId w:val="13"/>
         </w:numPr>
       </w:pPr>
-      <w:proofErr w:type="gramStart"/>
-      <w:r>
-        <w:t>service</w:t>
-      </w:r>
-      <w:proofErr w:type="gramEnd"/>
-      <w:r>
-        <w:t xml:space="preserve"> = logique Google OAuth</w:t>
+      <w:r>
+        <w:t>service = logique Google OAuth</w:t>
       </w:r>
     </w:p>
     <w:p>
@@ -2543,13 +2351,8 @@
           <w:numId w:val="14"/>
         </w:numPr>
       </w:pPr>
-      <w:proofErr w:type="gramStart"/>
-      <w:r>
-        <w:t>S:</w:t>
-      </w:r>
-      <w:proofErr w:type="gramEnd"/>
-      <w:r>
-        <w:t xml:space="preserve"> responsabilité unique</w:t>
+      <w:r>
+        <w:t>S: responsabilité unique</w:t>
       </w:r>
     </w:p>
     <w:p>
@@ -2597,13 +2400,8 @@
           <w:numId w:val="14"/>
         </w:numPr>
       </w:pPr>
-      <w:proofErr w:type="gramStart"/>
-      <w:r>
-        <w:t>O:</w:t>
-      </w:r>
-      <w:proofErr w:type="gramEnd"/>
-      <w:r>
-        <w:t xml:space="preserve"> ouvert/fermé</w:t>
+      <w:r>
+        <w:t>O: ouvert/fermé</w:t>
       </w:r>
     </w:p>
     <w:p>
@@ -2613,13 +2411,8 @@
           <w:numId w:val="14"/>
         </w:numPr>
       </w:pPr>
-      <w:proofErr w:type="gramStart"/>
-      <w:r>
-        <w:t>la</w:t>
-      </w:r>
-      <w:proofErr w:type="gramEnd"/>
-      <w:r>
-        <w:t xml:space="preserve"> logique Google est encapsulée dans une classe, donc on peut ajouter d’autres providers ou comportements sans réécrire les routes.</w:t>
+      <w:r>
+        <w:t>la logique Google est encapsulée dans une classe, donc on peut ajouter d’autres providers ou comportements sans réécrire les routes.</w:t>
       </w:r>
     </w:p>
     <w:p>
@@ -2629,13 +2422,8 @@
           <w:numId w:val="14"/>
         </w:numPr>
       </w:pPr>
-      <w:proofErr w:type="gramStart"/>
-      <w:r>
-        <w:t>D:</w:t>
-      </w:r>
-      <w:proofErr w:type="gramEnd"/>
-      <w:r>
-        <w:t xml:space="preserve"> dépendance inversée</w:t>
+      <w:r>
+        <w:t>D: dépendance inversée</w:t>
       </w:r>
     </w:p>
     <w:p>
@@ -2645,13 +2433,9 @@
           <w:numId w:val="14"/>
         </w:numPr>
       </w:pPr>
-      <w:proofErr w:type="gramStart"/>
-      <w:r>
-        <w:t>les</w:t>
-      </w:r>
-      <w:proofErr w:type="gramEnd"/>
-      <w:r>
-        <w:t xml:space="preserve"> routes dépendent d’un service abstrait en pratique via l’instance de la classe, plutôt que d’implémenter directement la logique Google.</w:t>
+      <w:r>
+        <w:lastRenderedPageBreak/>
+        <w:t>les routes dépendent d’un service abstrait en pratique via l’instance de la classe, plutôt que d’implémenter directement la logique Google.</w:t>
       </w:r>
     </w:p>
     <w:p>
@@ -2697,7 +2481,6 @@
         </w:numPr>
       </w:pPr>
       <w:r>
-        <w:lastRenderedPageBreak/>
         <w:t xml:space="preserve">La gestion des </w:t>
       </w:r>
       <w:proofErr w:type="spellStart"/>
@@ -2748,13 +2531,8 @@
           <w:numId w:val="17"/>
         </w:numPr>
       </w:pPr>
-      <w:proofErr w:type="gramStart"/>
-      <w:r>
-        <w:t>le</w:t>
-      </w:r>
-      <w:proofErr w:type="gramEnd"/>
-      <w:r>
-        <w:t xml:space="preserve"> service OAuth,</w:t>
+      <w:r>
+        <w:t>le service OAuth,</w:t>
       </w:r>
     </w:p>
     <w:p>
@@ -2764,13 +2542,8 @@
           <w:numId w:val="17"/>
         </w:numPr>
       </w:pPr>
-      <w:proofErr w:type="gramStart"/>
-      <w:r>
-        <w:t>le</w:t>
-      </w:r>
-      <w:proofErr w:type="gramEnd"/>
-      <w:r>
-        <w:t xml:space="preserve"> service YouTube,</w:t>
+      <w:r>
+        <w:t>le service YouTube,</w:t>
       </w:r>
     </w:p>
     <w:p>
@@ -2780,13 +2553,8 @@
           <w:numId w:val="17"/>
         </w:numPr>
       </w:pPr>
-      <w:proofErr w:type="gramStart"/>
-      <w:r>
-        <w:t>et</w:t>
-      </w:r>
-      <w:proofErr w:type="gramEnd"/>
-      <w:r>
-        <w:t xml:space="preserve"> un adaptateur Express.</w:t>
+      <w:r>
+        <w:t>et un adaptateur Express.</w:t>
       </w:r>
     </w:p>
     <w:p/>
@@ -2806,13 +2574,7 @@
         <w:rPr>
           <w:rStyle w:val="Titre4Car"/>
         </w:rPr>
-        <w:t xml:space="preserve">étrange de placer le code de toutes les routes dans le fichier qui concerne OAuth. Ces </w:t>
-      </w:r>
-      <w:r>
-        <w:rPr>
-          <w:rStyle w:val="Titre4Car"/>
-        </w:rPr>
-        <w:t>fonctionnalités</w:t>
+        <w:t>étrange de placer le code de toutes les routes dans le fichier qui concerne OAuth. Ces fonctionnalités</w:t>
       </w:r>
       <w:r>
         <w:t xml:space="preserve"> ne semblent pas liées directement ?</w:t>
@@ -2852,13 +2614,8 @@
           <w:numId w:val="18"/>
         </w:numPr>
       </w:pPr>
-      <w:proofErr w:type="gramStart"/>
-      <w:r>
-        <w:t>la</w:t>
-      </w:r>
-      <w:proofErr w:type="gramEnd"/>
-      <w:r>
-        <w:t xml:space="preserve"> logique métier OAuth/Google ;</w:t>
+      <w:r>
+        <w:t>la logique métier OAuth/Google ;</w:t>
       </w:r>
     </w:p>
     <w:p>
@@ -2868,13 +2625,8 @@
           <w:numId w:val="18"/>
         </w:numPr>
       </w:pPr>
-      <w:proofErr w:type="gramStart"/>
-      <w:r>
-        <w:t>la</w:t>
-      </w:r>
-      <w:proofErr w:type="gramEnd"/>
-      <w:r>
-        <w:t xml:space="preserve"> définition des routes Express et la gestion des requêtes HTTP.</w:t>
+      <w:r>
+        <w:t>la définition des routes Express et la gestion des requêtes HTTP.</w:t>
       </w:r>
     </w:p>
     <w:p>
@@ -2964,14 +2716,8 @@
           <w:numId w:val="20"/>
         </w:numPr>
       </w:pPr>
-      <w:proofErr w:type="gramStart"/>
-      <w:r>
-        <w:lastRenderedPageBreak/>
-        <w:t>les</w:t>
-      </w:r>
-      <w:proofErr w:type="gramEnd"/>
-      <w:r>
-        <w:t xml:space="preserve"> routes n’ont plus que la responsabilité de “brancher” les </w:t>
+      <w:r>
+        <w:t xml:space="preserve">les routes n’ont plus que la responsabilité de “brancher” les </w:t>
       </w:r>
       <w:proofErr w:type="spellStart"/>
       <w:r>
@@ -2989,13 +2735,8 @@
           <w:numId w:val="20"/>
         </w:numPr>
       </w:pPr>
-      <w:proofErr w:type="gramStart"/>
-      <w:r>
-        <w:t>le</w:t>
-      </w:r>
-      <w:proofErr w:type="gramEnd"/>
-      <w:r>
-        <w:t xml:space="preserve"> service ne connaît plus directement Express ;</w:t>
+      <w:r>
+        <w:t>le service ne connaît plus directement Express ;</w:t>
       </w:r>
     </w:p>
     <w:p>
@@ -3005,13 +2746,8 @@
           <w:numId w:val="20"/>
         </w:numPr>
       </w:pPr>
-      <w:proofErr w:type="gramStart"/>
-      <w:r>
-        <w:t>le</w:t>
-      </w:r>
-      <w:proofErr w:type="gramEnd"/>
-      <w:r>
-        <w:t xml:space="preserve"> contrôleur gère </w:t>
+      <w:r>
+        <w:t xml:space="preserve">le contrôleur gère </w:t>
       </w:r>
       <w:proofErr w:type="spellStart"/>
       <w:r>
@@ -3152,13 +2888,8 @@
           <w:numId w:val="24"/>
         </w:numPr>
       </w:pPr>
-      <w:proofErr w:type="gramStart"/>
-      <w:r>
-        <w:t>le</w:t>
-      </w:r>
-      <w:proofErr w:type="gramEnd"/>
-      <w:r>
-        <w:t xml:space="preserve"> contrôleur s’occupe de l’orchestration HTTP ;</w:t>
+      <w:r>
+        <w:t>le contrôleur s’occupe de l’orchestration HTTP ;</w:t>
       </w:r>
     </w:p>
     <w:p>
@@ -3168,13 +2899,8 @@
           <w:numId w:val="24"/>
         </w:numPr>
       </w:pPr>
-      <w:proofErr w:type="gramStart"/>
-      <w:r>
-        <w:t>le</w:t>
-      </w:r>
-      <w:proofErr w:type="gramEnd"/>
-      <w:r>
-        <w:t xml:space="preserve"> service s’occupe du fournisseur Google.</w:t>
+      <w:r>
+        <w:t>le service s’occupe du fournisseur Google.</w:t>
       </w:r>
     </w:p>
     <w:p/>
@@ -3183,12 +2909,11 @@
         <w:pStyle w:val="Titre4"/>
       </w:pPr>
       <w:proofErr w:type="spellStart"/>
-      <w:proofErr w:type="gramStart"/>
-      <w:r>
+      <w:r>
+        <w:lastRenderedPageBreak/>
         <w:t>Peux tu</w:t>
       </w:r>
       <w:proofErr w:type="spellEnd"/>
-      <w:proofErr w:type="gramEnd"/>
       <w:r>
         <w:t xml:space="preserve"> me changer le code pour obtenir 2 fichiers nommés ainsi :</w:t>
       </w:r>
@@ -3232,7 +2957,6 @@
     </w:p>
     <w:p>
       <w:r>
-        <w:lastRenderedPageBreak/>
         <w:t>C’est fait.</w:t>
       </w:r>
     </w:p>
@@ -3415,13 +3139,8 @@
           <w:numId w:val="27"/>
         </w:numPr>
       </w:pPr>
-      <w:proofErr w:type="gramStart"/>
-      <w:r>
-        <w:t>un</w:t>
-      </w:r>
-      <w:proofErr w:type="gramEnd"/>
-      <w:r>
-        <w:t xml:space="preserve"> nouveau service, par exemple services/youtube.service.js, pourrait contenir les appels liés à YouTube</w:t>
+      <w:r>
+        <w:t>un nouveau service, par exemple services/youtube.service.js, pourrait contenir les appels liés à YouTube</w:t>
       </w:r>
     </w:p>
     <w:p>
@@ -3445,6 +3164,7 @@
     </w:p>
     <w:p>
       <w:r>
+        <w:lastRenderedPageBreak/>
         <w:t>Exemple de logique :</w:t>
       </w:r>
     </w:p>
@@ -3455,13 +3175,8 @@
           <w:numId w:val="28"/>
         </w:numPr>
       </w:pPr>
-      <w:proofErr w:type="gramStart"/>
-      <w:r>
-        <w:t>le</w:t>
-      </w:r>
-      <w:proofErr w:type="gramEnd"/>
-      <w:r>
-        <w:t xml:space="preserve"> contrôleur gère les requêtes HTTP</w:t>
+      <w:r>
+        <w:t>le contrôleur gère les requêtes HTTP</w:t>
       </w:r>
     </w:p>
     <w:p>
@@ -3471,13 +3186,8 @@
           <w:numId w:val="28"/>
         </w:numPr>
       </w:pPr>
-      <w:proofErr w:type="gramStart"/>
-      <w:r>
-        <w:t>le</w:t>
-      </w:r>
-      <w:proofErr w:type="gramEnd"/>
-      <w:r>
-        <w:t xml:space="preserve"> service gère la logique métier</w:t>
+      <w:r>
+        <w:t>le service gère la logique métier</w:t>
       </w:r>
     </w:p>
     <w:p>
@@ -3487,13 +3197,8 @@
           <w:numId w:val="28"/>
         </w:numPr>
       </w:pPr>
-      <w:proofErr w:type="gramStart"/>
-      <w:r>
-        <w:t>la</w:t>
-      </w:r>
-      <w:proofErr w:type="gramEnd"/>
-      <w:r>
-        <w:t xml:space="preserve"> classe YouTube service encapsule les appels comme :</w:t>
+      <w:r>
+        <w:t>la classe YouTube service encapsule les appels comme :</w:t>
       </w:r>
     </w:p>
     <w:p>
@@ -3503,13 +3208,8 @@
           <w:numId w:val="28"/>
         </w:numPr>
       </w:pPr>
-      <w:proofErr w:type="gramStart"/>
-      <w:r>
-        <w:t>récupérer</w:t>
-      </w:r>
-      <w:proofErr w:type="gramEnd"/>
-      <w:r>
-        <w:t xml:space="preserve"> les playlists</w:t>
+      <w:r>
+        <w:t>récupérer les playlists</w:t>
       </w:r>
     </w:p>
     <w:p>
@@ -3519,13 +3219,8 @@
           <w:numId w:val="28"/>
         </w:numPr>
       </w:pPr>
-      <w:proofErr w:type="gramStart"/>
-      <w:r>
-        <w:t>lire</w:t>
-      </w:r>
-      <w:proofErr w:type="gramEnd"/>
-      <w:r>
-        <w:t xml:space="preserve"> des données utilisateur</w:t>
+      <w:r>
+        <w:t>lire des données utilisateur</w:t>
       </w:r>
     </w:p>
     <w:p>
@@ -3541,7 +3236,6 @@
     </w:p>
     <w:p>
       <w:r>
-        <w:lastRenderedPageBreak/>
         <w:t>Donc oui, l’idée est bien :</w:t>
       </w:r>
     </w:p>
@@ -3552,13 +3246,8 @@
           <w:numId w:val="29"/>
         </w:numPr>
       </w:pPr>
-      <w:proofErr w:type="gramStart"/>
-      <w:r>
-        <w:t>une</w:t>
-      </w:r>
-      <w:proofErr w:type="gramEnd"/>
-      <w:r>
-        <w:t xml:space="preserve"> nouvelle classe,</w:t>
+      <w:r>
+        <w:t>une nouvelle classe,</w:t>
       </w:r>
     </w:p>
     <w:p>
@@ -3568,13 +3257,8 @@
           <w:numId w:val="29"/>
         </w:numPr>
       </w:pPr>
-      <w:proofErr w:type="gramStart"/>
-      <w:r>
-        <w:t>instanciée</w:t>
-      </w:r>
-      <w:proofErr w:type="gramEnd"/>
-      <w:r>
-        <w:t xml:space="preserve"> dans le contrôleur,</w:t>
+      <w:r>
+        <w:t>instanciée dans le contrôleur,</w:t>
       </w:r>
     </w:p>
     <w:p>
@@ -3584,13 +3268,8 @@
           <w:numId w:val="29"/>
         </w:numPr>
       </w:pPr>
-      <w:proofErr w:type="gramStart"/>
-      <w:r>
-        <w:t>pour</w:t>
-      </w:r>
-      <w:proofErr w:type="gramEnd"/>
-      <w:r>
-        <w:t xml:space="preserve"> séparer encore mieux les responsabilités.</w:t>
+      <w:r>
+        <w:t>pour séparer encore mieux les responsabilités.</w:t>
       </w:r>
     </w:p>
     <w:p>
@@ -3603,13 +3282,8 @@
       <w:pPr>
         <w:pStyle w:val="Titre4"/>
       </w:pPr>
-      <w:proofErr w:type="gramStart"/>
-      <w:r>
-        <w:t>OK .</w:t>
-      </w:r>
-      <w:proofErr w:type="gramEnd"/>
-      <w:r>
-        <w:t xml:space="preserve"> Change ce code !</w:t>
+      <w:r>
+        <w:t>OK . Change ce code !</w:t>
       </w:r>
     </w:p>
     <w:p>
@@ -3686,13 +3360,8 @@
           <w:numId w:val="31"/>
         </w:numPr>
       </w:pPr>
-      <w:proofErr w:type="gramStart"/>
-      <w:r>
-        <w:t>le</w:t>
-      </w:r>
-      <w:proofErr w:type="gramEnd"/>
-      <w:r>
-        <w:t xml:space="preserve"> contrôleur ne gère plus l’appel API YouTube directement ;</w:t>
+      <w:r>
+        <w:t>le contrôleur ne gère plus l’appel API YouTube directement ;</w:t>
       </w:r>
     </w:p>
     <w:p>
@@ -3702,13 +3371,8 @@
           <w:numId w:val="31"/>
         </w:numPr>
       </w:pPr>
-      <w:proofErr w:type="gramStart"/>
-      <w:r>
-        <w:t>la</w:t>
-      </w:r>
-      <w:proofErr w:type="gramEnd"/>
-      <w:r>
-        <w:t xml:space="preserve"> logique métier YouTube est isolée ;</w:t>
+      <w:r>
+        <w:t>la logique métier YouTube est isolée ;</w:t>
       </w:r>
     </w:p>
     <w:p>
@@ -3718,13 +3382,8 @@
           <w:numId w:val="31"/>
         </w:numPr>
       </w:pPr>
-      <w:proofErr w:type="gramStart"/>
-      <w:r>
-        <w:t>l’architecture</w:t>
-      </w:r>
-      <w:proofErr w:type="gramEnd"/>
-      <w:r>
-        <w:t xml:space="preserve"> est plus claire et plus facile à étendre.</w:t>
+      <w:r>
+        <w:t>l’architecture est plus claire et plus facile à étendre.</w:t>
       </w:r>
     </w:p>
     <w:p>
@@ -3753,10 +3412,7 @@
         <w:pStyle w:val="Titre1"/>
       </w:pPr>
       <w:r>
-        <w:t>A</w:t>
-      </w:r>
-      <w:r>
-        <w:t>fficher à l'utilisateur une nouvelle page web qui liste les playlists et leurs métadonnées</w:t>
+        <w:t>Afficher à l'utilisateur une nouvelle page web qui liste les playlists et leurs métadonnées</w:t>
       </w:r>
     </w:p>
     <w:p>
@@ -3791,7 +3447,6 @@
     <w:p/>
     <w:p>
       <w:r>
-        <w:lastRenderedPageBreak/>
         <w:t>Je vais adapter le flux pour remplacer la redirection directe vers YouTube par une page de résultat qui affiche les playlists récupérées avec leurs métadonnées, en ajoutant un peu de style si possible.</w:t>
       </w:r>
     </w:p>
@@ -3854,13 +3509,8 @@
           <w:numId w:val="32"/>
         </w:numPr>
       </w:pPr>
-      <w:proofErr w:type="gramStart"/>
-      <w:r>
-        <w:t>le</w:t>
-      </w:r>
-      <w:proofErr w:type="gramEnd"/>
-      <w:r>
-        <w:t xml:space="preserve"> nom de chaque playlist</w:t>
+      <w:r>
+        <w:t>le nom de chaque playlist</w:t>
       </w:r>
     </w:p>
     <w:p>
@@ -3870,13 +3520,8 @@
           <w:numId w:val="32"/>
         </w:numPr>
       </w:pPr>
-      <w:proofErr w:type="gramStart"/>
-      <w:r>
-        <w:t>son</w:t>
-      </w:r>
-      <w:proofErr w:type="gramEnd"/>
-      <w:r>
-        <w:t xml:space="preserve"> URL</w:t>
+      <w:r>
+        <w:t>son URL</w:t>
       </w:r>
     </w:p>
     <w:p>
@@ -3886,13 +3531,8 @@
           <w:numId w:val="32"/>
         </w:numPr>
       </w:pPr>
-      <w:proofErr w:type="gramStart"/>
-      <w:r>
-        <w:t>le</w:t>
-      </w:r>
-      <w:proofErr w:type="gramEnd"/>
-      <w:r>
-        <w:t xml:space="preserve"> nombre de vidéos</w:t>
+      <w:r>
+        <w:t>le nombre de vidéos</w:t>
       </w:r>
     </w:p>
     <w:p>
@@ -3902,13 +3542,8 @@
           <w:numId w:val="32"/>
         </w:numPr>
       </w:pPr>
-      <w:proofErr w:type="gramStart"/>
-      <w:r>
-        <w:t>une</w:t>
-      </w:r>
-      <w:proofErr w:type="gramEnd"/>
-      <w:r>
-        <w:t xml:space="preserve"> courte description</w:t>
+      <w:r>
+        <w:t>une courte description</w:t>
       </w:r>
     </w:p>
     <w:p>
@@ -4012,6 +3647,7 @@
           <w:b/>
           <w:bCs/>
         </w:rPr>
+        <w:lastRenderedPageBreak/>
         <w:t>Vérification</w:t>
       </w:r>
     </w:p>
@@ -4024,14 +3660,8 @@
       <w:pPr>
         <w:pStyle w:val="Titre1"/>
       </w:pPr>
-      <w:proofErr w:type="gramStart"/>
-      <w:r>
-        <w:lastRenderedPageBreak/>
-        <w:t>implémenter</w:t>
-      </w:r>
-      <w:proofErr w:type="gramEnd"/>
-      <w:r>
-        <w:t xml:space="preserve"> un composant de </w:t>
+      <w:r>
+        <w:t xml:space="preserve">implémenter un composant de </w:t>
       </w:r>
       <w:proofErr w:type="spellStart"/>
       <w:r>
@@ -4063,22 +3693,12 @@
         <w:t xml:space="preserve"> pour afficher les données. J'aimerais celle-ci, </w:t>
       </w:r>
       <w:proofErr w:type="spellStart"/>
-      <w:proofErr w:type="gramStart"/>
       <w:r>
         <w:t>est elle</w:t>
       </w:r>
       <w:proofErr w:type="spellEnd"/>
-      <w:proofErr w:type="gramEnd"/>
-      <w:r>
-        <w:t xml:space="preserve"> optimisée (=peu de </w:t>
-      </w:r>
-      <w:proofErr w:type="gramStart"/>
-      <w:r>
-        <w:t>dépendances )</w:t>
-      </w:r>
-      <w:proofErr w:type="gramEnd"/>
-      <w:r>
-        <w:t xml:space="preserve"> : </w:t>
+      <w:r>
+        <w:t xml:space="preserve"> optimisée (=peu de dépendances ) : </w:t>
       </w:r>
       <w:hyperlink r:id="rId28" w:history="1">
         <w:r>
@@ -4184,11 +3804,9 @@
           <w:numId w:val="35"/>
         </w:numPr>
       </w:pPr>
-      <w:proofErr w:type="gramStart"/>
       <w:r>
         <w:t>jQuery</w:t>
       </w:r>
-      <w:proofErr w:type="gramEnd"/>
     </w:p>
     <w:p>
       <w:pPr>
@@ -4197,13 +3815,8 @@
           <w:numId w:val="35"/>
         </w:numPr>
       </w:pPr>
-      <w:proofErr w:type="gramStart"/>
-      <w:r>
-        <w:t>le</w:t>
-      </w:r>
-      <w:proofErr w:type="gramEnd"/>
-      <w:r>
-        <w:t xml:space="preserve"> module Bootstrap 5 </w:t>
+      <w:r>
+        <w:t xml:space="preserve">le module Bootstrap 5 </w:t>
       </w:r>
       <w:proofErr w:type="spellStart"/>
       <w:r>
@@ -4243,13 +3856,8 @@
           <w:numId w:val="36"/>
         </w:numPr>
       </w:pPr>
-      <w:proofErr w:type="gramStart"/>
-      <w:r>
-        <w:t>c’est</w:t>
-      </w:r>
-      <w:proofErr w:type="gramEnd"/>
-      <w:r>
-        <w:t xml:space="preserve"> une bonne option ;</w:t>
+      <w:r>
+        <w:t>c’est une bonne option ;</w:t>
       </w:r>
     </w:p>
     <w:p>
@@ -4259,13 +3867,8 @@
           <w:numId w:val="36"/>
         </w:numPr>
       </w:pPr>
-      <w:proofErr w:type="gramStart"/>
-      <w:r>
-        <w:t>elle</w:t>
-      </w:r>
-      <w:proofErr w:type="gramEnd"/>
-      <w:r>
-        <w:t xml:space="preserve"> reste raisonnable en termes de dépendances pour un petit projet ;</w:t>
+      <w:r>
+        <w:t>elle reste raisonnable en termes de dépendances pour un petit projet ;</w:t>
       </w:r>
     </w:p>
     <w:p>
@@ -4275,13 +3878,8 @@
           <w:numId w:val="36"/>
         </w:numPr>
       </w:pPr>
-      <w:proofErr w:type="gramStart"/>
-      <w:r>
-        <w:t>elle</w:t>
-      </w:r>
-      <w:proofErr w:type="gramEnd"/>
-      <w:r>
-        <w:t xml:space="preserve"> offre des fonctionnalités utiles sans beaucoup de code.</w:t>
+      <w:r>
+        <w:t>elle offre des fonctionnalités utiles sans beaucoup de code.</w:t>
       </w:r>
     </w:p>
     <w:p>
@@ -4296,75 +3894,57 @@
           <w:b/>
           <w:bCs/>
         </w:rPr>
-        <w:t xml:space="preserve">Si tu veux la version </w:t>
-      </w:r>
-      <w:proofErr w:type="gramStart"/>
-      <w:r>
+        <w:t>Si tu veux la version la plus légère possible</w:t>
+      </w:r>
+    </w:p>
+    <w:p>
+      <w:r>
+        <w:t>On pourrait aller vers une alternative plus minimale, par exemple :</w:t>
+      </w:r>
+    </w:p>
+    <w:p>
+      <w:pPr>
+        <w:numPr>
+          <w:ilvl w:val="0"/>
+          <w:numId w:val="37"/>
+        </w:numPr>
+      </w:pPr>
+      <w:r>
+        <w:t>un tableau HTML classique avec tri côté JavaScript custom,</w:t>
+      </w:r>
+    </w:p>
+    <w:p>
+      <w:pPr>
+        <w:numPr>
+          <w:ilvl w:val="0"/>
+          <w:numId w:val="37"/>
+        </w:numPr>
+      </w:pPr>
+      <w:r>
+        <w:t xml:space="preserve">ou une version </w:t>
+      </w:r>
+      <w:proofErr w:type="spellStart"/>
+      <w:r>
+        <w:t>DataTables</w:t>
+      </w:r>
+      <w:proofErr w:type="spellEnd"/>
+      <w:r>
+        <w:t xml:space="preserve"> sans jQuery si tu veux un rendu plus moderne.</w:t>
+      </w:r>
+    </w:p>
+    <w:p>
+      <w:pPr>
         <w:rPr>
           <w:b/>
           <w:bCs/>
         </w:rPr>
-        <w:t>la plus légère possible</w:t>
-      </w:r>
-      <w:proofErr w:type="gramEnd"/>
-    </w:p>
-    <w:p>
-      <w:r>
-        <w:t>On pourrait aller vers une alternative plus minimale, par exemple :</w:t>
-      </w:r>
-    </w:p>
-    <w:p>
-      <w:pPr>
-        <w:numPr>
-          <w:ilvl w:val="0"/>
-          <w:numId w:val="37"/>
-        </w:numPr>
-      </w:pPr>
-      <w:proofErr w:type="gramStart"/>
-      <w:r>
-        <w:t>un</w:t>
-      </w:r>
-      <w:proofErr w:type="gramEnd"/>
-      <w:r>
-        <w:t xml:space="preserve"> tableau HTML classique avec tri côté JavaScript custom,</w:t>
-      </w:r>
-    </w:p>
-    <w:p>
-      <w:pPr>
-        <w:numPr>
-          <w:ilvl w:val="0"/>
-          <w:numId w:val="37"/>
-        </w:numPr>
-      </w:pPr>
-      <w:proofErr w:type="gramStart"/>
-      <w:r>
-        <w:t>ou</w:t>
-      </w:r>
-      <w:proofErr w:type="gramEnd"/>
-      <w:r>
-        <w:t xml:space="preserve"> une version </w:t>
-      </w:r>
-      <w:proofErr w:type="spellStart"/>
-      <w:r>
-        <w:t>DataTables</w:t>
-      </w:r>
-      <w:proofErr w:type="spellEnd"/>
-      <w:r>
-        <w:t xml:space="preserve"> sans jQuery si tu veux un rendu plus moderne.</w:t>
-      </w:r>
-    </w:p>
-    <w:p>
-      <w:pPr>
+      </w:pPr>
+      <w:r>
         <w:rPr>
           <w:b/>
           <w:bCs/>
         </w:rPr>
-      </w:pPr>
-      <w:r>
-        <w:rPr>
-          <w:b/>
-          <w:bCs/>
-        </w:rPr>
+        <w:lastRenderedPageBreak/>
         <w:t>Ce que j’ai mis en place</w:t>
       </w:r>
     </w:p>
@@ -4375,13 +3955,8 @@
           <w:numId w:val="38"/>
         </w:numPr>
       </w:pPr>
-      <w:proofErr w:type="gramStart"/>
-      <w:r>
-        <w:t>tableau</w:t>
-      </w:r>
-      <w:proofErr w:type="gramEnd"/>
-      <w:r>
-        <w:t xml:space="preserve"> interactif</w:t>
+      <w:r>
+        <w:t>tableau interactif</w:t>
       </w:r>
     </w:p>
     <w:p>
@@ -4391,12 +3966,9 @@
           <w:numId w:val="38"/>
         </w:numPr>
       </w:pPr>
-      <w:proofErr w:type="gramStart"/>
-      <w:r>
-        <w:lastRenderedPageBreak/>
+      <w:r>
         <w:t>recherche</w:t>
       </w:r>
-      <w:proofErr w:type="gramEnd"/>
     </w:p>
     <w:p>
       <w:pPr>
@@ -4405,13 +3977,8 @@
           <w:numId w:val="38"/>
         </w:numPr>
       </w:pPr>
-      <w:proofErr w:type="gramStart"/>
-      <w:r>
-        <w:t>tri</w:t>
-      </w:r>
-      <w:proofErr w:type="gramEnd"/>
-      <w:r>
-        <w:t xml:space="preserve"> par colonne</w:t>
+      <w:r>
+        <w:t>tri par colonne</w:t>
       </w:r>
     </w:p>
     <w:p>
@@ -4421,11 +3988,9 @@
           <w:numId w:val="38"/>
         </w:numPr>
       </w:pPr>
-      <w:proofErr w:type="gramStart"/>
       <w:r>
         <w:t>pagination</w:t>
       </w:r>
-      <w:proofErr w:type="gramEnd"/>
     </w:p>
     <w:p>
       <w:pPr>
@@ -4434,13 +3999,8 @@
           <w:numId w:val="38"/>
         </w:numPr>
       </w:pPr>
-      <w:proofErr w:type="gramStart"/>
-      <w:r>
-        <w:t>style</w:t>
-      </w:r>
-      <w:proofErr w:type="gramEnd"/>
-      <w:r>
-        <w:t xml:space="preserve"> Bootstrap 5</w:t>
+      <w:r>
+        <w:t>style Bootstrap 5</w:t>
       </w:r>
     </w:p>
     <w:p>
@@ -4450,13 +4010,8 @@
           <w:numId w:val="38"/>
         </w:numPr>
       </w:pPr>
-      <w:proofErr w:type="gramStart"/>
-      <w:r>
-        <w:t>traduction</w:t>
-      </w:r>
-      <w:proofErr w:type="gramEnd"/>
-      <w:r>
-        <w:t xml:space="preserve"> française</w:t>
+      <w:r>
+        <w:t>traduction française</w:t>
       </w:r>
     </w:p>
     <w:p>
@@ -4490,15 +4045,7 @@
         <w:pStyle w:val="Titre4"/>
       </w:pPr>
       <w:r>
-        <w:t xml:space="preserve">Au niveau de l'utilisabilité de cette appli, je trouve cela dommage : l'utilisateur doit se connecter à chaque lancement de l'appli sur </w:t>
-      </w:r>
-      <w:proofErr w:type="gramStart"/>
-      <w:r>
-        <w:t>localhost:</w:t>
-      </w:r>
-      <w:proofErr w:type="gramEnd"/>
-      <w:r>
-        <w:t xml:space="preserve">8080 ! </w:t>
+        <w:t xml:space="preserve">Au niveau de l'utilisabilité de cette appli, je trouve cela dommage : l'utilisateur doit se connecter à chaque lancement de l'appli sur localhost:8080 ! </w:t>
       </w:r>
       <w:proofErr w:type="spellStart"/>
       <w:r>
@@ -4615,15 +4162,7 @@
         </w:r>
       </w:hyperlink>
       <w:r>
-        <w:t xml:space="preserve"> via un dossier data </w:t>
-      </w:r>
-      <w:proofErr w:type="gramStart"/>
-      <w:r>
-        <w:t>situé</w:t>
-      </w:r>
-      <w:proofErr w:type="gramEnd"/>
-      <w:r>
-        <w:t xml:space="preserve"> à la racine du projet.</w:t>
+        <w:t> via un dossier data situé à la racine du projet.</w:t>
       </w:r>
     </w:p>
     <w:p>
@@ -4662,13 +4201,8 @@
         </w:numPr>
       </w:pPr>
       <w:proofErr w:type="spellStart"/>
-      <w:proofErr w:type="gramStart"/>
-      <w:r>
-        <w:t>access</w:t>
-      </w:r>
-      <w:proofErr w:type="gramEnd"/>
-      <w:r>
-        <w:t>_token</w:t>
+      <w:r>
+        <w:t>access_token</w:t>
       </w:r>
       <w:proofErr w:type="spellEnd"/>
     </w:p>
@@ -4680,13 +4214,9 @@
         </w:numPr>
       </w:pPr>
       <w:proofErr w:type="spellStart"/>
-      <w:proofErr w:type="gramStart"/>
-      <w:r>
-        <w:t>refresh</w:t>
-      </w:r>
-      <w:proofErr w:type="gramEnd"/>
-      <w:r>
-        <w:t>_token</w:t>
+      <w:r>
+        <w:lastRenderedPageBreak/>
+        <w:t>refresh_token</w:t>
       </w:r>
       <w:proofErr w:type="spellEnd"/>
     </w:p>
@@ -4698,13 +4228,8 @@
         </w:numPr>
       </w:pPr>
       <w:proofErr w:type="spellStart"/>
-      <w:proofErr w:type="gramStart"/>
-      <w:r>
-        <w:t>expiry</w:t>
-      </w:r>
-      <w:proofErr w:type="gramEnd"/>
-      <w:r>
-        <w:t>_date</w:t>
+      <w:r>
+        <w:t>expiry_date</w:t>
       </w:r>
       <w:proofErr w:type="spellEnd"/>
     </w:p>
@@ -4720,7 +4245,6 @@
           <w:b/>
           <w:bCs/>
         </w:rPr>
-        <w:lastRenderedPageBreak/>
         <w:t>Important</w:t>
       </w:r>
     </w:p>
@@ -4736,13 +4260,8 @@
           <w:numId w:val="41"/>
         </w:numPr>
       </w:pPr>
-      <w:proofErr w:type="gramStart"/>
-      <w:r>
-        <w:t>il</w:t>
-      </w:r>
-      <w:proofErr w:type="gramEnd"/>
-      <w:r>
-        <w:t xml:space="preserve"> faut chiffrer ce fichier ;</w:t>
+      <w:r>
+        <w:t>il faut chiffrer ce fichier ;</w:t>
       </w:r>
     </w:p>
     <w:p>
@@ -4752,13 +4271,8 @@
           <w:numId w:val="41"/>
         </w:numPr>
       </w:pPr>
-      <w:proofErr w:type="gramStart"/>
-      <w:r>
-        <w:t>mieux</w:t>
-      </w:r>
-      <w:proofErr w:type="gramEnd"/>
-      <w:r>
-        <w:t xml:space="preserve"> vaut stocker les </w:t>
+      <w:r>
+        <w:t xml:space="preserve">mieux vaut stocker les </w:t>
       </w:r>
       <w:proofErr w:type="spellStart"/>
       <w:r>
@@ -4771,18 +4285,13 @@
     </w:p>
     <w:p>
       <w:r>
-        <w:t xml:space="preserve">Si tu veux, je peux aussi te mettre en place une version plus propre avec un stockage chiffré ou dans un </w:t>
-      </w:r>
-      <w:proofErr w:type="gramStart"/>
-      <w:r>
-        <w:t>fichier .</w:t>
+        <w:t>Si tu veux, je peux aussi te mettre en place une version plus propre avec un stockage chiffré ou dans un fichier .</w:t>
       </w:r>
       <w:proofErr w:type="spellStart"/>
       <w:r>
         <w:t>env</w:t>
       </w:r>
       <w:proofErr w:type="spellEnd"/>
-      <w:proofErr w:type="gramEnd"/>
       <w:r>
         <w:t xml:space="preserve"> sécurisé.</w:t>
       </w:r>
@@ -4832,21 +4341,8 @@
       <w:pPr>
         <w:pStyle w:val="Titre4"/>
       </w:pPr>
-      <w:proofErr w:type="gramStart"/>
-      <w:r>
-        <w:t>Quel différence</w:t>
-      </w:r>
-      <w:proofErr w:type="gramEnd"/>
-      <w:r>
-        <w:t xml:space="preserve"> avec une "base de </w:t>
-      </w:r>
-      <w:proofErr w:type="gramStart"/>
-      <w:r>
-        <w:t>donnée"</w:t>
-      </w:r>
-      <w:proofErr w:type="gramEnd"/>
-      <w:r>
-        <w:t xml:space="preserve"> que tu évoquais ?</w:t>
+      <w:r>
+        <w:t>Quel différence avec une "base de donnée" que tu évoquais ?</w:t>
       </w:r>
     </w:p>
     <w:p>
@@ -4876,13 +4372,8 @@
           <w:numId w:val="42"/>
         </w:numPr>
       </w:pPr>
-      <w:proofErr w:type="gramStart"/>
-      <w:r>
-        <w:t>simple</w:t>
-      </w:r>
-      <w:proofErr w:type="gramEnd"/>
-      <w:r>
-        <w:t xml:space="preserve"> à mettre en place</w:t>
+      <w:r>
+        <w:t>simple à mettre en place</w:t>
       </w:r>
     </w:p>
     <w:p>
@@ -4892,13 +4383,8 @@
           <w:numId w:val="42"/>
         </w:numPr>
       </w:pPr>
-      <w:proofErr w:type="gramStart"/>
-      <w:r>
-        <w:t>pratique</w:t>
-      </w:r>
-      <w:proofErr w:type="gramEnd"/>
-      <w:r>
-        <w:t xml:space="preserve"> pour un dev local ou un petit prototype</w:t>
+      <w:r>
+        <w:t>pratique pour un dev local ou un petit prototype</w:t>
       </w:r>
     </w:p>
     <w:p>
@@ -4908,13 +4394,8 @@
           <w:numId w:val="42"/>
         </w:numPr>
       </w:pPr>
-      <w:proofErr w:type="gramStart"/>
-      <w:r>
-        <w:t>les</w:t>
-      </w:r>
-      <w:proofErr w:type="gramEnd"/>
-      <w:r>
-        <w:t xml:space="preserve"> </w:t>
+      <w:r>
+        <w:t xml:space="preserve">les </w:t>
       </w:r>
       <w:proofErr w:type="spellStart"/>
       <w:r>
@@ -4932,13 +4413,8 @@
           <w:numId w:val="42"/>
         </w:numPr>
       </w:pPr>
-      <w:proofErr w:type="gramStart"/>
-      <w:r>
-        <w:t>ça</w:t>
-      </w:r>
-      <w:proofErr w:type="gramEnd"/>
-      <w:r>
-        <w:t xml:space="preserve"> reste relativement fragile :</w:t>
+      <w:r>
+        <w:t>ça reste relativement fragile :</w:t>
       </w:r>
     </w:p>
     <w:p>
@@ -4948,13 +4424,8 @@
           <w:numId w:val="42"/>
         </w:numPr>
       </w:pPr>
-      <w:proofErr w:type="gramStart"/>
-      <w:r>
-        <w:t>un</w:t>
-      </w:r>
-      <w:proofErr w:type="gramEnd"/>
-      <w:r>
-        <w:t xml:space="preserve"> accès au serveur suffit pour récupérer le fichier</w:t>
+      <w:r>
+        <w:t>un accès au serveur suffit pour récupérer le fichier</w:t>
       </w:r>
     </w:p>
     <w:p>
@@ -4964,13 +4435,8 @@
           <w:numId w:val="42"/>
         </w:numPr>
       </w:pPr>
-      <w:proofErr w:type="gramStart"/>
-      <w:r>
-        <w:t>si</w:t>
-      </w:r>
-      <w:proofErr w:type="gramEnd"/>
-      <w:r>
-        <w:t xml:space="preserve"> la clé est perdue, les données sont inutilisables</w:t>
+      <w:r>
+        <w:t>si la clé est perdue, les données sont inutilisables</w:t>
       </w:r>
     </w:p>
     <w:p>
@@ -4980,13 +4446,8 @@
           <w:numId w:val="42"/>
         </w:numPr>
       </w:pPr>
-      <w:proofErr w:type="gramStart"/>
-      <w:r>
-        <w:t>pas</w:t>
-      </w:r>
-      <w:proofErr w:type="gramEnd"/>
-      <w:r>
-        <w:t xml:space="preserve"> de recherche, pas d’index, pas de concurrence, pas de nettoyage automatique</w:t>
+      <w:r>
+        <w:t>pas de recherche, pas d’index, pas de concurrence, pas de nettoyage automatique</w:t>
       </w:r>
     </w:p>
     <w:p>
@@ -5011,13 +4472,9 @@
           <w:numId w:val="43"/>
         </w:numPr>
       </w:pPr>
-      <w:proofErr w:type="gramStart"/>
-      <w:r>
-        <w:t>plus</w:t>
-      </w:r>
-      <w:proofErr w:type="gramEnd"/>
-      <w:r>
-        <w:t xml:space="preserve"> robuste</w:t>
+      <w:r>
+        <w:lastRenderedPageBreak/>
+        <w:t>plus robuste</w:t>
       </w:r>
     </w:p>
     <w:p>
@@ -5027,13 +4484,8 @@
           <w:numId w:val="43"/>
         </w:numPr>
       </w:pPr>
-      <w:proofErr w:type="gramStart"/>
-      <w:r>
-        <w:t>meilleure</w:t>
-      </w:r>
-      <w:proofErr w:type="gramEnd"/>
-      <w:r>
-        <w:t xml:space="preserve"> gestion des accès et des permissions</w:t>
+      <w:r>
+        <w:t>meilleure gestion des accès et des permissions</w:t>
       </w:r>
     </w:p>
     <w:p>
@@ -5043,14 +4495,8 @@
           <w:numId w:val="43"/>
         </w:numPr>
       </w:pPr>
-      <w:proofErr w:type="gramStart"/>
-      <w:r>
-        <w:lastRenderedPageBreak/>
-        <w:t>possible</w:t>
-      </w:r>
-      <w:proofErr w:type="gramEnd"/>
-      <w:r>
-        <w:t xml:space="preserve"> de stocker plusieurs utilisateurs, plusieurs sessions, et de faire des mises à jour proprement</w:t>
+      <w:r>
+        <w:t>possible de stocker plusieurs utilisateurs, plusieurs sessions, et de faire des mises à jour proprement</w:t>
       </w:r>
     </w:p>
     <w:p>
@@ -5060,13 +4506,8 @@
           <w:numId w:val="43"/>
         </w:numPr>
       </w:pPr>
-      <w:proofErr w:type="gramStart"/>
-      <w:r>
-        <w:t>plus</w:t>
-      </w:r>
-      <w:proofErr w:type="gramEnd"/>
-      <w:r>
-        <w:t xml:space="preserve"> adapté si tu veux une vraie app multi-utilisateurs ou un système sécurisé à long terme</w:t>
+      <w:r>
+        <w:t>plus adapté si tu veux une vraie app multi-utilisateurs ou un système sécurisé à long terme</w:t>
       </w:r>
     </w:p>
     <w:p>
@@ -5091,13 +4532,8 @@
           <w:numId w:val="44"/>
         </w:numPr>
       </w:pPr>
-      <w:proofErr w:type="gramStart"/>
-      <w:r>
-        <w:t>fichier</w:t>
-      </w:r>
-      <w:proofErr w:type="gramEnd"/>
-      <w:r>
-        <w:t xml:space="preserve"> chiffré = bon compromis pour apprendre, tester, ou faire un petit outil local</w:t>
+      <w:r>
+        <w:t>fichier chiffré = bon compromis pour apprendre, tester, ou faire un petit outil local</w:t>
       </w:r>
     </w:p>
     <w:p>
@@ -5107,13 +4543,8 @@
           <w:numId w:val="44"/>
         </w:numPr>
       </w:pPr>
-      <w:proofErr w:type="gramStart"/>
-      <w:r>
-        <w:t>base</w:t>
-      </w:r>
-      <w:proofErr w:type="gramEnd"/>
-      <w:r>
-        <w:t xml:space="preserve"> de données = meilleur choix pour une application réelle, maintenable et sûre</w:t>
+      <w:r>
+        <w:t>base de données = meilleur choix pour une application réelle, maintenable et sûre</w:t>
       </w:r>
     </w:p>
     <w:p>
@@ -5143,15 +4574,7 @@
         <w:pStyle w:val="Titre4"/>
       </w:pPr>
       <w:r>
-        <w:t xml:space="preserve">Autant utiliser un fichier SQLite en effet, </w:t>
-      </w:r>
-      <w:proofErr w:type="gramStart"/>
-      <w:r>
-        <w:t>va y</w:t>
-      </w:r>
-      <w:proofErr w:type="gramEnd"/>
-      <w:r>
-        <w:t xml:space="preserve"> !</w:t>
+        <w:t>Autant utiliser un fichier SQLite en effet, va y !</w:t>
       </w:r>
     </w:p>
     <w:p>
@@ -5203,33 +4626,17 @@
     </w:p>
     <w:p>
       <w:r>
-        <w:t xml:space="preserve">La séparation est en </w:t>
-      </w:r>
-      <w:proofErr w:type="gramStart"/>
-      <w:r>
-        <w:t>cours;</w:t>
-      </w:r>
-      <w:proofErr w:type="gramEnd"/>
-      <w:r>
-        <w:t xml:space="preserve"> le stockage sera désormais géré par un composant autonome et le service OAuth n’en conservera que l’orchestration.</w:t>
-      </w:r>
-    </w:p>
-    <w:p>
-      <w:r>
-        <w:t xml:space="preserve">Le service OAuth ne contient plus que la logique de </w:t>
-      </w:r>
-      <w:proofErr w:type="gramStart"/>
-      <w:r>
-        <w:t>flux;</w:t>
-      </w:r>
-      <w:proofErr w:type="gramEnd"/>
-      <w:r>
-        <w:t xml:space="preserve"> le stockage est désormais isolé dans un module dédié. Je fais une vérification rapide du résultat.</w:t>
+        <w:t>La séparation est en cours; le stockage sera désormais géré par un composant autonome et le service OAuth n’en conservera que l’orchestration.</w:t>
       </w:r>
     </w:p>
     <w:p>
       <w:r>
         <w:lastRenderedPageBreak/>
+        <w:t>Le service OAuth ne contient plus que la logique de flux; le stockage est désormais isolé dans un module dédié. Je fais une vérification rapide du résultat.</w:t>
+      </w:r>
+    </w:p>
+    <w:p>
+      <w:r>
         <w:t>Oui, c’est maintenant séparé.</w:t>
       </w:r>
     </w:p>
@@ -5394,6 +4801,7 @@
         <w:rPr>
           <w:b/>
           <w:bCs/>
+          <w:lang w:val="en-US"/>
         </w:rPr>
       </w:pPr>
       <w:r>
@@ -5671,7 +5079,6 @@
       <w:r>
         <w:rPr>
           <w:i/>
-          <w:lang w:val="en-US"/>
         </w:rPr>
         <w:t>s.pnpm\</w:t>
       </w:r>
@@ -5681,7 +5088,6 @@
             <w:rStyle w:val="Lienhypertexte"/>
             <w:i/>
             <w:iCs w:val="0"/>
-            <w:lang w:val="en-US"/>
           </w:rPr>
           <w:t>better-sqlite3@12.11.1</w:t>
         </w:r>
@@ -5689,14 +5095,12 @@
       <w:r>
         <w:rPr>
           <w:i/>
-          <w:lang w:val="en-US"/>
         </w:rPr>
         <w:t>\node_modules\better-sqlite3\build\default\better_sqlite3.node</w:t>
       </w:r>
       <w:r>
         <w:rPr>
           <w:i/>
-          <w:lang w:val="en-US"/>
         </w:rPr>
         <w:br/>
         <w:t>→ C:\Users\Gardien\Documents\WSL\Ubuntu-base-23\http-server\www\ytb-deluxe-client-server\mvp-v0.1\server-node\JS\node_modules.pnpm\</w:t>
@@ -5707,7 +5111,6 @@
             <w:rStyle w:val="Lienhypertexte"/>
             <w:i/>
             <w:iCs w:val="0"/>
-            <w:lang w:val="en-US"/>
           </w:rPr>
           <w:t>better-sqlite3@12.11.1</w:t>
         </w:r>
@@ -5715,14 +5118,12 @@
       <w:r>
         <w:rPr>
           <w:i/>
-          <w:lang w:val="en-US"/>
         </w:rPr>
         <w:t>\node_modules\better-sqlite3\compiled\22.17.0\win32\x64\better_sqlite3.node</w:t>
       </w:r>
       <w:r>
         <w:rPr>
           <w:i/>
-          <w:lang w:val="en-US"/>
         </w:rPr>
         <w:br/>
         <w:t>→ C:\Users\Gardien\Documents\WSL\Ubuntu-base-23\http-server\www\ytb-deluxe-client-server\mvp-v0.1\server-node\JS\node_modules.pnpm\</w:t>
@@ -5733,7 +5134,6 @@
             <w:rStyle w:val="Lienhypertexte"/>
             <w:i/>
             <w:iCs w:val="0"/>
-            <w:lang w:val="en-US"/>
           </w:rPr>
           <w:t>better-sqlite3@12.11.1</w:t>
         </w:r>
@@ -5741,14 +5141,12 @@
       <w:r>
         <w:rPr>
           <w:i/>
-          <w:lang w:val="en-US"/>
         </w:rPr>
         <w:t>\node_modules\better-sqlite3\addon-build\release\install-root\better_sqlite3.node</w:t>
       </w:r>
       <w:r>
         <w:rPr>
           <w:i/>
-          <w:lang w:val="en-US"/>
         </w:rPr>
         <w:br/>
         <w:t>→ C:\Users\Gardien\Documents\WSL\Ubuntu-base-23\http-server\www\ytb-deluxe-client-server\mvp-v0.1\server-node\JS\node_modules.pnpm\</w:t>
@@ -5759,7 +5157,6 @@
             <w:rStyle w:val="Lienhypertexte"/>
             <w:i/>
             <w:iCs w:val="0"/>
-            <w:lang w:val="en-US"/>
           </w:rPr>
           <w:t>better-sqlite3@12.11.1</w:t>
         </w:r>
@@ -5767,14 +5164,12 @@
       <w:r>
         <w:rPr>
           <w:i/>
-          <w:lang w:val="en-US"/>
         </w:rPr>
         <w:t>\node_modules\better-sqlite3\addon-build\debug\install-root\better_sqlite3.node</w:t>
       </w:r>
       <w:r>
         <w:rPr>
           <w:i/>
-          <w:lang w:val="en-US"/>
         </w:rPr>
         <w:br/>
         <w:t>→ C:\Users\Gardien\Documents\WSL\Ubuntu-base-23\http-server\www\ytb-deluxe-client-server\mvp-v0.1\server-node\JS\node_modules.pnpm\</w:t>
@@ -5785,7 +5180,6 @@
             <w:rStyle w:val="Lienhypertexte"/>
             <w:i/>
             <w:iCs w:val="0"/>
-            <w:lang w:val="en-US"/>
           </w:rPr>
           <w:t>better-sqlite3@12.11.1</w:t>
         </w:r>
@@ -5793,14 +5187,12 @@
       <w:r>
         <w:rPr>
           <w:i/>
-          <w:lang w:val="en-US"/>
         </w:rPr>
         <w:t>\node_modules\better-sqlite3\addon-build\default\install-root\better_sqlite3.node</w:t>
       </w:r>
       <w:r>
         <w:rPr>
           <w:i/>
-          <w:lang w:val="en-US"/>
         </w:rPr>
         <w:br/>
         <w:t>→ C:\Users\Gardien\Documents\WSL\Ubuntu-base-23\http-server\www\ytb-deluxe-client-server\mvp-v0.1\server-node\JS\node_modules.pnpm\</w:t>
@@ -5811,7 +5203,6 @@
             <w:rStyle w:val="Lienhypertexte"/>
             <w:i/>
             <w:iCs w:val="0"/>
-            <w:lang w:val="en-US"/>
           </w:rPr>
           <w:t>better-sqlite3@12.11.1</w:t>
         </w:r>
@@ -5819,7 +5210,6 @@
       <w:r>
         <w:rPr>
           <w:i/>
-          <w:lang w:val="en-US"/>
         </w:rPr>
         <w:t>\node_modules\better-sqlite3\lib\binding\node-v127-win32-x64\better_sqlite3.node</w:t>
       </w:r>
@@ -5840,7 +5230,6 @@
       <w:r>
         <w:rPr>
           <w:i/>
-          <w:lang w:val="en-US"/>
         </w:rPr>
         <w:lastRenderedPageBreak/>
         <w:t xml:space="preserve">2. </w:t>
@@ -5864,7 +5253,6 @@
         <w:t xml:space="preserve"> après le </w:t>
       </w:r>
       <w:proofErr w:type="spellStart"/>
-      <w:proofErr w:type="gramStart"/>
       <w:r>
         <w:rPr>
           <w:b/>
@@ -5882,7 +5270,6 @@
         </w:rPr>
         <w:t xml:space="preserve"> :</w:t>
       </w:r>
-      <w:proofErr w:type="gramEnd"/>
       <w:r>
         <w:rPr>
           <w:b/>
@@ -5909,21 +5296,7 @@
         <w:rPr>
           <w:lang w:val="en-US"/>
         </w:rPr>
-        <w:t xml:space="preserve"> les credentials </w:t>
-      </w:r>
-      <w:proofErr w:type="gramStart"/>
-      <w:r>
-        <w:rPr>
-          <w:lang w:val="en-US"/>
-        </w:rPr>
-        <w:t>Google :</w:t>
-      </w:r>
-      <w:proofErr w:type="gramEnd"/>
-      <w:r>
-        <w:rPr>
-          <w:lang w:val="en-US"/>
-        </w:rPr>
-        <w:t xml:space="preserve"> Cannot read properties of null (reading 'prepare')</w:t>
+        <w:t xml:space="preserve"> les credentials Google : Cannot read properties of null (reading 'prepare')</w:t>
       </w:r>
       <w:r>
         <w:rPr>
@@ -5933,19 +5306,11 @@
         <w:t xml:space="preserve">ANCIEN </w:t>
       </w:r>
       <w:proofErr w:type="spellStart"/>
-      <w:proofErr w:type="gramStart"/>
       <w:r>
         <w:rPr>
           <w:lang w:val="en-US"/>
         </w:rPr>
-        <w:t>session.refresh</w:t>
-      </w:r>
-      <w:proofErr w:type="gramEnd"/>
-      <w:r>
-        <w:rPr>
-          <w:lang w:val="en-US"/>
-        </w:rPr>
-        <w:t>_token</w:t>
+        <w:t>session.refresh_token</w:t>
       </w:r>
       <w:proofErr w:type="spellEnd"/>
       <w:r>
@@ -5962,19 +5327,11 @@
         <w:t xml:space="preserve">NOUVEAU </w:t>
       </w:r>
       <w:proofErr w:type="spellStart"/>
-      <w:proofErr w:type="gramStart"/>
       <w:r>
         <w:rPr>
           <w:lang w:val="en-US"/>
         </w:rPr>
-        <w:t>session.refresh</w:t>
-      </w:r>
-      <w:proofErr w:type="gramEnd"/>
-      <w:r>
-        <w:rPr>
-          <w:lang w:val="en-US"/>
-        </w:rPr>
-        <w:t>_token</w:t>
+        <w:t>session.refresh_token</w:t>
       </w:r>
       <w:proofErr w:type="spellEnd"/>
       <w:r>
@@ -6105,17 +5462,9 @@
         <w:rPr>
           <w:rStyle w:val="Lienhypertexte"/>
         </w:rPr>
-        <w:t>this.</w:t>
-      </w:r>
-      <w:proofErr w:type="gramStart"/>
-      <w:r>
-        <w:rPr>
-          <w:rStyle w:val="Lienhypertexte"/>
-        </w:rPr>
-        <w:t>db.prepare</w:t>
+        <w:t>this.db.prepare</w:t>
       </w:r>
       <w:proofErr w:type="spellEnd"/>
-      <w:proofErr w:type="gramEnd"/>
       <w:r>
         <w:rPr>
           <w:rStyle w:val="Lienhypertexte"/>
@@ -6266,15 +5615,7 @@
       </w:r>
       <w:proofErr w:type="spellEnd"/>
       <w:r>
-        <w:t xml:space="preserve"> </w:t>
-      </w:r>
-      <w:proofErr w:type="gramStart"/>
-      <w:r>
-        <w:t>start;</w:t>
-      </w:r>
-      <w:proofErr w:type="gramEnd"/>
-      <w:r>
-        <w:t xml:space="preserve"> le fichier devrait maintenant être créé dans </w:t>
+        <w:t xml:space="preserve"> start; le fichier devrait maintenant être créé dans </w:t>
       </w:r>
       <w:hyperlink r:id="rId47" w:history="1">
         <w:r>
@@ -6305,15 +5646,7 @@
         <w:t>e</w:t>
       </w:r>
       <w:r>
-        <w:t xml:space="preserve">rvé 2 </w:t>
-      </w:r>
-      <w:proofErr w:type="gramStart"/>
-      <w:r>
-        <w:t>possibilité</w:t>
-      </w:r>
-      <w:proofErr w:type="gramEnd"/>
-      <w:r>
-        <w:t xml:space="preserve"> de backend </w:t>
+        <w:t xml:space="preserve">rvé 2 possibilité de backend </w:t>
       </w:r>
       <w:proofErr w:type="spellStart"/>
       <w:r>
@@ -6341,13 +5674,8 @@
           <w:numId w:val="49"/>
         </w:numPr>
       </w:pPr>
-      <w:proofErr w:type="gramStart"/>
-      <w:r>
-        <w:t>un</w:t>
-      </w:r>
-      <w:proofErr w:type="gramEnd"/>
-      <w:r>
-        <w:t xml:space="preserve"> backend natif via Node.js SQLite si disponible</w:t>
+      <w:r>
+        <w:t>un backend natif via Node.js SQLite si disponible</w:t>
       </w:r>
     </w:p>
     <w:p>
@@ -6357,13 +5685,8 @@
           <w:numId w:val="49"/>
         </w:numPr>
       </w:pPr>
-      <w:proofErr w:type="gramStart"/>
-      <w:r>
-        <w:t>un</w:t>
-      </w:r>
-      <w:proofErr w:type="gramEnd"/>
-      <w:r>
-        <w:t xml:space="preserve"> </w:t>
+      <w:r>
+        <w:t xml:space="preserve">un </w:t>
       </w:r>
       <w:proofErr w:type="spellStart"/>
       <w:r>
@@ -6460,13 +5783,8 @@
           <w:numId w:val="50"/>
         </w:numPr>
       </w:pPr>
-      <w:proofErr w:type="gramStart"/>
-      <w:r>
-        <w:t>on</w:t>
-      </w:r>
-      <w:proofErr w:type="gramEnd"/>
-      <w:r>
-        <w:t xml:space="preserve"> tente de résoudre un backend SQLite adapté</w:t>
+      <w:r>
+        <w:t>on tente de résoudre un backend SQLite adapté</w:t>
       </w:r>
     </w:p>
     <w:p>
@@ -6476,13 +5794,8 @@
           <w:numId w:val="50"/>
         </w:numPr>
       </w:pPr>
-      <w:proofErr w:type="gramStart"/>
-      <w:r>
-        <w:t>on</w:t>
-      </w:r>
-      <w:proofErr w:type="gramEnd"/>
-      <w:r>
-        <w:t xml:space="preserve"> garde le premier qui fonctionne</w:t>
+      <w:r>
+        <w:t>on garde le premier qui fonctionne</w:t>
       </w:r>
     </w:p>
     <w:p>
@@ -6492,13 +5805,8 @@
           <w:numId w:val="50"/>
         </w:numPr>
       </w:pPr>
-      <w:proofErr w:type="gramStart"/>
-      <w:r>
-        <w:t>on</w:t>
-      </w:r>
-      <w:proofErr w:type="gramEnd"/>
-      <w:r>
-        <w:t xml:space="preserve"> l’utilise ensuite pour créer la base et stocker les </w:t>
+      <w:r>
+        <w:t xml:space="preserve">on l’utilise ensuite pour créer la base et stocker les </w:t>
       </w:r>
       <w:proofErr w:type="spellStart"/>
       <w:r>
@@ -6529,13 +5837,8 @@
           <w:numId w:val="51"/>
         </w:numPr>
       </w:pPr>
-      <w:proofErr w:type="gramStart"/>
-      <w:r>
-        <w:t>ou</w:t>
-      </w:r>
-      <w:proofErr w:type="gramEnd"/>
-      <w:r>
-        <w:t xml:space="preserve"> si better-sqlite3 est disponible</w:t>
+      <w:r>
+        <w:t>ou si better-sqlite3 est disponible</w:t>
       </w:r>
     </w:p>
     <w:p>
@@ -6583,13 +5886,8 @@
           <w:numId w:val="52"/>
         </w:numPr>
       </w:pPr>
-      <w:proofErr w:type="gramStart"/>
-      <w:r>
-        <w:t>il</w:t>
-      </w:r>
-      <w:proofErr w:type="gramEnd"/>
-      <w:r>
-        <w:t xml:space="preserve"> évite les bindings natifs à compiler</w:t>
+      <w:r>
+        <w:t>il évite les bindings natifs à compiler</w:t>
       </w:r>
     </w:p>
     <w:p>
@@ -6599,13 +5897,8 @@
           <w:numId w:val="52"/>
         </w:numPr>
       </w:pPr>
-      <w:proofErr w:type="gramStart"/>
-      <w:r>
-        <w:t>il</w:t>
-      </w:r>
-      <w:proofErr w:type="gramEnd"/>
-      <w:r>
-        <w:t xml:space="preserve"> fonctionne mieux avec une installation Node “standard”</w:t>
+      <w:r>
+        <w:t>il fonctionne mieux avec une installation Node “standard”</w:t>
       </w:r>
     </w:p>
     <w:p>
@@ -6615,13 +5908,8 @@
           <w:numId w:val="52"/>
         </w:numPr>
       </w:pPr>
-      <w:proofErr w:type="gramStart"/>
-      <w:r>
-        <w:t>il</w:t>
-      </w:r>
-      <w:proofErr w:type="gramEnd"/>
-      <w:r>
-        <w:t xml:space="preserve"> réduit les points de casse liés à better-sqlite3</w:t>
+      <w:r>
+        <w:t>il réduit les points de casse liés à better-sqlite3</w:t>
       </w:r>
     </w:p>
     <w:p>
@@ -6634,13 +5922,8 @@
       </w:r>
       <w:proofErr w:type="spellEnd"/>
       <w:r>
-        <w:t xml:space="preserve"> vers better-sqlite3 est </w:t>
-      </w:r>
-      <w:proofErr w:type="gramStart"/>
-      <w:r>
-        <w:t>surtout:</w:t>
-      </w:r>
-      <w:proofErr w:type="gramEnd"/>
+        <w:t xml:space="preserve"> vers better-sqlite3 est surtout:</w:t>
+      </w:r>
     </w:p>
     <w:p>
       <w:pPr>
@@ -6649,13 +5932,8 @@
           <w:numId w:val="53"/>
         </w:numPr>
       </w:pPr>
-      <w:proofErr w:type="gramStart"/>
-      <w:r>
-        <w:t>compatibilité</w:t>
-      </w:r>
-      <w:proofErr w:type="gramEnd"/>
-      <w:r>
-        <w:t xml:space="preserve"> avec des environnements où le support natif n’est pas encore disponible ou n’est pas activé</w:t>
+      <w:r>
+        <w:t>compatibilité avec des environnements où le support natif n’est pas encore disponible ou n’est pas activé</w:t>
       </w:r>
     </w:p>
     <w:p>
@@ -6665,13 +5943,8 @@
           <w:numId w:val="53"/>
         </w:numPr>
       </w:pPr>
-      <w:proofErr w:type="gramStart"/>
-      <w:r>
-        <w:t>possibilité</w:t>
-      </w:r>
-      <w:proofErr w:type="gramEnd"/>
-      <w:r>
-        <w:t xml:space="preserve"> d’utiliser une implémentation plus mature si elle est déjà présente dans l’environnement</w:t>
+      <w:r>
+        <w:t>possibilité d’utiliser une implémentation plus mature si elle est déjà présente dans l’environnement</w:t>
       </w:r>
     </w:p>
     <w:p>
@@ -6686,13 +5959,8 @@
           <w:numId w:val="54"/>
         </w:numPr>
       </w:pPr>
-      <w:proofErr w:type="gramStart"/>
-      <w:r>
-        <w:t>si</w:t>
-      </w:r>
-      <w:proofErr w:type="gramEnd"/>
-      <w:r>
-        <w:t xml:space="preserve"> vous voulez la solution la plus simple et la plus robuste pour votre projet actuel, le natif est probablement le meilleur choix</w:t>
+      <w:r>
+        <w:t>si vous voulez la solution la plus simple et la plus robuste pour votre projet actuel, le natif est probablement le meilleur choix</w:t>
       </w:r>
     </w:p>
     <w:p>
@@ -6702,13 +5970,8 @@
           <w:numId w:val="54"/>
         </w:numPr>
       </w:pPr>
-      <w:proofErr w:type="gramStart"/>
-      <w:r>
-        <w:t>le</w:t>
-      </w:r>
-      <w:proofErr w:type="gramEnd"/>
-      <w:r>
-        <w:t xml:space="preserve"> </w:t>
+      <w:r>
+        <w:t xml:space="preserve">le </w:t>
       </w:r>
       <w:proofErr w:type="spellStart"/>
       <w:r>
@@ -6779,13 +6042,8 @@
           <w:numId w:val="55"/>
         </w:numPr>
       </w:pPr>
-      <w:proofErr w:type="gramStart"/>
-      <w:r>
-        <w:t>modifier</w:t>
-      </w:r>
-      <w:proofErr w:type="gramEnd"/>
-      <w:r>
-        <w:t xml:space="preserve"> la date/heure du poste pour simuler une expiration</w:t>
+      <w:r>
+        <w:t>modifier la date/heure du poste pour simuler une expiration</w:t>
       </w:r>
     </w:p>
     <w:p>
@@ -6795,13 +6053,8 @@
           <w:numId w:val="55"/>
         </w:numPr>
       </w:pPr>
-      <w:proofErr w:type="gramStart"/>
-      <w:r>
-        <w:t>relancer</w:t>
-      </w:r>
-      <w:proofErr w:type="gramEnd"/>
-      <w:r>
-        <w:t xml:space="preserve"> l’application et vérifier si le flux de rafraîchissement ou la </w:t>
+      <w:r>
+        <w:t xml:space="preserve">relancer l’application et vérifier si le flux de rafraîchissement ou la </w:t>
       </w:r>
       <w:proofErr w:type="spellStart"/>
       <w:r>
@@ -6851,14 +6104,9 @@
           <w:numId w:val="56"/>
         </w:numPr>
       </w:pPr>
-      <w:proofErr w:type="gramStart"/>
       <w:r>
         <w:lastRenderedPageBreak/>
-        <w:t>le</w:t>
-      </w:r>
-      <w:proofErr w:type="gramEnd"/>
-      <w:r>
-        <w:t xml:space="preserve"> </w:t>
+        <w:t xml:space="preserve">le </w:t>
       </w:r>
       <w:proofErr w:type="spellStart"/>
       <w:r>
@@ -6884,13 +6132,8 @@
           <w:numId w:val="56"/>
         </w:numPr>
       </w:pPr>
-      <w:proofErr w:type="gramStart"/>
-      <w:r>
-        <w:t>un</w:t>
-      </w:r>
-      <w:proofErr w:type="gramEnd"/>
-      <w:r>
-        <w:t xml:space="preserve"> changement de date système peut aussi perturber d’autres services et rendre le test moins propre</w:t>
+      <w:r>
+        <w:t>un changement de date système peut aussi perturber d’autres services et rendre le test moins propre</w:t>
       </w:r>
     </w:p>
     <w:p>
@@ -6905,13 +6148,8 @@
           <w:numId w:val="57"/>
         </w:numPr>
       </w:pPr>
-      <w:proofErr w:type="gramStart"/>
-      <w:r>
-        <w:t>tester</w:t>
-      </w:r>
-      <w:proofErr w:type="gramEnd"/>
-      <w:r>
-        <w:t xml:space="preserve"> avec un </w:t>
+      <w:r>
+        <w:t xml:space="preserve">tester avec un </w:t>
       </w:r>
       <w:proofErr w:type="spellStart"/>
       <w:r>
@@ -6953,13 +6191,8 @@
           <w:numId w:val="57"/>
         </w:numPr>
       </w:pPr>
-      <w:proofErr w:type="gramStart"/>
-      <w:r>
-        <w:t>observer</w:t>
-      </w:r>
-      <w:proofErr w:type="gramEnd"/>
-      <w:r>
-        <w:t xml:space="preserve"> les erreurs renvoyées par Google API</w:t>
+      <w:r>
+        <w:t>observer les erreurs renvoyées par Google API</w:t>
       </w:r>
     </w:p>
     <w:p>
@@ -6969,13 +6202,8 @@
           <w:numId w:val="57"/>
         </w:numPr>
       </w:pPr>
-      <w:proofErr w:type="gramStart"/>
-      <w:r>
-        <w:t>vérifier</w:t>
-      </w:r>
-      <w:proofErr w:type="gramEnd"/>
-      <w:r>
-        <w:t xml:space="preserve"> si votre code bascule bien sur une nouvelle authentification ou un </w:t>
+      <w:r>
+        <w:t xml:space="preserve">vérifier si votre code bascule bien sur une nouvelle authentification ou un </w:t>
       </w:r>
       <w:proofErr w:type="spellStart"/>
       <w:r>
@@ -7115,13 +6343,8 @@
           <w:numId w:val="61"/>
         </w:numPr>
       </w:pPr>
-      <w:proofErr w:type="gramStart"/>
-      <w:r>
-        <w:t>forcer</w:t>
-      </w:r>
-      <w:proofErr w:type="gramEnd"/>
-      <w:r>
-        <w:t xml:space="preserve"> un </w:t>
+      <w:r>
+        <w:t xml:space="preserve">forcer un </w:t>
       </w:r>
       <w:proofErr w:type="spellStart"/>
       <w:r>
@@ -7147,13 +6370,8 @@
           <w:numId w:val="61"/>
         </w:numPr>
       </w:pPr>
-      <w:proofErr w:type="gramStart"/>
-      <w:r>
-        <w:t>ou</w:t>
-      </w:r>
-      <w:proofErr w:type="gramEnd"/>
-      <w:r>
-        <w:t xml:space="preserve"> modifier la valeur stockée dans les </w:t>
+      <w:r>
+        <w:t xml:space="preserve">ou modifier la valeur stockée dans les </w:t>
       </w:r>
       <w:proofErr w:type="spellStart"/>
       <w:r>
@@ -7184,13 +6402,8 @@
           <w:numId w:val="62"/>
         </w:numPr>
       </w:pPr>
-      <w:proofErr w:type="gramStart"/>
-      <w:r>
-        <w:t>dans</w:t>
-      </w:r>
-      <w:proofErr w:type="gramEnd"/>
-      <w:r>
-        <w:t xml:space="preserve"> votre stockage, remplacez </w:t>
+      <w:r>
+        <w:t xml:space="preserve">dans votre stockage, remplacez </w:t>
       </w:r>
       <w:proofErr w:type="spellStart"/>
       <w:r>
@@ -7216,13 +6429,8 @@
           <w:numId w:val="62"/>
         </w:numPr>
       </w:pPr>
-      <w:proofErr w:type="gramStart"/>
-      <w:r>
-        <w:t>relancez</w:t>
-      </w:r>
-      <w:proofErr w:type="gramEnd"/>
-      <w:r>
-        <w:t xml:space="preserve"> l’application</w:t>
+      <w:r>
+        <w:t>relancez l’application</w:t>
       </w:r>
     </w:p>
     <w:p>
@@ -7232,13 +6440,8 @@
           <w:numId w:val="62"/>
         </w:numPr>
       </w:pPr>
-      <w:proofErr w:type="gramStart"/>
-      <w:r>
-        <w:t>vérifiez</w:t>
-      </w:r>
-      <w:proofErr w:type="gramEnd"/>
-      <w:r>
-        <w:t xml:space="preserve"> si votre code déclenche bien la récupération ou la </w:t>
+      <w:r>
+        <w:t xml:space="preserve">vérifiez si votre code déclenche bien la récupération ou la </w:t>
       </w:r>
       <w:proofErr w:type="spellStart"/>
       <w:r>
@@ -7277,14 +6480,9 @@
         </w:numPr>
       </w:pPr>
       <w:proofErr w:type="spellStart"/>
-      <w:proofErr w:type="gramStart"/>
       <w:r>
         <w:lastRenderedPageBreak/>
-        <w:t>invalid</w:t>
-      </w:r>
-      <w:proofErr w:type="gramEnd"/>
-      <w:r>
-        <w:t>_grant</w:t>
+        <w:t>invalid_grant</w:t>
       </w:r>
       <w:proofErr w:type="spellEnd"/>
     </w:p>
@@ -7296,13 +6494,8 @@
         </w:numPr>
       </w:pPr>
       <w:proofErr w:type="spellStart"/>
-      <w:proofErr w:type="gramStart"/>
-      <w:r>
-        <w:t>invalid</w:t>
-      </w:r>
-      <w:proofErr w:type="gramEnd"/>
-      <w:r>
-        <w:t>_token</w:t>
+      <w:r>
+        <w:t>invalid_token</w:t>
       </w:r>
       <w:proofErr w:type="spellEnd"/>
     </w:p>
@@ -7345,13 +6538,8 @@
           <w:numId w:val="66"/>
         </w:numPr>
       </w:pPr>
-      <w:proofErr w:type="gramStart"/>
-      <w:r>
-        <w:t>ne</w:t>
-      </w:r>
-      <w:proofErr w:type="gramEnd"/>
-      <w:r>
-        <w:t xml:space="preserve"> plus utiliser l’ancien </w:t>
+      <w:r>
+        <w:t xml:space="preserve">ne plus utiliser l’ancien </w:t>
       </w:r>
       <w:proofErr w:type="spellStart"/>
       <w:r>
@@ -7366,13 +6554,8 @@
           <w:numId w:val="66"/>
         </w:numPr>
       </w:pPr>
-      <w:proofErr w:type="gramStart"/>
-      <w:r>
-        <w:t>demander</w:t>
-      </w:r>
-      <w:proofErr w:type="gramEnd"/>
-      <w:r>
-        <w:t xml:space="preserve"> un nouveau </w:t>
+      <w:r>
+        <w:t xml:space="preserve">demander un nouveau </w:t>
       </w:r>
       <w:proofErr w:type="spellStart"/>
       <w:r>
@@ -7387,13 +6570,8 @@
           <w:numId w:val="66"/>
         </w:numPr>
       </w:pPr>
-      <w:proofErr w:type="gramStart"/>
-      <w:r>
-        <w:t>ou</w:t>
-      </w:r>
-      <w:proofErr w:type="gramEnd"/>
-      <w:r>
-        <w:t xml:space="preserve"> tenter un </w:t>
+      <w:r>
+        <w:t xml:space="preserve">ou tenter un </w:t>
       </w:r>
       <w:proofErr w:type="spellStart"/>
       <w:r>
@@ -7499,13 +6677,8 @@
           <w:numId w:val="68"/>
         </w:numPr>
       </w:pPr>
-      <w:proofErr w:type="gramStart"/>
-      <w:r>
-        <w:t>soit</w:t>
-      </w:r>
-      <w:proofErr w:type="gramEnd"/>
-      <w:r>
-        <w:t xml:space="preserve"> en supprimant les </w:t>
+      <w:r>
+        <w:t xml:space="preserve">soit en supprimant les </w:t>
       </w:r>
       <w:proofErr w:type="spellStart"/>
       <w:r>
@@ -7523,13 +6696,8 @@
           <w:numId w:val="68"/>
         </w:numPr>
       </w:pPr>
-      <w:proofErr w:type="gramStart"/>
-      <w:r>
-        <w:t>soit</w:t>
-      </w:r>
-      <w:proofErr w:type="gramEnd"/>
-      <w:r>
-        <w:t xml:space="preserve"> en écrasant seulement </w:t>
+      <w:r>
+        <w:t xml:space="preserve">soit en écrasant seulement </w:t>
       </w:r>
       <w:proofErr w:type="spellStart"/>
       <w:r>
@@ -7552,13 +6720,8 @@
           <w:numId w:val="68"/>
         </w:numPr>
       </w:pPr>
-      <w:proofErr w:type="gramStart"/>
-      <w:r>
-        <w:t>soit</w:t>
-      </w:r>
-      <w:proofErr w:type="gramEnd"/>
-      <w:r>
-        <w:t xml:space="preserve"> en forçant un </w:t>
+      <w:r>
+        <w:t xml:space="preserve">soit en forçant un </w:t>
       </w:r>
       <w:proofErr w:type="spellStart"/>
       <w:r>
@@ -18339,6 +17502,7 @@
   <w:style w:type="character" w:default="1" w:styleId="Policepardfaut">
     <w:name w:val="Default Paragraph Font"/>
     <w:uiPriority w:val="1"/>
+    <w:semiHidden/>
     <w:unhideWhenUsed/>
   </w:style>
   <w:style w:type="table" w:default="1" w:styleId="TableauNormal">

</xml_diff>